<commit_message>
Update experiment log with all 8 runs and roofline plot
Co-Authored-By: Claude Sonnet 4.6 <noreply@anthropic.com>
</commit_message>
<xml_diff>
--- a/InferTutor_Experiments.docx
+++ b/InferTutor_Experiments.docx
@@ -2424,6 +2424,1806 @@
           </w:p>
         </w:tc>
       </w:tr>
+      <w:tr>
+        <w:tc>
+          <w:tcPr>
+            <w:tcW w:type="dxa" w:w="900"/>
+            <w:tcBorders>
+              <w:top w:val="single" w:color="CCCCCC" w:sz="1"/>
+              <w:left w:val="single" w:color="CCCCCC" w:sz="1"/>
+              <w:bottom w:val="single" w:color="CCCCCC" w:sz="1"/>
+              <w:right w:val="single" w:color="CCCCCC" w:sz="1"/>
+            </w:tcBorders>
+            <w:shd w:fill="FFFFFF" w:val="clear"/>
+            <w:tcMar>
+              <w:top w:type="dxa" w:w="80"/>
+              <w:left w:type="dxa" w:w="120"/>
+              <w:bottom w:type="dxa" w:w="80"/>
+              <w:right w:type="dxa" w:w="120"/>
+            </w:tcMar>
+            <w:vAlign w:val="center"/>
+          </w:tcPr>
+          <w:p>
+            <w:r>
+              <w:rPr>
+                <w:rFonts w:ascii="Arial" w:cs="Arial" w:eastAsia="Arial" w:hAnsi="Arial"/>
+                <w:b w:val="false"/>
+                <w:bCs w:val="false"/>
+                <w:color w:val="000000"/>
+                <w:sz w:val="18"/>
+                <w:szCs w:val="18"/>
+              </w:rPr>
+              <w:t xml:space="preserve">Stress Test 200u</w:t>
+            </w:r>
+          </w:p>
+        </w:tc>
+        <w:tc>
+          <w:tcPr>
+            <w:tcW w:type="dxa" w:w="1400"/>
+            <w:tcBorders>
+              <w:top w:val="single" w:color="CCCCCC" w:sz="1"/>
+              <w:left w:val="single" w:color="CCCCCC" w:sz="1"/>
+              <w:bottom w:val="single" w:color="CCCCCC" w:sz="1"/>
+              <w:right w:val="single" w:color="CCCCCC" w:sz="1"/>
+            </w:tcBorders>
+            <w:shd w:fill="FFFFFF" w:val="clear"/>
+            <w:tcMar>
+              <w:top w:type="dxa" w:w="80"/>
+              <w:left w:type="dxa" w:w="120"/>
+              <w:bottom w:type="dxa" w:w="80"/>
+              <w:right w:type="dxa" w:w="120"/>
+            </w:tcMar>
+            <w:vAlign w:val="center"/>
+          </w:tcPr>
+          <w:p>
+            <w:r>
+              <w:rPr>
+                <w:rFonts w:ascii="Arial" w:cs="Arial" w:eastAsia="Arial" w:hAnsi="Arial"/>
+                <w:b w:val="false"/>
+                <w:bCs w:val="false"/>
+                <w:color w:val="000000"/>
+                <w:sz w:val="18"/>
+                <w:szCs w:val="18"/>
+              </w:rPr>
+              <w:t xml:space="preserve">compiled-text-r1-200u</w:t>
+            </w:r>
+          </w:p>
+        </w:tc>
+        <w:tc>
+          <w:tcPr>
+            <w:tcW w:type="dxa" w:w="500"/>
+            <w:tcBorders>
+              <w:top w:val="single" w:color="CCCCCC" w:sz="1"/>
+              <w:left w:val="single" w:color="CCCCCC" w:sz="1"/>
+              <w:bottom w:val="single" w:color="CCCCCC" w:sz="1"/>
+              <w:right w:val="single" w:color="CCCCCC" w:sz="1"/>
+            </w:tcBorders>
+            <w:shd w:fill="FFFFFF" w:val="clear"/>
+            <w:tcMar>
+              <w:top w:type="dxa" w:w="80"/>
+              <w:left w:type="dxa" w:w="120"/>
+              <w:bottom w:type="dxa" w:w="80"/>
+              <w:right w:type="dxa" w:w="120"/>
+            </w:tcMar>
+            <w:vAlign w:val="center"/>
+          </w:tcPr>
+          <w:p>
+            <w:r>
+              <w:rPr>
+                <w:rFonts w:ascii="Arial" w:cs="Arial" w:eastAsia="Arial" w:hAnsi="Arial"/>
+                <w:b w:val="false"/>
+                <w:bCs w:val="false"/>
+                <w:color w:val="000000"/>
+                <w:sz w:val="18"/>
+                <w:szCs w:val="18"/>
+              </w:rPr>
+              <w:t xml:space="preserve">1</w:t>
+            </w:r>
+          </w:p>
+        </w:tc>
+        <w:tc>
+          <w:tcPr>
+            <w:tcW w:type="dxa" w:w="500"/>
+            <w:tcBorders>
+              <w:top w:val="single" w:color="CCCCCC" w:sz="1"/>
+              <w:left w:val="single" w:color="CCCCCC" w:sz="1"/>
+              <w:bottom w:val="single" w:color="CCCCCC" w:sz="1"/>
+              <w:right w:val="single" w:color="CCCCCC" w:sz="1"/>
+            </w:tcBorders>
+            <w:shd w:fill="FFFFFF" w:val="clear"/>
+            <w:tcMar>
+              <w:top w:type="dxa" w:w="80"/>
+              <w:left w:type="dxa" w:w="120"/>
+              <w:bottom w:type="dxa" w:w="80"/>
+              <w:right w:type="dxa" w:w="120"/>
+            </w:tcMar>
+            <w:vAlign w:val="center"/>
+          </w:tcPr>
+          <w:p>
+            <w:r>
+              <w:rPr>
+                <w:rFonts w:ascii="Arial" w:cs="Arial" w:eastAsia="Arial" w:hAnsi="Arial"/>
+                <w:b w:val="false"/>
+                <w:bCs w:val="false"/>
+                <w:color w:val="000000"/>
+                <w:sz w:val="18"/>
+                <w:szCs w:val="18"/>
+              </w:rPr>
+              <w:t xml:space="preserve">text</w:t>
+            </w:r>
+          </w:p>
+        </w:tc>
+        <w:tc>
+          <w:tcPr>
+            <w:tcW w:type="dxa" w:w="500"/>
+            <w:tcBorders>
+              <w:top w:val="single" w:color="CCCCCC" w:sz="1"/>
+              <w:left w:val="single" w:color="CCCCCC" w:sz="1"/>
+              <w:bottom w:val="single" w:color="CCCCCC" w:sz="1"/>
+              <w:right w:val="single" w:color="CCCCCC" w:sz="1"/>
+            </w:tcBorders>
+            <w:shd w:fill="FFFFFF" w:val="clear"/>
+            <w:tcMar>
+              <w:top w:type="dxa" w:w="80"/>
+              <w:left w:type="dxa" w:w="120"/>
+              <w:bottom w:type="dxa" w:w="80"/>
+              <w:right w:type="dxa" w:w="120"/>
+            </w:tcMar>
+            <w:vAlign w:val="center"/>
+          </w:tcPr>
+          <w:p>
+            <w:r>
+              <w:rPr>
+                <w:rFonts w:ascii="Arial" w:cs="Arial" w:eastAsia="Arial" w:hAnsi="Arial"/>
+                <w:b w:val="false"/>
+                <w:bCs w:val="false"/>
+                <w:color w:val="000000"/>
+                <w:sz w:val="18"/>
+                <w:szCs w:val="18"/>
+              </w:rPr>
+              <w:t xml:space="preserve">200</w:t>
+            </w:r>
+          </w:p>
+        </w:tc>
+        <w:tc>
+          <w:tcPr>
+            <w:tcW w:type="dxa" w:w="700"/>
+            <w:tcBorders>
+              <w:top w:val="single" w:color="CCCCCC" w:sz="1"/>
+              <w:left w:val="single" w:color="CCCCCC" w:sz="1"/>
+              <w:bottom w:val="single" w:color="CCCCCC" w:sz="1"/>
+              <w:right w:val="single" w:color="CCCCCC" w:sz="1"/>
+            </w:tcBorders>
+            <w:shd w:fill="FFFFFF" w:val="clear"/>
+            <w:tcMar>
+              <w:top w:type="dxa" w:w="80"/>
+              <w:left w:type="dxa" w:w="120"/>
+              <w:bottom w:type="dxa" w:w="80"/>
+              <w:right w:type="dxa" w:w="120"/>
+            </w:tcMar>
+            <w:vAlign w:val="center"/>
+          </w:tcPr>
+          <w:p>
+            <w:r>
+              <w:rPr>
+                <w:rFonts w:ascii="Arial" w:cs="Arial" w:eastAsia="Arial" w:hAnsi="Arial"/>
+                <w:b w:val="false"/>
+                <w:bCs w:val="false"/>
+                <w:color w:val="000000"/>
+                <w:sz w:val="18"/>
+                <w:szCs w:val="18"/>
+              </w:rPr>
+              <w:t xml:space="preserve">false</w:t>
+            </w:r>
+          </w:p>
+        </w:tc>
+        <w:tc>
+          <w:tcPr>
+            <w:tcW w:type="dxa" w:w="600"/>
+            <w:tcBorders>
+              <w:top w:val="single" w:color="CCCCCC" w:sz="1"/>
+              <w:left w:val="single" w:color="CCCCCC" w:sz="1"/>
+              <w:bottom w:val="single" w:color="CCCCCC" w:sz="1"/>
+              <w:right w:val="single" w:color="CCCCCC" w:sz="1"/>
+            </w:tcBorders>
+            <w:shd w:fill="FFFFFF" w:val="clear"/>
+            <w:tcMar>
+              <w:top w:type="dxa" w:w="80"/>
+              <w:left w:type="dxa" w:w="120"/>
+              <w:bottom w:type="dxa" w:w="80"/>
+              <w:right w:type="dxa" w:w="120"/>
+            </w:tcMar>
+            <w:vAlign w:val="center"/>
+          </w:tcPr>
+          <w:p>
+            <w:r>
+              <w:rPr>
+                <w:rFonts w:ascii="Arial" w:cs="Arial" w:eastAsia="Arial" w:hAnsi="Arial"/>
+                <w:b w:val="false"/>
+                <w:bCs w:val="false"/>
+                <w:color w:val="000000"/>
+                <w:sz w:val="18"/>
+                <w:szCs w:val="18"/>
+              </w:rPr>
+              <w:t xml:space="preserve">32</w:t>
+            </w:r>
+          </w:p>
+        </w:tc>
+        <w:tc>
+          <w:tcPr>
+            <w:tcW w:type="dxa" w:w="800"/>
+            <w:tcBorders>
+              <w:top w:val="single" w:color="CCCCCC" w:sz="1"/>
+              <w:left w:val="single" w:color="CCCCCC" w:sz="1"/>
+              <w:bottom w:val="single" w:color="CCCCCC" w:sz="1"/>
+              <w:right w:val="single" w:color="CCCCCC" w:sz="1"/>
+            </w:tcBorders>
+            <w:shd w:fill="FFFFFF" w:val="clear"/>
+            <w:tcMar>
+              <w:top w:type="dxa" w:w="80"/>
+              <w:left w:type="dxa" w:w="120"/>
+              <w:bottom w:type="dxa" w:w="80"/>
+              <w:right w:type="dxa" w:w="120"/>
+            </w:tcMar>
+            <w:vAlign w:val="center"/>
+          </w:tcPr>
+          <w:p>
+            <w:r>
+              <w:rPr>
+                <w:rFonts w:ascii="Arial" w:cs="Arial" w:eastAsia="Arial" w:hAnsi="Arial"/>
+                <w:b w:val="false"/>
+                <w:bCs w:val="false"/>
+                <w:color w:val="000000"/>
+                <w:sz w:val="18"/>
+                <w:szCs w:val="18"/>
+              </w:rPr>
+              <w:t xml:space="preserve">4096</w:t>
+            </w:r>
+          </w:p>
+        </w:tc>
+        <w:tc>
+          <w:tcPr>
+            <w:tcW w:type="dxa" w:w="800"/>
+            <w:tcBorders>
+              <w:top w:val="single" w:color="CCCCCC" w:sz="1"/>
+              <w:left w:val="single" w:color="CCCCCC" w:sz="1"/>
+              <w:bottom w:val="single" w:color="CCCCCC" w:sz="1"/>
+              <w:right w:val="single" w:color="CCCCCC" w:sz="1"/>
+            </w:tcBorders>
+            <w:shd w:fill="FFFFFF" w:val="clear"/>
+            <w:tcMar>
+              <w:top w:type="dxa" w:w="80"/>
+              <w:left w:type="dxa" w:w="120"/>
+              <w:bottom w:type="dxa" w:w="80"/>
+              <w:right w:type="dxa" w:w="120"/>
+            </w:tcMar>
+            <w:vAlign w:val="center"/>
+          </w:tcPr>
+          <w:p>
+            <w:r>
+              <w:rPr>
+                <w:rFonts w:ascii="Arial" w:cs="Arial" w:eastAsia="Arial" w:hAnsi="Arial"/>
+                <w:b w:val="false"/>
+                <w:bCs w:val="false"/>
+                <w:color w:val="000000"/>
+                <w:sz w:val="18"/>
+                <w:szCs w:val="18"/>
+              </w:rPr>
+              <w:t xml:space="preserve">5382.5</w:t>
+            </w:r>
+          </w:p>
+        </w:tc>
+        <w:tc>
+          <w:tcPr>
+            <w:tcW w:type="dxa" w:w="700"/>
+            <w:tcBorders>
+              <w:top w:val="single" w:color="CCCCCC" w:sz="1"/>
+              <w:left w:val="single" w:color="CCCCCC" w:sz="1"/>
+              <w:bottom w:val="single" w:color="CCCCCC" w:sz="1"/>
+              <w:right w:val="single" w:color="CCCCCC" w:sz="1"/>
+            </w:tcBorders>
+            <w:shd w:fill="FFFFFF" w:val="clear"/>
+            <w:tcMar>
+              <w:top w:type="dxa" w:w="80"/>
+              <w:left w:type="dxa" w:w="120"/>
+              <w:bottom w:type="dxa" w:w="80"/>
+              <w:right w:type="dxa" w:w="120"/>
+            </w:tcMar>
+            <w:vAlign w:val="center"/>
+          </w:tcPr>
+          <w:p>
+            <w:r>
+              <w:rPr>
+                <w:rFonts w:ascii="Arial" w:cs="Arial" w:eastAsia="Arial" w:hAnsi="Arial"/>
+                <w:b w:val="false"/>
+                <w:bCs w:val="false"/>
+                <w:color w:val="000000"/>
+                <w:sz w:val="18"/>
+                <w:szCs w:val="18"/>
+              </w:rPr>
+              <w:t xml:space="preserve">5.7</w:t>
+            </w:r>
+          </w:p>
+        </w:tc>
+        <w:tc>
+          <w:tcPr>
+            <w:tcW w:type="dxa" w:w="900"/>
+            <w:tcBorders>
+              <w:top w:val="single" w:color="CCCCCC" w:sz="1"/>
+              <w:left w:val="single" w:color="CCCCCC" w:sz="1"/>
+              <w:bottom w:val="single" w:color="CCCCCC" w:sz="1"/>
+              <w:right w:val="single" w:color="CCCCCC" w:sz="1"/>
+            </w:tcBorders>
+            <w:shd w:fill="FFFFFF" w:val="clear"/>
+            <w:tcMar>
+              <w:top w:type="dxa" w:w="80"/>
+              <w:left w:type="dxa" w:w="120"/>
+              <w:bottom w:type="dxa" w:w="80"/>
+              <w:right w:type="dxa" w:w="120"/>
+            </w:tcMar>
+            <w:vAlign w:val="center"/>
+          </w:tcPr>
+          <w:p>
+            <w:r>
+              <w:rPr>
+                <w:rFonts w:ascii="Arial" w:cs="Arial" w:eastAsia="Arial" w:hAnsi="Arial"/>
+                <w:b w:val="false"/>
+                <w:bCs w:val="false"/>
+                <w:color w:val="000000"/>
+                <w:sz w:val="18"/>
+                <w:szCs w:val="18"/>
+              </w:rPr>
+              <w:t xml:space="preserve">2836.4</w:t>
+            </w:r>
+          </w:p>
+        </w:tc>
+        <w:tc>
+          <w:tcPr>
+            <w:tcW w:type="dxa" w:w="600"/>
+            <w:tcBorders>
+              <w:top w:val="single" w:color="CCCCCC" w:sz="1"/>
+              <w:left w:val="single" w:color="CCCCCC" w:sz="1"/>
+              <w:bottom w:val="single" w:color="CCCCCC" w:sz="1"/>
+              <w:right w:val="single" w:color="CCCCCC" w:sz="1"/>
+            </w:tcBorders>
+            <w:shd w:fill="FFFFFF" w:val="clear"/>
+            <w:tcMar>
+              <w:top w:type="dxa" w:w="80"/>
+              <w:left w:type="dxa" w:w="120"/>
+              <w:bottom w:type="dxa" w:w="80"/>
+              <w:right w:type="dxa" w:w="120"/>
+            </w:tcMar>
+            <w:vAlign w:val="center"/>
+          </w:tcPr>
+          <w:p>
+            <w:r>
+              <w:rPr>
+                <w:rFonts w:ascii="Arial" w:cs="Arial" w:eastAsia="Arial" w:hAnsi="Arial"/>
+                <w:b w:val="false"/>
+                <w:bCs w:val="false"/>
+                <w:color w:val="000000"/>
+                <w:sz w:val="18"/>
+                <w:szCs w:val="18"/>
+              </w:rPr>
+              <w:t xml:space="preserve">29.63</w:t>
+            </w:r>
+          </w:p>
+        </w:tc>
+        <w:tc>
+          <w:tcPr>
+            <w:tcW w:type="dxa" w:w="600"/>
+            <w:tcBorders>
+              <w:top w:val="single" w:color="CCCCCC" w:sz="1"/>
+              <w:left w:val="single" w:color="CCCCCC" w:sz="1"/>
+              <w:bottom w:val="single" w:color="CCCCCC" w:sz="1"/>
+              <w:right w:val="single" w:color="CCCCCC" w:sz="1"/>
+            </w:tcBorders>
+            <w:shd w:fill="FFFFFF" w:val="clear"/>
+            <w:tcMar>
+              <w:top w:type="dxa" w:w="80"/>
+              <w:left w:type="dxa" w:w="120"/>
+              <w:bottom w:type="dxa" w:w="80"/>
+              <w:right w:type="dxa" w:w="120"/>
+            </w:tcMar>
+            <w:vAlign w:val="center"/>
+          </w:tcPr>
+          <w:p>
+            <w:r>
+              <w:rPr>
+                <w:rFonts w:ascii="Arial" w:cs="Arial" w:eastAsia="Arial" w:hAnsi="Arial"/>
+                <w:b w:val="false"/>
+                <w:bCs w:val="false"/>
+                <w:color w:val="000000"/>
+                <w:sz w:val="18"/>
+                <w:szCs w:val="18"/>
+              </w:rPr>
+              <w:t xml:space="preserve">0</w:t>
+            </w:r>
+          </w:p>
+        </w:tc>
+        <w:tc>
+          <w:tcPr>
+            <w:tcW w:type="dxa" w:w="1500"/>
+            <w:tcBorders>
+              <w:top w:val="single" w:color="CCCCCC" w:sz="1"/>
+              <w:left w:val="single" w:color="CCCCCC" w:sz="1"/>
+              <w:bottom w:val="single" w:color="CCCCCC" w:sz="1"/>
+              <w:right w:val="single" w:color="CCCCCC" w:sz="1"/>
+            </w:tcBorders>
+            <w:shd w:fill="FFFFFF" w:val="clear"/>
+            <w:tcMar>
+              <w:top w:type="dxa" w:w="80"/>
+              <w:left w:type="dxa" w:w="120"/>
+              <w:bottom w:type="dxa" w:w="80"/>
+              <w:right w:type="dxa" w:w="120"/>
+            </w:tcMar>
+            <w:vAlign w:val="center"/>
+          </w:tcPr>
+          <w:p>
+            <w:r>
+              <w:rPr>
+                <w:rFonts w:ascii="Arial" w:cs="Arial" w:eastAsia="Arial" w:hAnsi="Arial"/>
+                <w:b w:val="false"/>
+                <w:bCs w:val="false"/>
+                <w:color w:val="000000"/>
+                <w:sz w:val="18"/>
+                <w:szCs w:val="18"/>
+              </w:rPr>
+              <w:t xml:space="preserve">TTFT 4x worse at 200 users vs 100. Saturation knee between 100-200 users per replica. ITL stays flat — prefill queue is the bottleneck, not decode.</w:t>
+            </w:r>
+          </w:p>
+        </w:tc>
+      </w:tr>
+      <w:tr>
+        <w:tc>
+          <w:tcPr>
+            <w:tcW w:type="dxa" w:w="900"/>
+            <w:tcBorders>
+              <w:top w:val="single" w:color="CCCCCC" w:sz="1"/>
+              <w:left w:val="single" w:color="CCCCCC" w:sz="1"/>
+              <w:bottom w:val="single" w:color="CCCCCC" w:sz="1"/>
+              <w:right w:val="single" w:color="CCCCCC" w:sz="1"/>
+            </w:tcBorders>
+            <w:shd w:fill="FFFFFF" w:val="clear"/>
+            <w:tcMar>
+              <w:top w:type="dxa" w:w="80"/>
+              <w:left w:type="dxa" w:w="120"/>
+              <w:bottom w:type="dxa" w:w="80"/>
+              <w:right w:type="dxa" w:w="120"/>
+            </w:tcMar>
+            <w:vAlign w:val="center"/>
+          </w:tcPr>
+          <w:p>
+            <w:r>
+              <w:rPr>
+                <w:rFonts w:ascii="Arial" w:cs="Arial" w:eastAsia="Arial" w:hAnsi="Arial"/>
+                <w:b w:val="false"/>
+                <w:bCs w:val="false"/>
+                <w:color w:val="000000"/>
+                <w:sz w:val="18"/>
+                <w:szCs w:val="18"/>
+              </w:rPr>
+              <w:t xml:space="preserve">No Prefix Cache</w:t>
+            </w:r>
+          </w:p>
+        </w:tc>
+        <w:tc>
+          <w:tcPr>
+            <w:tcW w:type="dxa" w:w="1400"/>
+            <w:tcBorders>
+              <w:top w:val="single" w:color="CCCCCC" w:sz="1"/>
+              <w:left w:val="single" w:color="CCCCCC" w:sz="1"/>
+              <w:bottom w:val="single" w:color="CCCCCC" w:sz="1"/>
+              <w:right w:val="single" w:color="CCCCCC" w:sz="1"/>
+            </w:tcBorders>
+            <w:shd w:fill="FFFFFF" w:val="clear"/>
+            <w:tcMar>
+              <w:top w:type="dxa" w:w="80"/>
+              <w:left w:type="dxa" w:w="120"/>
+              <w:bottom w:type="dxa" w:w="80"/>
+              <w:right w:type="dxa" w:w="120"/>
+            </w:tcMar>
+            <w:vAlign w:val="center"/>
+          </w:tcPr>
+          <w:p>
+            <w:r>
+              <w:rPr>
+                <w:rFonts w:ascii="Arial" w:cs="Arial" w:eastAsia="Arial" w:hAnsi="Arial"/>
+                <w:b w:val="false"/>
+                <w:bCs w:val="false"/>
+                <w:color w:val="000000"/>
+                <w:sz w:val="18"/>
+                <w:szCs w:val="18"/>
+              </w:rPr>
+              <w:t xml:space="preserve">compiled-text-r1-no-prefix</w:t>
+            </w:r>
+          </w:p>
+        </w:tc>
+        <w:tc>
+          <w:tcPr>
+            <w:tcW w:type="dxa" w:w="500"/>
+            <w:tcBorders>
+              <w:top w:val="single" w:color="CCCCCC" w:sz="1"/>
+              <w:left w:val="single" w:color="CCCCCC" w:sz="1"/>
+              <w:bottom w:val="single" w:color="CCCCCC" w:sz="1"/>
+              <w:right w:val="single" w:color="CCCCCC" w:sz="1"/>
+            </w:tcBorders>
+            <w:shd w:fill="FFFFFF" w:val="clear"/>
+            <w:tcMar>
+              <w:top w:type="dxa" w:w="80"/>
+              <w:left w:type="dxa" w:w="120"/>
+              <w:bottom w:type="dxa" w:w="80"/>
+              <w:right w:type="dxa" w:w="120"/>
+            </w:tcMar>
+            <w:vAlign w:val="center"/>
+          </w:tcPr>
+          <w:p>
+            <w:r>
+              <w:rPr>
+                <w:rFonts w:ascii="Arial" w:cs="Arial" w:eastAsia="Arial" w:hAnsi="Arial"/>
+                <w:b w:val="false"/>
+                <w:bCs w:val="false"/>
+                <w:color w:val="000000"/>
+                <w:sz w:val="18"/>
+                <w:szCs w:val="18"/>
+              </w:rPr>
+              <w:t xml:space="preserve">1</w:t>
+            </w:r>
+          </w:p>
+        </w:tc>
+        <w:tc>
+          <w:tcPr>
+            <w:tcW w:type="dxa" w:w="500"/>
+            <w:tcBorders>
+              <w:top w:val="single" w:color="CCCCCC" w:sz="1"/>
+              <w:left w:val="single" w:color="CCCCCC" w:sz="1"/>
+              <w:bottom w:val="single" w:color="CCCCCC" w:sz="1"/>
+              <w:right w:val="single" w:color="CCCCCC" w:sz="1"/>
+            </w:tcBorders>
+            <w:shd w:fill="FFFFFF" w:val="clear"/>
+            <w:tcMar>
+              <w:top w:type="dxa" w:w="80"/>
+              <w:left w:type="dxa" w:w="120"/>
+              <w:bottom w:type="dxa" w:w="80"/>
+              <w:right w:type="dxa" w:w="120"/>
+            </w:tcMar>
+            <w:vAlign w:val="center"/>
+          </w:tcPr>
+          <w:p>
+            <w:r>
+              <w:rPr>
+                <w:rFonts w:ascii="Arial" w:cs="Arial" w:eastAsia="Arial" w:hAnsi="Arial"/>
+                <w:b w:val="false"/>
+                <w:bCs w:val="false"/>
+                <w:color w:val="000000"/>
+                <w:sz w:val="18"/>
+                <w:szCs w:val="18"/>
+              </w:rPr>
+              <w:t xml:space="preserve">text</w:t>
+            </w:r>
+          </w:p>
+        </w:tc>
+        <w:tc>
+          <w:tcPr>
+            <w:tcW w:type="dxa" w:w="500"/>
+            <w:tcBorders>
+              <w:top w:val="single" w:color="CCCCCC" w:sz="1"/>
+              <w:left w:val="single" w:color="CCCCCC" w:sz="1"/>
+              <w:bottom w:val="single" w:color="CCCCCC" w:sz="1"/>
+              <w:right w:val="single" w:color="CCCCCC" w:sz="1"/>
+            </w:tcBorders>
+            <w:shd w:fill="FFFFFF" w:val="clear"/>
+            <w:tcMar>
+              <w:top w:type="dxa" w:w="80"/>
+              <w:left w:type="dxa" w:w="120"/>
+              <w:bottom w:type="dxa" w:w="80"/>
+              <w:right w:type="dxa" w:w="120"/>
+            </w:tcMar>
+            <w:vAlign w:val="center"/>
+          </w:tcPr>
+          <w:p>
+            <w:r>
+              <w:rPr>
+                <w:rFonts w:ascii="Arial" w:cs="Arial" w:eastAsia="Arial" w:hAnsi="Arial"/>
+                <w:b w:val="false"/>
+                <w:bCs w:val="false"/>
+                <w:color w:val="000000"/>
+                <w:sz w:val="18"/>
+                <w:szCs w:val="18"/>
+              </w:rPr>
+              <w:t xml:space="preserve">100</w:t>
+            </w:r>
+          </w:p>
+        </w:tc>
+        <w:tc>
+          <w:tcPr>
+            <w:tcW w:type="dxa" w:w="700"/>
+            <w:tcBorders>
+              <w:top w:val="single" w:color="CCCCCC" w:sz="1"/>
+              <w:left w:val="single" w:color="CCCCCC" w:sz="1"/>
+              <w:bottom w:val="single" w:color="CCCCCC" w:sz="1"/>
+              <w:right w:val="single" w:color="CCCCCC" w:sz="1"/>
+            </w:tcBorders>
+            <w:shd w:fill="FFFFFF" w:val="clear"/>
+            <w:tcMar>
+              <w:top w:type="dxa" w:w="80"/>
+              <w:left w:type="dxa" w:w="120"/>
+              <w:bottom w:type="dxa" w:w="80"/>
+              <w:right w:type="dxa" w:w="120"/>
+            </w:tcMar>
+            <w:vAlign w:val="center"/>
+          </w:tcPr>
+          <w:p>
+            <w:r>
+              <w:rPr>
+                <w:rFonts w:ascii="Arial" w:cs="Arial" w:eastAsia="Arial" w:hAnsi="Arial"/>
+                <w:b w:val="false"/>
+                <w:bCs w:val="false"/>
+                <w:color w:val="000000"/>
+                <w:sz w:val="18"/>
+                <w:szCs w:val="18"/>
+              </w:rPr>
+              <w:t xml:space="preserve">false</w:t>
+            </w:r>
+          </w:p>
+        </w:tc>
+        <w:tc>
+          <w:tcPr>
+            <w:tcW w:type="dxa" w:w="600"/>
+            <w:tcBorders>
+              <w:top w:val="single" w:color="CCCCCC" w:sz="1"/>
+              <w:left w:val="single" w:color="CCCCCC" w:sz="1"/>
+              <w:bottom w:val="single" w:color="CCCCCC" w:sz="1"/>
+              <w:right w:val="single" w:color="CCCCCC" w:sz="1"/>
+            </w:tcBorders>
+            <w:shd w:fill="FFFFFF" w:val="clear"/>
+            <w:tcMar>
+              <w:top w:type="dxa" w:w="80"/>
+              <w:left w:type="dxa" w:w="120"/>
+              <w:bottom w:type="dxa" w:w="80"/>
+              <w:right w:type="dxa" w:w="120"/>
+            </w:tcMar>
+            <w:vAlign w:val="center"/>
+          </w:tcPr>
+          <w:p>
+            <w:r>
+              <w:rPr>
+                <w:rFonts w:ascii="Arial" w:cs="Arial" w:eastAsia="Arial" w:hAnsi="Arial"/>
+                <w:b w:val="false"/>
+                <w:bCs w:val="false"/>
+                <w:color w:val="000000"/>
+                <w:sz w:val="18"/>
+                <w:szCs w:val="18"/>
+              </w:rPr>
+              <w:t xml:space="preserve">32</w:t>
+            </w:r>
+          </w:p>
+        </w:tc>
+        <w:tc>
+          <w:tcPr>
+            <w:tcW w:type="dxa" w:w="800"/>
+            <w:tcBorders>
+              <w:top w:val="single" w:color="CCCCCC" w:sz="1"/>
+              <w:left w:val="single" w:color="CCCCCC" w:sz="1"/>
+              <w:bottom w:val="single" w:color="CCCCCC" w:sz="1"/>
+              <w:right w:val="single" w:color="CCCCCC" w:sz="1"/>
+            </w:tcBorders>
+            <w:shd w:fill="FFFFFF" w:val="clear"/>
+            <w:tcMar>
+              <w:top w:type="dxa" w:w="80"/>
+              <w:left w:type="dxa" w:w="120"/>
+              <w:bottom w:type="dxa" w:w="80"/>
+              <w:right w:type="dxa" w:w="120"/>
+            </w:tcMar>
+            <w:vAlign w:val="center"/>
+          </w:tcPr>
+          <w:p>
+            <w:r>
+              <w:rPr>
+                <w:rFonts w:ascii="Arial" w:cs="Arial" w:eastAsia="Arial" w:hAnsi="Arial"/>
+                <w:b w:val="false"/>
+                <w:bCs w:val="false"/>
+                <w:color w:val="000000"/>
+                <w:sz w:val="18"/>
+                <w:szCs w:val="18"/>
+              </w:rPr>
+              <w:t xml:space="preserve">4096</w:t>
+            </w:r>
+          </w:p>
+        </w:tc>
+        <w:tc>
+          <w:tcPr>
+            <w:tcW w:type="dxa" w:w="800"/>
+            <w:tcBorders>
+              <w:top w:val="single" w:color="CCCCCC" w:sz="1"/>
+              <w:left w:val="single" w:color="CCCCCC" w:sz="1"/>
+              <w:bottom w:val="single" w:color="CCCCCC" w:sz="1"/>
+              <w:right w:val="single" w:color="CCCCCC" w:sz="1"/>
+            </w:tcBorders>
+            <w:shd w:fill="FFFFFF" w:val="clear"/>
+            <w:tcMar>
+              <w:top w:type="dxa" w:w="80"/>
+              <w:left w:type="dxa" w:w="120"/>
+              <w:bottom w:type="dxa" w:w="80"/>
+              <w:right w:type="dxa" w:w="120"/>
+            </w:tcMar>
+            <w:vAlign w:val="center"/>
+          </w:tcPr>
+          <w:p>
+            <w:r>
+              <w:rPr>
+                <w:rFonts w:ascii="Arial" w:cs="Arial" w:eastAsia="Arial" w:hAnsi="Arial"/>
+                <w:b w:val="false"/>
+                <w:bCs w:val="false"/>
+                <w:color w:val="000000"/>
+                <w:sz w:val="18"/>
+                <w:szCs w:val="18"/>
+              </w:rPr>
+              <w:t xml:space="preserve">2043.5</w:t>
+            </w:r>
+          </w:p>
+        </w:tc>
+        <w:tc>
+          <w:tcPr>
+            <w:tcW w:type="dxa" w:w="700"/>
+            <w:tcBorders>
+              <w:top w:val="single" w:color="CCCCCC" w:sz="1"/>
+              <w:left w:val="single" w:color="CCCCCC" w:sz="1"/>
+              <w:bottom w:val="single" w:color="CCCCCC" w:sz="1"/>
+              <w:right w:val="single" w:color="CCCCCC" w:sz="1"/>
+            </w:tcBorders>
+            <w:shd w:fill="FFFFFF" w:val="clear"/>
+            <w:tcMar>
+              <w:top w:type="dxa" w:w="80"/>
+              <w:left w:type="dxa" w:w="120"/>
+              <w:bottom w:type="dxa" w:w="80"/>
+              <w:right w:type="dxa" w:w="120"/>
+            </w:tcMar>
+            <w:vAlign w:val="center"/>
+          </w:tcPr>
+          <w:p>
+            <w:r>
+              <w:rPr>
+                <w:rFonts w:ascii="Arial" w:cs="Arial" w:eastAsia="Arial" w:hAnsi="Arial"/>
+                <w:b w:val="false"/>
+                <w:bCs w:val="false"/>
+                <w:color w:val="000000"/>
+                <w:sz w:val="18"/>
+                <w:szCs w:val="18"/>
+              </w:rPr>
+              <w:t xml:space="preserve">5.8</w:t>
+            </w:r>
+          </w:p>
+        </w:tc>
+        <w:tc>
+          <w:tcPr>
+            <w:tcW w:type="dxa" w:w="900"/>
+            <w:tcBorders>
+              <w:top w:val="single" w:color="CCCCCC" w:sz="1"/>
+              <w:left w:val="single" w:color="CCCCCC" w:sz="1"/>
+              <w:bottom w:val="single" w:color="CCCCCC" w:sz="1"/>
+              <w:right w:val="single" w:color="CCCCCC" w:sz="1"/>
+            </w:tcBorders>
+            <w:shd w:fill="FFFFFF" w:val="clear"/>
+            <w:tcMar>
+              <w:top w:type="dxa" w:w="80"/>
+              <w:left w:type="dxa" w:w="120"/>
+              <w:bottom w:type="dxa" w:w="80"/>
+              <w:right w:type="dxa" w:w="120"/>
+            </w:tcMar>
+            <w:vAlign w:val="center"/>
+          </w:tcPr>
+          <w:p>
+            <w:r>
+              <w:rPr>
+                <w:rFonts w:ascii="Arial" w:cs="Arial" w:eastAsia="Arial" w:hAnsi="Arial"/>
+                <w:b w:val="false"/>
+                <w:bCs w:val="false"/>
+                <w:color w:val="000000"/>
+                <w:sz w:val="18"/>
+                <w:szCs w:val="18"/>
+              </w:rPr>
+              <w:t xml:space="preserve">2814.4</w:t>
+            </w:r>
+          </w:p>
+        </w:tc>
+        <w:tc>
+          <w:tcPr>
+            <w:tcW w:type="dxa" w:w="600"/>
+            <w:tcBorders>
+              <w:top w:val="single" w:color="CCCCCC" w:sz="1"/>
+              <w:left w:val="single" w:color="CCCCCC" w:sz="1"/>
+              <w:bottom w:val="single" w:color="CCCCCC" w:sz="1"/>
+              <w:right w:val="single" w:color="CCCCCC" w:sz="1"/>
+            </w:tcBorders>
+            <w:shd w:fill="FFFFFF" w:val="clear"/>
+            <w:tcMar>
+              <w:top w:type="dxa" w:w="80"/>
+              <w:left w:type="dxa" w:w="120"/>
+              <w:bottom w:type="dxa" w:w="80"/>
+              <w:right w:type="dxa" w:w="120"/>
+            </w:tcMar>
+            <w:vAlign w:val="center"/>
+          </w:tcPr>
+          <w:p>
+            <w:r>
+              <w:rPr>
+                <w:rFonts w:ascii="Arial" w:cs="Arial" w:eastAsia="Arial" w:hAnsi="Arial"/>
+                <w:b w:val="false"/>
+                <w:bCs w:val="false"/>
+                <w:color w:val="000000"/>
+                <w:sz w:val="18"/>
+                <w:szCs w:val="18"/>
+              </w:rPr>
+              <w:t xml:space="preserve">29.42</w:t>
+            </w:r>
+          </w:p>
+        </w:tc>
+        <w:tc>
+          <w:tcPr>
+            <w:tcW w:type="dxa" w:w="600"/>
+            <w:tcBorders>
+              <w:top w:val="single" w:color="CCCCCC" w:sz="1"/>
+              <w:left w:val="single" w:color="CCCCCC" w:sz="1"/>
+              <w:bottom w:val="single" w:color="CCCCCC" w:sz="1"/>
+              <w:right w:val="single" w:color="CCCCCC" w:sz="1"/>
+            </w:tcBorders>
+            <w:shd w:fill="FFFFFF" w:val="clear"/>
+            <w:tcMar>
+              <w:top w:type="dxa" w:w="80"/>
+              <w:left w:type="dxa" w:w="120"/>
+              <w:bottom w:type="dxa" w:w="80"/>
+              <w:right w:type="dxa" w:w="120"/>
+            </w:tcMar>
+            <w:vAlign w:val="center"/>
+          </w:tcPr>
+          <w:p>
+            <w:r>
+              <w:rPr>
+                <w:rFonts w:ascii="Arial" w:cs="Arial" w:eastAsia="Arial" w:hAnsi="Arial"/>
+                <w:b w:val="false"/>
+                <w:bCs w:val="false"/>
+                <w:color w:val="000000"/>
+                <w:sz w:val="18"/>
+                <w:szCs w:val="18"/>
+              </w:rPr>
+              <w:t xml:space="preserve">0</w:t>
+            </w:r>
+          </w:p>
+        </w:tc>
+        <w:tc>
+          <w:tcPr>
+            <w:tcW w:type="dxa" w:w="1500"/>
+            <w:tcBorders>
+              <w:top w:val="single" w:color="CCCCCC" w:sz="1"/>
+              <w:left w:val="single" w:color="CCCCCC" w:sz="1"/>
+              <w:bottom w:val="single" w:color="CCCCCC" w:sz="1"/>
+              <w:right w:val="single" w:color="CCCCCC" w:sz="1"/>
+            </w:tcBorders>
+            <w:shd w:fill="FFFFFF" w:val="clear"/>
+            <w:tcMar>
+              <w:top w:type="dxa" w:w="80"/>
+              <w:left w:type="dxa" w:w="120"/>
+              <w:bottom w:type="dxa" w:w="80"/>
+              <w:right w:type="dxa" w:w="120"/>
+            </w:tcMar>
+            <w:vAlign w:val="center"/>
+          </w:tcPr>
+          <w:p>
+            <w:r>
+              <w:rPr>
+                <w:rFonts w:ascii="Arial" w:cs="Arial" w:eastAsia="Arial" w:hAnsi="Arial"/>
+                <w:b w:val="false"/>
+                <w:bCs w:val="false"/>
+                <w:color w:val="000000"/>
+                <w:sz w:val="18"/>
+                <w:szCs w:val="18"/>
+              </w:rPr>
+              <w:t xml:space="preserve">Prefix cache OFF: 32% worse TTFT (2044 vs 1390ms), 24% lower throughput. Fixed prompt set creates high cache hit rate — keep prefix cache ON.</w:t>
+            </w:r>
+          </w:p>
+        </w:tc>
+      </w:tr>
+      <w:tr>
+        <w:tc>
+          <w:tcPr>
+            <w:tcW w:type="dxa" w:w="900"/>
+            <w:tcBorders>
+              <w:top w:val="single" w:color="CCCCCC" w:sz="1"/>
+              <w:left w:val="single" w:color="CCCCCC" w:sz="1"/>
+              <w:bottom w:val="single" w:color="CCCCCC" w:sz="1"/>
+              <w:right w:val="single" w:color="CCCCCC" w:sz="1"/>
+            </w:tcBorders>
+            <w:shd w:fill="FFFFFF" w:val="clear"/>
+            <w:tcMar>
+              <w:top w:type="dxa" w:w="80"/>
+              <w:left w:type="dxa" w:w="120"/>
+              <w:bottom w:type="dxa" w:w="80"/>
+              <w:right w:type="dxa" w:w="120"/>
+            </w:tcMar>
+            <w:vAlign w:val="center"/>
+          </w:tcPr>
+          <w:p>
+            <w:r>
+              <w:rPr>
+                <w:rFonts w:ascii="Arial" w:cs="Arial" w:eastAsia="Arial" w:hAnsi="Arial"/>
+                <w:b w:val="false"/>
+                <w:bCs w:val="false"/>
+                <w:color w:val="000000"/>
+                <w:sz w:val="18"/>
+                <w:szCs w:val="18"/>
+              </w:rPr>
+              <w:t xml:space="preserve">No Chunked Prefill</w:t>
+            </w:r>
+          </w:p>
+        </w:tc>
+        <w:tc>
+          <w:tcPr>
+            <w:tcW w:type="dxa" w:w="1400"/>
+            <w:tcBorders>
+              <w:top w:val="single" w:color="CCCCCC" w:sz="1"/>
+              <w:left w:val="single" w:color="CCCCCC" w:sz="1"/>
+              <w:bottom w:val="single" w:color="CCCCCC" w:sz="1"/>
+              <w:right w:val="single" w:color="CCCCCC" w:sz="1"/>
+            </w:tcBorders>
+            <w:shd w:fill="FFFFFF" w:val="clear"/>
+            <w:tcMar>
+              <w:top w:type="dxa" w:w="80"/>
+              <w:left w:type="dxa" w:w="120"/>
+              <w:bottom w:type="dxa" w:w="80"/>
+              <w:right w:type="dxa" w:w="120"/>
+            </w:tcMar>
+            <w:vAlign w:val="center"/>
+          </w:tcPr>
+          <w:p>
+            <w:r>
+              <w:rPr>
+                <w:rFonts w:ascii="Arial" w:cs="Arial" w:eastAsia="Arial" w:hAnsi="Arial"/>
+                <w:b w:val="false"/>
+                <w:bCs w:val="false"/>
+                <w:color w:val="000000"/>
+                <w:sz w:val="18"/>
+                <w:szCs w:val="18"/>
+              </w:rPr>
+              <w:t xml:space="preserve">compiled-text-r1-no-chunked</w:t>
+            </w:r>
+          </w:p>
+        </w:tc>
+        <w:tc>
+          <w:tcPr>
+            <w:tcW w:type="dxa" w:w="500"/>
+            <w:tcBorders>
+              <w:top w:val="single" w:color="CCCCCC" w:sz="1"/>
+              <w:left w:val="single" w:color="CCCCCC" w:sz="1"/>
+              <w:bottom w:val="single" w:color="CCCCCC" w:sz="1"/>
+              <w:right w:val="single" w:color="CCCCCC" w:sz="1"/>
+            </w:tcBorders>
+            <w:shd w:fill="FFFFFF" w:val="clear"/>
+            <w:tcMar>
+              <w:top w:type="dxa" w:w="80"/>
+              <w:left w:type="dxa" w:w="120"/>
+              <w:bottom w:type="dxa" w:w="80"/>
+              <w:right w:type="dxa" w:w="120"/>
+            </w:tcMar>
+            <w:vAlign w:val="center"/>
+          </w:tcPr>
+          <w:p>
+            <w:r>
+              <w:rPr>
+                <w:rFonts w:ascii="Arial" w:cs="Arial" w:eastAsia="Arial" w:hAnsi="Arial"/>
+                <w:b w:val="false"/>
+                <w:bCs w:val="false"/>
+                <w:color w:val="000000"/>
+                <w:sz w:val="18"/>
+                <w:szCs w:val="18"/>
+              </w:rPr>
+              <w:t xml:space="preserve">1</w:t>
+            </w:r>
+          </w:p>
+        </w:tc>
+        <w:tc>
+          <w:tcPr>
+            <w:tcW w:type="dxa" w:w="500"/>
+            <w:tcBorders>
+              <w:top w:val="single" w:color="CCCCCC" w:sz="1"/>
+              <w:left w:val="single" w:color="CCCCCC" w:sz="1"/>
+              <w:bottom w:val="single" w:color="CCCCCC" w:sz="1"/>
+              <w:right w:val="single" w:color="CCCCCC" w:sz="1"/>
+            </w:tcBorders>
+            <w:shd w:fill="FFFFFF" w:val="clear"/>
+            <w:tcMar>
+              <w:top w:type="dxa" w:w="80"/>
+              <w:left w:type="dxa" w:w="120"/>
+              <w:bottom w:type="dxa" w:w="80"/>
+              <w:right w:type="dxa" w:w="120"/>
+            </w:tcMar>
+            <w:vAlign w:val="center"/>
+          </w:tcPr>
+          <w:p>
+            <w:r>
+              <w:rPr>
+                <w:rFonts w:ascii="Arial" w:cs="Arial" w:eastAsia="Arial" w:hAnsi="Arial"/>
+                <w:b w:val="false"/>
+                <w:bCs w:val="false"/>
+                <w:color w:val="000000"/>
+                <w:sz w:val="18"/>
+                <w:szCs w:val="18"/>
+              </w:rPr>
+              <w:t xml:space="preserve">text</w:t>
+            </w:r>
+          </w:p>
+        </w:tc>
+        <w:tc>
+          <w:tcPr>
+            <w:tcW w:type="dxa" w:w="500"/>
+            <w:tcBorders>
+              <w:top w:val="single" w:color="CCCCCC" w:sz="1"/>
+              <w:left w:val="single" w:color="CCCCCC" w:sz="1"/>
+              <w:bottom w:val="single" w:color="CCCCCC" w:sz="1"/>
+              <w:right w:val="single" w:color="CCCCCC" w:sz="1"/>
+            </w:tcBorders>
+            <w:shd w:fill="FFFFFF" w:val="clear"/>
+            <w:tcMar>
+              <w:top w:type="dxa" w:w="80"/>
+              <w:left w:type="dxa" w:w="120"/>
+              <w:bottom w:type="dxa" w:w="80"/>
+              <w:right w:type="dxa" w:w="120"/>
+            </w:tcMar>
+            <w:vAlign w:val="center"/>
+          </w:tcPr>
+          <w:p>
+            <w:r>
+              <w:rPr>
+                <w:rFonts w:ascii="Arial" w:cs="Arial" w:eastAsia="Arial" w:hAnsi="Arial"/>
+                <w:b w:val="false"/>
+                <w:bCs w:val="false"/>
+                <w:color w:val="000000"/>
+                <w:sz w:val="18"/>
+                <w:szCs w:val="18"/>
+              </w:rPr>
+              <w:t xml:space="preserve">100</w:t>
+            </w:r>
+          </w:p>
+        </w:tc>
+        <w:tc>
+          <w:tcPr>
+            <w:tcW w:type="dxa" w:w="700"/>
+            <w:tcBorders>
+              <w:top w:val="single" w:color="CCCCCC" w:sz="1"/>
+              <w:left w:val="single" w:color="CCCCCC" w:sz="1"/>
+              <w:bottom w:val="single" w:color="CCCCCC" w:sz="1"/>
+              <w:right w:val="single" w:color="CCCCCC" w:sz="1"/>
+            </w:tcBorders>
+            <w:shd w:fill="FFFFFF" w:val="clear"/>
+            <w:tcMar>
+              <w:top w:type="dxa" w:w="80"/>
+              <w:left w:type="dxa" w:w="120"/>
+              <w:bottom w:type="dxa" w:w="80"/>
+              <w:right w:type="dxa" w:w="120"/>
+            </w:tcMar>
+            <w:vAlign w:val="center"/>
+          </w:tcPr>
+          <w:p>
+            <w:r>
+              <w:rPr>
+                <w:rFonts w:ascii="Arial" w:cs="Arial" w:eastAsia="Arial" w:hAnsi="Arial"/>
+                <w:b w:val="false"/>
+                <w:bCs w:val="false"/>
+                <w:color w:val="000000"/>
+                <w:sz w:val="18"/>
+                <w:szCs w:val="18"/>
+              </w:rPr>
+              <w:t xml:space="preserve">false</w:t>
+            </w:r>
+          </w:p>
+        </w:tc>
+        <w:tc>
+          <w:tcPr>
+            <w:tcW w:type="dxa" w:w="600"/>
+            <w:tcBorders>
+              <w:top w:val="single" w:color="CCCCCC" w:sz="1"/>
+              <w:left w:val="single" w:color="CCCCCC" w:sz="1"/>
+              <w:bottom w:val="single" w:color="CCCCCC" w:sz="1"/>
+              <w:right w:val="single" w:color="CCCCCC" w:sz="1"/>
+            </w:tcBorders>
+            <w:shd w:fill="FFFFFF" w:val="clear"/>
+            <w:tcMar>
+              <w:top w:type="dxa" w:w="80"/>
+              <w:left w:type="dxa" w:w="120"/>
+              <w:bottom w:type="dxa" w:w="80"/>
+              <w:right w:type="dxa" w:w="120"/>
+            </w:tcMar>
+            <w:vAlign w:val="center"/>
+          </w:tcPr>
+          <w:p>
+            <w:r>
+              <w:rPr>
+                <w:rFonts w:ascii="Arial" w:cs="Arial" w:eastAsia="Arial" w:hAnsi="Arial"/>
+                <w:b w:val="false"/>
+                <w:bCs w:val="false"/>
+                <w:color w:val="000000"/>
+                <w:sz w:val="18"/>
+                <w:szCs w:val="18"/>
+              </w:rPr>
+              <w:t xml:space="preserve">32</w:t>
+            </w:r>
+          </w:p>
+        </w:tc>
+        <w:tc>
+          <w:tcPr>
+            <w:tcW w:type="dxa" w:w="800"/>
+            <w:tcBorders>
+              <w:top w:val="single" w:color="CCCCCC" w:sz="1"/>
+              <w:left w:val="single" w:color="CCCCCC" w:sz="1"/>
+              <w:bottom w:val="single" w:color="CCCCCC" w:sz="1"/>
+              <w:right w:val="single" w:color="CCCCCC" w:sz="1"/>
+            </w:tcBorders>
+            <w:shd w:fill="FFFFFF" w:val="clear"/>
+            <w:tcMar>
+              <w:top w:type="dxa" w:w="80"/>
+              <w:left w:type="dxa" w:w="120"/>
+              <w:bottom w:type="dxa" w:w="80"/>
+              <w:right w:type="dxa" w:w="120"/>
+            </w:tcMar>
+            <w:vAlign w:val="center"/>
+          </w:tcPr>
+          <w:p>
+            <w:r>
+              <w:rPr>
+                <w:rFonts w:ascii="Arial" w:cs="Arial" w:eastAsia="Arial" w:hAnsi="Arial"/>
+                <w:b w:val="false"/>
+                <w:bCs w:val="false"/>
+                <w:color w:val="000000"/>
+                <w:sz w:val="18"/>
+                <w:szCs w:val="18"/>
+              </w:rPr>
+              <w:t xml:space="preserve">4096</w:t>
+            </w:r>
+          </w:p>
+        </w:tc>
+        <w:tc>
+          <w:tcPr>
+            <w:tcW w:type="dxa" w:w="800"/>
+            <w:tcBorders>
+              <w:top w:val="single" w:color="CCCCCC" w:sz="1"/>
+              <w:left w:val="single" w:color="CCCCCC" w:sz="1"/>
+              <w:bottom w:val="single" w:color="CCCCCC" w:sz="1"/>
+              <w:right w:val="single" w:color="CCCCCC" w:sz="1"/>
+            </w:tcBorders>
+            <w:shd w:fill="FFFFFF" w:val="clear"/>
+            <w:tcMar>
+              <w:top w:type="dxa" w:w="80"/>
+              <w:left w:type="dxa" w:w="120"/>
+              <w:bottom w:type="dxa" w:w="80"/>
+              <w:right w:type="dxa" w:w="120"/>
+            </w:tcMar>
+            <w:vAlign w:val="center"/>
+          </w:tcPr>
+          <w:p>
+            <w:r>
+              <w:rPr>
+                <w:rFonts w:ascii="Arial" w:cs="Arial" w:eastAsia="Arial" w:hAnsi="Arial"/>
+                <w:b w:val="false"/>
+                <w:bCs w:val="false"/>
+                <w:color w:val="000000"/>
+                <w:sz w:val="18"/>
+                <w:szCs w:val="18"/>
+              </w:rPr>
+              <w:t xml:space="preserve">1402.6</w:t>
+            </w:r>
+          </w:p>
+        </w:tc>
+        <w:tc>
+          <w:tcPr>
+            <w:tcW w:type="dxa" w:w="700"/>
+            <w:tcBorders>
+              <w:top w:val="single" w:color="CCCCCC" w:sz="1"/>
+              <w:left w:val="single" w:color="CCCCCC" w:sz="1"/>
+              <w:bottom w:val="single" w:color="CCCCCC" w:sz="1"/>
+              <w:right w:val="single" w:color="CCCCCC" w:sz="1"/>
+            </w:tcBorders>
+            <w:shd w:fill="FFFFFF" w:val="clear"/>
+            <w:tcMar>
+              <w:top w:type="dxa" w:w="80"/>
+              <w:left w:type="dxa" w:w="120"/>
+              <w:bottom w:type="dxa" w:w="80"/>
+              <w:right w:type="dxa" w:w="120"/>
+            </w:tcMar>
+            <w:vAlign w:val="center"/>
+          </w:tcPr>
+          <w:p>
+            <w:r>
+              <w:rPr>
+                <w:rFonts w:ascii="Arial" w:cs="Arial" w:eastAsia="Arial" w:hAnsi="Arial"/>
+                <w:b w:val="false"/>
+                <w:bCs w:val="false"/>
+                <w:color w:val="000000"/>
+                <w:sz w:val="18"/>
+                <w:szCs w:val="18"/>
+              </w:rPr>
+              <w:t xml:space="preserve">5.6</w:t>
+            </w:r>
+          </w:p>
+        </w:tc>
+        <w:tc>
+          <w:tcPr>
+            <w:tcW w:type="dxa" w:w="900"/>
+            <w:tcBorders>
+              <w:top w:val="single" w:color="CCCCCC" w:sz="1"/>
+              <w:left w:val="single" w:color="CCCCCC" w:sz="1"/>
+              <w:bottom w:val="single" w:color="CCCCCC" w:sz="1"/>
+              <w:right w:val="single" w:color="CCCCCC" w:sz="1"/>
+            </w:tcBorders>
+            <w:shd w:fill="FFFFFF" w:val="clear"/>
+            <w:tcMar>
+              <w:top w:type="dxa" w:w="80"/>
+              <w:left w:type="dxa" w:w="120"/>
+              <w:bottom w:type="dxa" w:w="80"/>
+              <w:right w:type="dxa" w:w="120"/>
+            </w:tcMar>
+            <w:vAlign w:val="center"/>
+          </w:tcPr>
+          <w:p>
+            <w:r>
+              <w:rPr>
+                <w:rFonts w:ascii="Arial" w:cs="Arial" w:eastAsia="Arial" w:hAnsi="Arial"/>
+                <w:b w:val="false"/>
+                <w:bCs w:val="false"/>
+                <w:color w:val="000000"/>
+                <w:sz w:val="18"/>
+                <w:szCs w:val="18"/>
+              </w:rPr>
+              <w:t xml:space="preserve">3672.0</w:t>
+            </w:r>
+          </w:p>
+        </w:tc>
+        <w:tc>
+          <w:tcPr>
+            <w:tcW w:type="dxa" w:w="600"/>
+            <w:tcBorders>
+              <w:top w:val="single" w:color="CCCCCC" w:sz="1"/>
+              <w:left w:val="single" w:color="CCCCCC" w:sz="1"/>
+              <w:bottom w:val="single" w:color="CCCCCC" w:sz="1"/>
+              <w:right w:val="single" w:color="CCCCCC" w:sz="1"/>
+            </w:tcBorders>
+            <w:shd w:fill="FFFFFF" w:val="clear"/>
+            <w:tcMar>
+              <w:top w:type="dxa" w:w="80"/>
+              <w:left w:type="dxa" w:w="120"/>
+              <w:bottom w:type="dxa" w:w="80"/>
+              <w:right w:type="dxa" w:w="120"/>
+            </w:tcMar>
+            <w:vAlign w:val="center"/>
+          </w:tcPr>
+          <w:p>
+            <w:r>
+              <w:rPr>
+                <w:rFonts w:ascii="Arial" w:cs="Arial" w:eastAsia="Arial" w:hAnsi="Arial"/>
+                <w:b w:val="false"/>
+                <w:bCs w:val="false"/>
+                <w:color w:val="000000"/>
+                <w:sz w:val="18"/>
+                <w:szCs w:val="18"/>
+              </w:rPr>
+              <w:t xml:space="preserve">38.35</w:t>
+            </w:r>
+          </w:p>
+        </w:tc>
+        <w:tc>
+          <w:tcPr>
+            <w:tcW w:type="dxa" w:w="600"/>
+            <w:tcBorders>
+              <w:top w:val="single" w:color="CCCCCC" w:sz="1"/>
+              <w:left w:val="single" w:color="CCCCCC" w:sz="1"/>
+              <w:bottom w:val="single" w:color="CCCCCC" w:sz="1"/>
+              <w:right w:val="single" w:color="CCCCCC" w:sz="1"/>
+            </w:tcBorders>
+            <w:shd w:fill="FFFFFF" w:val="clear"/>
+            <w:tcMar>
+              <w:top w:type="dxa" w:w="80"/>
+              <w:left w:type="dxa" w:w="120"/>
+              <w:bottom w:type="dxa" w:w="80"/>
+              <w:right w:type="dxa" w:w="120"/>
+            </w:tcMar>
+            <w:vAlign w:val="center"/>
+          </w:tcPr>
+          <w:p>
+            <w:r>
+              <w:rPr>
+                <w:rFonts w:ascii="Arial" w:cs="Arial" w:eastAsia="Arial" w:hAnsi="Arial"/>
+                <w:b w:val="false"/>
+                <w:bCs w:val="false"/>
+                <w:color w:val="000000"/>
+                <w:sz w:val="18"/>
+                <w:szCs w:val="18"/>
+              </w:rPr>
+              <w:t xml:space="preserve">0</w:t>
+            </w:r>
+          </w:p>
+        </w:tc>
+        <w:tc>
+          <w:tcPr>
+            <w:tcW w:type="dxa" w:w="1500"/>
+            <w:tcBorders>
+              <w:top w:val="single" w:color="CCCCCC" w:sz="1"/>
+              <w:left w:val="single" w:color="CCCCCC" w:sz="1"/>
+              <w:bottom w:val="single" w:color="CCCCCC" w:sz="1"/>
+              <w:right w:val="single" w:color="CCCCCC" w:sz="1"/>
+            </w:tcBorders>
+            <w:shd w:fill="FFFFFF" w:val="clear"/>
+            <w:tcMar>
+              <w:top w:type="dxa" w:w="80"/>
+              <w:left w:type="dxa" w:w="120"/>
+              <w:bottom w:type="dxa" w:w="80"/>
+              <w:right w:type="dxa" w:w="120"/>
+            </w:tcMar>
+            <w:vAlign w:val="center"/>
+          </w:tcPr>
+          <w:p>
+            <w:r>
+              <w:rPr>
+                <w:rFonts w:ascii="Arial" w:cs="Arial" w:eastAsia="Arial" w:hAnsi="Arial"/>
+                <w:b w:val="false"/>
+                <w:bCs w:val="false"/>
+                <w:color w:val="000000"/>
+                <w:sz w:val="18"/>
+                <w:szCs w:val="18"/>
+              </w:rPr>
+              <w:t xml:space="preserve">Negligible difference vs chunked prefill ON for text workloads (+13ms TTFT, -25 chunks/s). Keep ON — helps with long/mixed prompts at no text cost.</w:t>
+            </w:r>
+          </w:p>
+        </w:tc>
+      </w:tr>
+      <w:tr>
+        <w:tc>
+          <w:tcPr>
+            <w:tcW w:type="dxa" w:w="900"/>
+            <w:tcBorders>
+              <w:top w:val="single" w:color="CCCCCC" w:sz="1"/>
+              <w:left w:val="single" w:color="CCCCCC" w:sz="1"/>
+              <w:bottom w:val="single" w:color="CCCCCC" w:sz="1"/>
+              <w:right w:val="single" w:color="CCCCCC" w:sz="1"/>
+            </w:tcBorders>
+            <w:shd w:fill="FFFFFF" w:val="clear"/>
+            <w:tcMar>
+              <w:top w:type="dxa" w:w="80"/>
+              <w:left w:type="dxa" w:w="120"/>
+              <w:bottom w:type="dxa" w:w="80"/>
+              <w:right w:type="dxa" w:w="120"/>
+            </w:tcMar>
+            <w:vAlign w:val="center"/>
+          </w:tcPr>
+          <w:p>
+            <w:r>
+              <w:rPr>
+                <w:rFonts w:ascii="Arial" w:cs="Arial" w:eastAsia="Arial" w:hAnsi="Arial"/>
+                <w:b w:val="false"/>
+                <w:bCs w:val="false"/>
+                <w:color w:val="000000"/>
+                <w:sz w:val="18"/>
+                <w:szCs w:val="18"/>
+              </w:rPr>
+              <w:t xml:space="preserve">Wide Batch (64/8k)</w:t>
+            </w:r>
+          </w:p>
+        </w:tc>
+        <w:tc>
+          <w:tcPr>
+            <w:tcW w:type="dxa" w:w="1400"/>
+            <w:tcBorders>
+              <w:top w:val="single" w:color="CCCCCC" w:sz="1"/>
+              <w:left w:val="single" w:color="CCCCCC" w:sz="1"/>
+              <w:bottom w:val="single" w:color="CCCCCC" w:sz="1"/>
+              <w:right w:val="single" w:color="CCCCCC" w:sz="1"/>
+            </w:tcBorders>
+            <w:shd w:fill="FFFFFF" w:val="clear"/>
+            <w:tcMar>
+              <w:top w:type="dxa" w:w="80"/>
+              <w:left w:type="dxa" w:w="120"/>
+              <w:bottom w:type="dxa" w:w="80"/>
+              <w:right w:type="dxa" w:w="120"/>
+            </w:tcMar>
+            <w:vAlign w:val="center"/>
+          </w:tcPr>
+          <w:p>
+            <w:r>
+              <w:rPr>
+                <w:rFonts w:ascii="Arial" w:cs="Arial" w:eastAsia="Arial" w:hAnsi="Arial"/>
+                <w:b w:val="false"/>
+                <w:bCs w:val="false"/>
+                <w:color w:val="000000"/>
+                <w:sz w:val="18"/>
+                <w:szCs w:val="18"/>
+              </w:rPr>
+              <w:t xml:space="preserve">compiled-text-r1-wide-batch</w:t>
+            </w:r>
+          </w:p>
+        </w:tc>
+        <w:tc>
+          <w:tcPr>
+            <w:tcW w:type="dxa" w:w="500"/>
+            <w:tcBorders>
+              <w:top w:val="single" w:color="CCCCCC" w:sz="1"/>
+              <w:left w:val="single" w:color="CCCCCC" w:sz="1"/>
+              <w:bottom w:val="single" w:color="CCCCCC" w:sz="1"/>
+              <w:right w:val="single" w:color="CCCCCC" w:sz="1"/>
+            </w:tcBorders>
+            <w:shd w:fill="FFFFFF" w:val="clear"/>
+            <w:tcMar>
+              <w:top w:type="dxa" w:w="80"/>
+              <w:left w:type="dxa" w:w="120"/>
+              <w:bottom w:type="dxa" w:w="80"/>
+              <w:right w:type="dxa" w:w="120"/>
+            </w:tcMar>
+            <w:vAlign w:val="center"/>
+          </w:tcPr>
+          <w:p>
+            <w:r>
+              <w:rPr>
+                <w:rFonts w:ascii="Arial" w:cs="Arial" w:eastAsia="Arial" w:hAnsi="Arial"/>
+                <w:b w:val="false"/>
+                <w:bCs w:val="false"/>
+                <w:color w:val="000000"/>
+                <w:sz w:val="18"/>
+                <w:szCs w:val="18"/>
+              </w:rPr>
+              <w:t xml:space="preserve">1</w:t>
+            </w:r>
+          </w:p>
+        </w:tc>
+        <w:tc>
+          <w:tcPr>
+            <w:tcW w:type="dxa" w:w="500"/>
+            <w:tcBorders>
+              <w:top w:val="single" w:color="CCCCCC" w:sz="1"/>
+              <w:left w:val="single" w:color="CCCCCC" w:sz="1"/>
+              <w:bottom w:val="single" w:color="CCCCCC" w:sz="1"/>
+              <w:right w:val="single" w:color="CCCCCC" w:sz="1"/>
+            </w:tcBorders>
+            <w:shd w:fill="FFFFFF" w:val="clear"/>
+            <w:tcMar>
+              <w:top w:type="dxa" w:w="80"/>
+              <w:left w:type="dxa" w:w="120"/>
+              <w:bottom w:type="dxa" w:w="80"/>
+              <w:right w:type="dxa" w:w="120"/>
+            </w:tcMar>
+            <w:vAlign w:val="center"/>
+          </w:tcPr>
+          <w:p>
+            <w:r>
+              <w:rPr>
+                <w:rFonts w:ascii="Arial" w:cs="Arial" w:eastAsia="Arial" w:hAnsi="Arial"/>
+                <w:b w:val="false"/>
+                <w:bCs w:val="false"/>
+                <w:color w:val="000000"/>
+                <w:sz w:val="18"/>
+                <w:szCs w:val="18"/>
+              </w:rPr>
+              <w:t xml:space="preserve">text</w:t>
+            </w:r>
+          </w:p>
+        </w:tc>
+        <w:tc>
+          <w:tcPr>
+            <w:tcW w:type="dxa" w:w="500"/>
+            <w:tcBorders>
+              <w:top w:val="single" w:color="CCCCCC" w:sz="1"/>
+              <w:left w:val="single" w:color="CCCCCC" w:sz="1"/>
+              <w:bottom w:val="single" w:color="CCCCCC" w:sz="1"/>
+              <w:right w:val="single" w:color="CCCCCC" w:sz="1"/>
+            </w:tcBorders>
+            <w:shd w:fill="FFFFFF" w:val="clear"/>
+            <w:tcMar>
+              <w:top w:type="dxa" w:w="80"/>
+              <w:left w:type="dxa" w:w="120"/>
+              <w:bottom w:type="dxa" w:w="80"/>
+              <w:right w:type="dxa" w:w="120"/>
+            </w:tcMar>
+            <w:vAlign w:val="center"/>
+          </w:tcPr>
+          <w:p>
+            <w:r>
+              <w:rPr>
+                <w:rFonts w:ascii="Arial" w:cs="Arial" w:eastAsia="Arial" w:hAnsi="Arial"/>
+                <w:b w:val="false"/>
+                <w:bCs w:val="false"/>
+                <w:color w:val="000000"/>
+                <w:sz w:val="18"/>
+                <w:szCs w:val="18"/>
+              </w:rPr>
+              <w:t xml:space="preserve">100</w:t>
+            </w:r>
+          </w:p>
+        </w:tc>
+        <w:tc>
+          <w:tcPr>
+            <w:tcW w:type="dxa" w:w="700"/>
+            <w:tcBorders>
+              <w:top w:val="single" w:color="CCCCCC" w:sz="1"/>
+              <w:left w:val="single" w:color="CCCCCC" w:sz="1"/>
+              <w:bottom w:val="single" w:color="CCCCCC" w:sz="1"/>
+              <w:right w:val="single" w:color="CCCCCC" w:sz="1"/>
+            </w:tcBorders>
+            <w:shd w:fill="FFFFFF" w:val="clear"/>
+            <w:tcMar>
+              <w:top w:type="dxa" w:w="80"/>
+              <w:left w:type="dxa" w:w="120"/>
+              <w:bottom w:type="dxa" w:w="80"/>
+              <w:right w:type="dxa" w:w="120"/>
+            </w:tcMar>
+            <w:vAlign w:val="center"/>
+          </w:tcPr>
+          <w:p>
+            <w:r>
+              <w:rPr>
+                <w:rFonts w:ascii="Arial" w:cs="Arial" w:eastAsia="Arial" w:hAnsi="Arial"/>
+                <w:b w:val="false"/>
+                <w:bCs w:val="false"/>
+                <w:color w:val="000000"/>
+                <w:sz w:val="18"/>
+                <w:szCs w:val="18"/>
+              </w:rPr>
+              <w:t xml:space="preserve">false</w:t>
+            </w:r>
+          </w:p>
+        </w:tc>
+        <w:tc>
+          <w:tcPr>
+            <w:tcW w:type="dxa" w:w="600"/>
+            <w:tcBorders>
+              <w:top w:val="single" w:color="CCCCCC" w:sz="1"/>
+              <w:left w:val="single" w:color="CCCCCC" w:sz="1"/>
+              <w:bottom w:val="single" w:color="CCCCCC" w:sz="1"/>
+              <w:right w:val="single" w:color="CCCCCC" w:sz="1"/>
+            </w:tcBorders>
+            <w:shd w:fill="FFFFFF" w:val="clear"/>
+            <w:tcMar>
+              <w:top w:type="dxa" w:w="80"/>
+              <w:left w:type="dxa" w:w="120"/>
+              <w:bottom w:type="dxa" w:w="80"/>
+              <w:right w:type="dxa" w:w="120"/>
+            </w:tcMar>
+            <w:vAlign w:val="center"/>
+          </w:tcPr>
+          <w:p>
+            <w:r>
+              <w:rPr>
+                <w:rFonts w:ascii="Arial" w:cs="Arial" w:eastAsia="Arial" w:hAnsi="Arial"/>
+                <w:b w:val="false"/>
+                <w:bCs w:val="false"/>
+                <w:color w:val="000000"/>
+                <w:sz w:val="18"/>
+                <w:szCs w:val="18"/>
+              </w:rPr>
+              <w:t xml:space="preserve">64</w:t>
+            </w:r>
+          </w:p>
+        </w:tc>
+        <w:tc>
+          <w:tcPr>
+            <w:tcW w:type="dxa" w:w="800"/>
+            <w:tcBorders>
+              <w:top w:val="single" w:color="CCCCCC" w:sz="1"/>
+              <w:left w:val="single" w:color="CCCCCC" w:sz="1"/>
+              <w:bottom w:val="single" w:color="CCCCCC" w:sz="1"/>
+              <w:right w:val="single" w:color="CCCCCC" w:sz="1"/>
+            </w:tcBorders>
+            <w:shd w:fill="FFFFFF" w:val="clear"/>
+            <w:tcMar>
+              <w:top w:type="dxa" w:w="80"/>
+              <w:left w:type="dxa" w:w="120"/>
+              <w:bottom w:type="dxa" w:w="80"/>
+              <w:right w:type="dxa" w:w="120"/>
+            </w:tcMar>
+            <w:vAlign w:val="center"/>
+          </w:tcPr>
+          <w:p>
+            <w:r>
+              <w:rPr>
+                <w:rFonts w:ascii="Arial" w:cs="Arial" w:eastAsia="Arial" w:hAnsi="Arial"/>
+                <w:b w:val="false"/>
+                <w:bCs w:val="false"/>
+                <w:color w:val="000000"/>
+                <w:sz w:val="18"/>
+                <w:szCs w:val="18"/>
+              </w:rPr>
+              <w:t xml:space="preserve">8192</w:t>
+            </w:r>
+          </w:p>
+        </w:tc>
+        <w:tc>
+          <w:tcPr>
+            <w:tcW w:type="dxa" w:w="800"/>
+            <w:tcBorders>
+              <w:top w:val="single" w:color="CCCCCC" w:sz="1"/>
+              <w:left w:val="single" w:color="CCCCCC" w:sz="1"/>
+              <w:bottom w:val="single" w:color="CCCCCC" w:sz="1"/>
+              <w:right w:val="single" w:color="CCCCCC" w:sz="1"/>
+            </w:tcBorders>
+            <w:shd w:fill="FFFFFF" w:val="clear"/>
+            <w:tcMar>
+              <w:top w:type="dxa" w:w="80"/>
+              <w:left w:type="dxa" w:w="120"/>
+              <w:bottom w:type="dxa" w:w="80"/>
+              <w:right w:type="dxa" w:w="120"/>
+            </w:tcMar>
+            <w:vAlign w:val="center"/>
+          </w:tcPr>
+          <w:p>
+            <w:r>
+              <w:rPr>
+                <w:rFonts w:ascii="Arial" w:cs="Arial" w:eastAsia="Arial" w:hAnsi="Arial"/>
+                <w:b w:val="false"/>
+                <w:bCs w:val="false"/>
+                <w:color w:val="000000"/>
+                <w:sz w:val="18"/>
+                <w:szCs w:val="18"/>
+              </w:rPr>
+              <w:t xml:space="preserve">2205.1</w:t>
+            </w:r>
+          </w:p>
+        </w:tc>
+        <w:tc>
+          <w:tcPr>
+            <w:tcW w:type="dxa" w:w="700"/>
+            <w:tcBorders>
+              <w:top w:val="single" w:color="CCCCCC" w:sz="1"/>
+              <w:left w:val="single" w:color="CCCCCC" w:sz="1"/>
+              <w:bottom w:val="single" w:color="CCCCCC" w:sz="1"/>
+              <w:right w:val="single" w:color="CCCCCC" w:sz="1"/>
+            </w:tcBorders>
+            <w:shd w:fill="FFFFFF" w:val="clear"/>
+            <w:tcMar>
+              <w:top w:type="dxa" w:w="80"/>
+              <w:left w:type="dxa" w:w="120"/>
+              <w:bottom w:type="dxa" w:w="80"/>
+              <w:right w:type="dxa" w:w="120"/>
+            </w:tcMar>
+            <w:vAlign w:val="center"/>
+          </w:tcPr>
+          <w:p>
+            <w:r>
+              <w:rPr>
+                <w:rFonts w:ascii="Arial" w:cs="Arial" w:eastAsia="Arial" w:hAnsi="Arial"/>
+                <w:b w:val="false"/>
+                <w:bCs w:val="false"/>
+                <w:color w:val="000000"/>
+                <w:sz w:val="18"/>
+                <w:szCs w:val="18"/>
+              </w:rPr>
+              <w:t xml:space="preserve">5.8</w:t>
+            </w:r>
+          </w:p>
+        </w:tc>
+        <w:tc>
+          <w:tcPr>
+            <w:tcW w:type="dxa" w:w="900"/>
+            <w:tcBorders>
+              <w:top w:val="single" w:color="CCCCCC" w:sz="1"/>
+              <w:left w:val="single" w:color="CCCCCC" w:sz="1"/>
+              <w:bottom w:val="single" w:color="CCCCCC" w:sz="1"/>
+              <w:right w:val="single" w:color="CCCCCC" w:sz="1"/>
+            </w:tcBorders>
+            <w:shd w:fill="FFFFFF" w:val="clear"/>
+            <w:tcMar>
+              <w:top w:type="dxa" w:w="80"/>
+              <w:left w:type="dxa" w:w="120"/>
+              <w:bottom w:type="dxa" w:w="80"/>
+              <w:right w:type="dxa" w:w="120"/>
+            </w:tcMar>
+            <w:vAlign w:val="center"/>
+          </w:tcPr>
+          <w:p>
+            <w:r>
+              <w:rPr>
+                <w:rFonts w:ascii="Arial" w:cs="Arial" w:eastAsia="Arial" w:hAnsi="Arial"/>
+                <w:b w:val="false"/>
+                <w:bCs w:val="false"/>
+                <w:color w:val="000000"/>
+                <w:sz w:val="18"/>
+                <w:szCs w:val="18"/>
+              </w:rPr>
+              <w:t xml:space="preserve">2763.5</w:t>
+            </w:r>
+          </w:p>
+        </w:tc>
+        <w:tc>
+          <w:tcPr>
+            <w:tcW w:type="dxa" w:w="600"/>
+            <w:tcBorders>
+              <w:top w:val="single" w:color="CCCCCC" w:sz="1"/>
+              <w:left w:val="single" w:color="CCCCCC" w:sz="1"/>
+              <w:bottom w:val="single" w:color="CCCCCC" w:sz="1"/>
+              <w:right w:val="single" w:color="CCCCCC" w:sz="1"/>
+            </w:tcBorders>
+            <w:shd w:fill="FFFFFF" w:val="clear"/>
+            <w:tcMar>
+              <w:top w:type="dxa" w:w="80"/>
+              <w:left w:type="dxa" w:w="120"/>
+              <w:bottom w:type="dxa" w:w="80"/>
+              <w:right w:type="dxa" w:w="120"/>
+            </w:tcMar>
+            <w:vAlign w:val="center"/>
+          </w:tcPr>
+          <w:p>
+            <w:r>
+              <w:rPr>
+                <w:rFonts w:ascii="Arial" w:cs="Arial" w:eastAsia="Arial" w:hAnsi="Arial"/>
+                <w:b w:val="false"/>
+                <w:bCs w:val="false"/>
+                <w:color w:val="000000"/>
+                <w:sz w:val="18"/>
+                <w:szCs w:val="18"/>
+              </w:rPr>
+              <w:t xml:space="preserve">28.86</w:t>
+            </w:r>
+          </w:p>
+        </w:tc>
+        <w:tc>
+          <w:tcPr>
+            <w:tcW w:type="dxa" w:w="600"/>
+            <w:tcBorders>
+              <w:top w:val="single" w:color="CCCCCC" w:sz="1"/>
+              <w:left w:val="single" w:color="CCCCCC" w:sz="1"/>
+              <w:bottom w:val="single" w:color="CCCCCC" w:sz="1"/>
+              <w:right w:val="single" w:color="CCCCCC" w:sz="1"/>
+            </w:tcBorders>
+            <w:shd w:fill="FFFFFF" w:val="clear"/>
+            <w:tcMar>
+              <w:top w:type="dxa" w:w="80"/>
+              <w:left w:type="dxa" w:w="120"/>
+              <w:bottom w:type="dxa" w:w="80"/>
+              <w:right w:type="dxa" w:w="120"/>
+            </w:tcMar>
+            <w:vAlign w:val="center"/>
+          </w:tcPr>
+          <w:p>
+            <w:r>
+              <w:rPr>
+                <w:rFonts w:ascii="Arial" w:cs="Arial" w:eastAsia="Arial" w:hAnsi="Arial"/>
+                <w:b w:val="false"/>
+                <w:bCs w:val="false"/>
+                <w:color w:val="000000"/>
+                <w:sz w:val="18"/>
+                <w:szCs w:val="18"/>
+              </w:rPr>
+              <w:t xml:space="preserve">0</w:t>
+            </w:r>
+          </w:p>
+        </w:tc>
+        <w:tc>
+          <w:tcPr>
+            <w:tcW w:type="dxa" w:w="1500"/>
+            <w:tcBorders>
+              <w:top w:val="single" w:color="CCCCCC" w:sz="1"/>
+              <w:left w:val="single" w:color="CCCCCC" w:sz="1"/>
+              <w:bottom w:val="single" w:color="CCCCCC" w:sz="1"/>
+              <w:right w:val="single" w:color="CCCCCC" w:sz="1"/>
+            </w:tcBorders>
+            <w:shd w:fill="FFFFFF" w:val="clear"/>
+            <w:tcMar>
+              <w:top w:type="dxa" w:w="80"/>
+              <w:left w:type="dxa" w:w="120"/>
+              <w:bottom w:type="dxa" w:w="80"/>
+              <w:right w:type="dxa" w:w="120"/>
+            </w:tcMar>
+            <w:vAlign w:val="center"/>
+          </w:tcPr>
+          <w:p>
+            <w:r>
+              <w:rPr>
+                <w:rFonts w:ascii="Arial" w:cs="Arial" w:eastAsia="Arial" w:hAnsi="Arial"/>
+                <w:b w:val="false"/>
+                <w:bCs w:val="false"/>
+                <w:color w:val="000000"/>
+                <w:sz w:val="18"/>
+                <w:szCs w:val="18"/>
+              </w:rPr>
+              <w:t xml:space="preserve">Wider batch HURTS: TTFT 59% worse (2205 vs 1390ms), throughput 25% lower. Larger batch steps slow each decode iteration. Default seq32/b4096 is optimal.</w:t>
+            </w:r>
+          </w:p>
+        </w:tc>
+      </w:tr>
     </w:tbl>
     <w:p>
       <w:pPr>
@@ -2566,7 +4366,58 @@
           <w:sz w:val="22"/>
           <w:szCs w:val="22"/>
         </w:rPr>
-        <w:t xml:space="preserve">0 errors throughout all experiments — system is stable up to 400 concurrent users.</w:t>
+        <w:t xml:space="preserve">0 errors throughout all experiments — system stable up to 400 concurrent users.</w:t>
+      </w:r>
+    </w:p>
+    <w:p>
+      <w:pPr>
+        <w:pStyle w:val="ListParagraph"/>
+        <w:numPr>
+          <w:ilvl w:val="0"/>
+          <w:numId w:val="2"/>
+        </w:numPr>
+      </w:pPr>
+      <w:r>
+        <w:rPr>
+          <w:rFonts w:ascii="Arial" w:cs="Arial" w:eastAsia="Arial" w:hAnsi="Arial"/>
+          <w:sz w:val="22"/>
+          <w:szCs w:val="22"/>
+        </w:rPr>
+        <w:t xml:space="preserve">Saturation knee at ~100-200 users per replica — TTFT jumps 4x beyond that point while ITL stays flat.</w:t>
+      </w:r>
+    </w:p>
+    <w:p>
+      <w:pPr>
+        <w:pStyle w:val="ListParagraph"/>
+        <w:numPr>
+          <w:ilvl w:val="0"/>
+          <w:numId w:val="2"/>
+        </w:numPr>
+      </w:pPr>
+      <w:r>
+        <w:rPr>
+          <w:rFonts w:ascii="Arial" w:cs="Arial" w:eastAsia="Arial" w:hAnsi="Arial"/>
+          <w:sz w:val="22"/>
+          <w:szCs w:val="22"/>
+        </w:rPr>
+        <w:t xml:space="preserve">Wider batch knobs (seq64/b8192) hurt performance — larger decode steps slow TTFT by 59%.</w:t>
+      </w:r>
+    </w:p>
+    <w:p>
+      <w:pPr>
+        <w:pStyle w:val="ListParagraph"/>
+        <w:numPr>
+          <w:ilvl w:val="0"/>
+          <w:numId w:val="2"/>
+        </w:numPr>
+      </w:pPr>
+      <w:r>
+        <w:rPr>
+          <w:rFonts w:ascii="Arial" w:cs="Arial" w:eastAsia="Arial" w:hAnsi="Arial"/>
+          <w:sz w:val="22"/>
+          <w:szCs w:val="22"/>
+        </w:rPr>
+        <w:t xml:space="preserve">Chunked prefill has negligible effect on text workloads — no tradeoff either way.</w:t>
       </w:r>
     </w:p>
     <w:p>
@@ -2609,7 +4460,7 @@
           <w:sz w:val="22"/>
           <w:szCs w:val="22"/>
         </w:rPr>
-        <w:t xml:space="preserve">More users: find where p95 latency bends (stress test single replica)</w:t>
+        <w:t xml:space="preserve">✓ More users: saturation knee found at 100-200 users/replica</w:t>
       </w:r>
     </w:p>
     <w:p>
@@ -2626,7 +4477,7 @@
           <w:sz w:val="22"/>
           <w:szCs w:val="22"/>
         </w:rPr>
-        <w:t xml:space="preserve">Prefix caching: on vs off comparison</w:t>
+        <w:t xml:space="preserve">✓ Prefix caching: ON wins by 32% TTFT — keep ON</w:t>
       </w:r>
     </w:p>
     <w:p>
@@ -2643,7 +4494,7 @@
           <w:sz w:val="22"/>
           <w:szCs w:val="22"/>
         </w:rPr>
-        <w:t xml:space="preserve">Chunked prefill: on vs off comparison</w:t>
+        <w:t xml:space="preserve">✓ Chunked prefill: negligible for text — keep ON for free mixed-mode benefit</w:t>
       </w:r>
     </w:p>
     <w:p>
@@ -2660,7 +4511,7 @@
           <w:sz w:val="22"/>
           <w:szCs w:val="22"/>
         </w:rPr>
-        <w:t xml:space="preserve">Batch knobs: wider config (higher max_seqs or max_batch_tokens)</w:t>
+        <w:t xml:space="preserve">✓ Batch knobs: default seq32/b4096 beats wider config</w:t>
       </w:r>
     </w:p>
     <w:p>
@@ -2686,7 +4537,74 @@
         <w:spacing w:before="240"/>
       </w:pPr>
       <w:r>
-        <w:t xml:space="preserve">5. Reference Baselines (from Capstone Doc)</w:t>
+        <w:t xml:space="preserve">5. Roofline Plot — Performance Space</w:t>
+      </w:r>
+    </w:p>
+    <w:p>
+      <w:pPr>
+        <w:spacing w:after="80" w:before="80"/>
+      </w:pPr>
+      <w:r>
+        <w:rPr>
+          <w:rFonts w:ascii="Arial" w:cs="Arial" w:eastAsia="Arial" w:hAnsi="Arial"/>
+          <w:i/>
+          <w:iCs/>
+          <w:color w:val="595959"/>
+          <w:sz w:val="20"/>
+          <w:szCs w:val="20"/>
+        </w:rPr>
+        <w:t xml:space="preserve">Target: top-left corner (maximize throughput, minimize TTFT). Blue = compiled mode. Gray = ablations. Dashed red = capstone reference.</w:t>
+      </w:r>
+    </w:p>
+    <w:p>
+      <w:r>
+        <w:drawing>
+          <wp:inline distT="0" distB="0" distL="0" distR="0">
+            <wp:extent cx="5715000" cy="3571875"/>
+            <wp:effectExtent t="0" r="0" b="0" l="0"/>
+            <wp:docPr id="1" name="roofline" descr="Throughput vs TTFT p95 scatter plot for all experiments" title="Roofline plot"/>
+            <wp:cNvGraphicFramePr>
+              <a:graphicFrameLocks xmlns:a="http://schemas.openxmlformats.org/drawingml/2006/main" noChangeAspect="1"/>
+            </wp:cNvGraphicFramePr>
+            <a:graphic xmlns:a="http://schemas.openxmlformats.org/drawingml/2006/main">
+              <a:graphicData uri="http://schemas.openxmlformats.org/drawingml/2006/picture">
+                <pic:pic xmlns:pic="http://schemas.openxmlformats.org/drawingml/2006/picture">
+                  <pic:nvPicPr>
+                    <pic:cNvPr id="0" name="" descr=""/>
+                    <pic:cNvPicPr>
+                      <a:picLocks noChangeAspect="1" noChangeArrowheads="1"/>
+                    </pic:cNvPicPr>
+                  </pic:nvPicPr>
+                  <pic:blipFill>
+                    <a:blip r:embed="rId9" cstate="none"/>
+                    <a:srcRect/>
+                    <a:stretch>
+                      <a:fillRect/>
+                    </a:stretch>
+                  </pic:blipFill>
+                  <pic:spPr bwMode="auto">
+                    <a:xfrm>
+                      <a:off x="0" y="0"/>
+                      <a:ext cx="5715000" cy="3571875"/>
+                    </a:xfrm>
+                    <a:prstGeom prst="rect">
+                      <a:avLst/>
+                    </a:prstGeom>
+                  </pic:spPr>
+                </pic:pic>
+              </a:graphicData>
+            </a:graphic>
+          </wp:inline>
+        </w:drawing>
+      </w:r>
+    </w:p>
+    <w:p>
+      <w:pPr>
+        <w:pStyle w:val="Heading2"/>
+        <w:spacing w:before="240"/>
+      </w:pPr>
+      <w:r>
+        <w:t xml:space="preserve">6. Reference Baselines (from Capstone Doc)</w:t>
       </w:r>
     </w:p>
     <w:tbl>

</xml_diff>

<commit_message>
Add final submission summary and complete experiment log
</commit_message>
<xml_diff>
--- a/InferTutor_Experiments.docx
+++ b/InferTutor_Experiments.docx
@@ -4220,6 +4220,456 @@
                 <w:szCs w:val="18"/>
               </w:rPr>
               <w:t xml:space="preserve">Wider batch HURTS: TTFT 59% worse (2205 vs 1390ms), throughput 25% lower. Larger batch steps slow each decode iteration. Default seq32/b4096 is optimal.</w:t>
+            </w:r>
+          </w:p>
+        </w:tc>
+      </w:tr>
+      <w:tr>
+        <w:tc>
+          <w:tcPr>
+            <w:tcW w:type="dxa" w:w="900"/>
+            <w:tcBorders>
+              <w:top w:val="single" w:color="CCCCCC" w:sz="1"/>
+              <w:left w:val="single" w:color="CCCCCC" w:sz="1"/>
+              <w:bottom w:val="single" w:color="CCCCCC" w:sz="1"/>
+              <w:right w:val="single" w:color="CCCCCC" w:sz="1"/>
+            </w:tcBorders>
+            <w:shd w:fill="FFFFFF" w:val="clear"/>
+            <w:tcMar>
+              <w:top w:type="dxa" w:w="80"/>
+              <w:left w:type="dxa" w:w="120"/>
+              <w:bottom w:type="dxa" w:w="80"/>
+              <w:right w:type="dxa" w:w="120"/>
+            </w:tcMar>
+            <w:vAlign w:val="center"/>
+          </w:tcPr>
+          <w:p>
+            <w:r>
+              <w:rPr>
+                <w:rFonts w:ascii="Arial" w:cs="Arial" w:eastAsia="Arial" w:hAnsi="Arial"/>
+                <w:b w:val="false"/>
+                <w:bCs w:val="false"/>
+                <w:color w:val="000000"/>
+                <w:sz w:val="18"/>
+                <w:szCs w:val="18"/>
+              </w:rPr>
+              <w:t xml:space="preserve">Final Attempt (500u)</w:t>
+            </w:r>
+          </w:p>
+        </w:tc>
+        <w:tc>
+          <w:tcPr>
+            <w:tcW w:type="dxa" w:w="1400"/>
+            <w:tcBorders>
+              <w:top w:val="single" w:color="CCCCCC" w:sz="1"/>
+              <w:left w:val="single" w:color="CCCCCC" w:sz="1"/>
+              <w:bottom w:val="single" w:color="CCCCCC" w:sz="1"/>
+              <w:right w:val="single" w:color="CCCCCC" w:sz="1"/>
+            </w:tcBorders>
+            <w:shd w:fill="FFFFFF" w:val="clear"/>
+            <w:tcMar>
+              <w:top w:type="dxa" w:w="80"/>
+              <w:left w:type="dxa" w:w="120"/>
+              <w:bottom w:type="dxa" w:w="80"/>
+              <w:right w:type="dxa" w:w="120"/>
+            </w:tcMar>
+            <w:vAlign w:val="center"/>
+          </w:tcPr>
+          <w:p>
+            <w:r>
+              <w:rPr>
+                <w:rFonts w:ascii="Arial" w:cs="Arial" w:eastAsia="Arial" w:hAnsi="Arial"/>
+                <w:b w:val="false"/>
+                <w:bCs w:val="false"/>
+                <w:color w:val="000000"/>
+                <w:sz w:val="18"/>
+                <w:szCs w:val="18"/>
+              </w:rPr>
+              <w:t xml:space="preserve">final-best</w:t>
+            </w:r>
+          </w:p>
+        </w:tc>
+        <w:tc>
+          <w:tcPr>
+            <w:tcW w:type="dxa" w:w="500"/>
+            <w:tcBorders>
+              <w:top w:val="single" w:color="CCCCCC" w:sz="1"/>
+              <w:left w:val="single" w:color="CCCCCC" w:sz="1"/>
+              <w:bottom w:val="single" w:color="CCCCCC" w:sz="1"/>
+              <w:right w:val="single" w:color="CCCCCC" w:sz="1"/>
+            </w:tcBorders>
+            <w:shd w:fill="FFFFFF" w:val="clear"/>
+            <w:tcMar>
+              <w:top w:type="dxa" w:w="80"/>
+              <w:left w:type="dxa" w:w="120"/>
+              <w:bottom w:type="dxa" w:w="80"/>
+              <w:right w:type="dxa" w:w="120"/>
+            </w:tcMar>
+            <w:vAlign w:val="center"/>
+          </w:tcPr>
+          <w:p>
+            <w:r>
+              <w:rPr>
+                <w:rFonts w:ascii="Arial" w:cs="Arial" w:eastAsia="Arial" w:hAnsi="Arial"/>
+                <w:b w:val="false"/>
+                <w:bCs w:val="false"/>
+                <w:color w:val="000000"/>
+                <w:sz w:val="18"/>
+                <w:szCs w:val="18"/>
+              </w:rPr>
+              <w:t xml:space="preserve">4</w:t>
+            </w:r>
+          </w:p>
+        </w:tc>
+        <w:tc>
+          <w:tcPr>
+            <w:tcW w:type="dxa" w:w="500"/>
+            <w:tcBorders>
+              <w:top w:val="single" w:color="CCCCCC" w:sz="1"/>
+              <w:left w:val="single" w:color="CCCCCC" w:sz="1"/>
+              <w:bottom w:val="single" w:color="CCCCCC" w:sz="1"/>
+              <w:right w:val="single" w:color="CCCCCC" w:sz="1"/>
+            </w:tcBorders>
+            <w:shd w:fill="FFFFFF" w:val="clear"/>
+            <w:tcMar>
+              <w:top w:type="dxa" w:w="80"/>
+              <w:left w:type="dxa" w:w="120"/>
+              <w:bottom w:type="dxa" w:w="80"/>
+              <w:right w:type="dxa" w:w="120"/>
+            </w:tcMar>
+            <w:vAlign w:val="center"/>
+          </w:tcPr>
+          <w:p>
+            <w:r>
+              <w:rPr>
+                <w:rFonts w:ascii="Arial" w:cs="Arial" w:eastAsia="Arial" w:hAnsi="Arial"/>
+                <w:b w:val="false"/>
+                <w:bCs w:val="false"/>
+                <w:color w:val="000000"/>
+                <w:sz w:val="18"/>
+                <w:szCs w:val="18"/>
+              </w:rPr>
+              <w:t xml:space="preserve">text</w:t>
+            </w:r>
+          </w:p>
+        </w:tc>
+        <w:tc>
+          <w:tcPr>
+            <w:tcW w:type="dxa" w:w="500"/>
+            <w:tcBorders>
+              <w:top w:val="single" w:color="CCCCCC" w:sz="1"/>
+              <w:left w:val="single" w:color="CCCCCC" w:sz="1"/>
+              <w:bottom w:val="single" w:color="CCCCCC" w:sz="1"/>
+              <w:right w:val="single" w:color="CCCCCC" w:sz="1"/>
+            </w:tcBorders>
+            <w:shd w:fill="FFFFFF" w:val="clear"/>
+            <w:tcMar>
+              <w:top w:type="dxa" w:w="80"/>
+              <w:left w:type="dxa" w:w="120"/>
+              <w:bottom w:type="dxa" w:w="80"/>
+              <w:right w:type="dxa" w:w="120"/>
+            </w:tcMar>
+            <w:vAlign w:val="center"/>
+          </w:tcPr>
+          <w:p>
+            <w:r>
+              <w:rPr>
+                <w:rFonts w:ascii="Arial" w:cs="Arial" w:eastAsia="Arial" w:hAnsi="Arial"/>
+                <w:b w:val="false"/>
+                <w:bCs w:val="false"/>
+                <w:color w:val="000000"/>
+                <w:sz w:val="18"/>
+                <w:szCs w:val="18"/>
+              </w:rPr>
+              <w:t xml:space="preserve">500</w:t>
+            </w:r>
+          </w:p>
+        </w:tc>
+        <w:tc>
+          <w:tcPr>
+            <w:tcW w:type="dxa" w:w="700"/>
+            <w:tcBorders>
+              <w:top w:val="single" w:color="CCCCCC" w:sz="1"/>
+              <w:left w:val="single" w:color="CCCCCC" w:sz="1"/>
+              <w:bottom w:val="single" w:color="CCCCCC" w:sz="1"/>
+              <w:right w:val="single" w:color="CCCCCC" w:sz="1"/>
+            </w:tcBorders>
+            <w:shd w:fill="FFFFFF" w:val="clear"/>
+            <w:tcMar>
+              <w:top w:type="dxa" w:w="80"/>
+              <w:left w:type="dxa" w:w="120"/>
+              <w:bottom w:type="dxa" w:w="80"/>
+              <w:right w:type="dxa" w:w="120"/>
+            </w:tcMar>
+            <w:vAlign w:val="center"/>
+          </w:tcPr>
+          <w:p>
+            <w:r>
+              <w:rPr>
+                <w:rFonts w:ascii="Arial" w:cs="Arial" w:eastAsia="Arial" w:hAnsi="Arial"/>
+                <w:b w:val="false"/>
+                <w:bCs w:val="false"/>
+                <w:color w:val="000000"/>
+                <w:sz w:val="18"/>
+                <w:szCs w:val="18"/>
+              </w:rPr>
+              <w:t xml:space="preserve">false</w:t>
+            </w:r>
+          </w:p>
+        </w:tc>
+        <w:tc>
+          <w:tcPr>
+            <w:tcW w:type="dxa" w:w="600"/>
+            <w:tcBorders>
+              <w:top w:val="single" w:color="CCCCCC" w:sz="1"/>
+              <w:left w:val="single" w:color="CCCCCC" w:sz="1"/>
+              <w:bottom w:val="single" w:color="CCCCCC" w:sz="1"/>
+              <w:right w:val="single" w:color="CCCCCC" w:sz="1"/>
+            </w:tcBorders>
+            <w:shd w:fill="FFFFFF" w:val="clear"/>
+            <w:tcMar>
+              <w:top w:type="dxa" w:w="80"/>
+              <w:left w:type="dxa" w:w="120"/>
+              <w:bottom w:type="dxa" w:w="80"/>
+              <w:right w:type="dxa" w:w="120"/>
+            </w:tcMar>
+            <w:vAlign w:val="center"/>
+          </w:tcPr>
+          <w:p>
+            <w:r>
+              <w:rPr>
+                <w:rFonts w:ascii="Arial" w:cs="Arial" w:eastAsia="Arial" w:hAnsi="Arial"/>
+                <w:b w:val="false"/>
+                <w:bCs w:val="false"/>
+                <w:color w:val="000000"/>
+                <w:sz w:val="18"/>
+                <w:szCs w:val="18"/>
+              </w:rPr>
+              <w:t xml:space="preserve">32</w:t>
+            </w:r>
+          </w:p>
+        </w:tc>
+        <w:tc>
+          <w:tcPr>
+            <w:tcW w:type="dxa" w:w="800"/>
+            <w:tcBorders>
+              <w:top w:val="single" w:color="CCCCCC" w:sz="1"/>
+              <w:left w:val="single" w:color="CCCCCC" w:sz="1"/>
+              <w:bottom w:val="single" w:color="CCCCCC" w:sz="1"/>
+              <w:right w:val="single" w:color="CCCCCC" w:sz="1"/>
+            </w:tcBorders>
+            <w:shd w:fill="FFFFFF" w:val="clear"/>
+            <w:tcMar>
+              <w:top w:type="dxa" w:w="80"/>
+              <w:left w:type="dxa" w:w="120"/>
+              <w:bottom w:type="dxa" w:w="80"/>
+              <w:right w:type="dxa" w:w="120"/>
+            </w:tcMar>
+            <w:vAlign w:val="center"/>
+          </w:tcPr>
+          <w:p>
+            <w:r>
+              <w:rPr>
+                <w:rFonts w:ascii="Arial" w:cs="Arial" w:eastAsia="Arial" w:hAnsi="Arial"/>
+                <w:b w:val="false"/>
+                <w:bCs w:val="false"/>
+                <w:color w:val="000000"/>
+                <w:sz w:val="18"/>
+                <w:szCs w:val="18"/>
+              </w:rPr>
+              <w:t xml:space="preserve">4096</w:t>
+            </w:r>
+          </w:p>
+        </w:tc>
+        <w:tc>
+          <w:tcPr>
+            <w:tcW w:type="dxa" w:w="800"/>
+            <w:tcBorders>
+              <w:top w:val="single" w:color="CCCCCC" w:sz="1"/>
+              <w:left w:val="single" w:color="CCCCCC" w:sz="1"/>
+              <w:bottom w:val="single" w:color="CCCCCC" w:sz="1"/>
+              <w:right w:val="single" w:color="CCCCCC" w:sz="1"/>
+            </w:tcBorders>
+            <w:shd w:fill="FFFFFF" w:val="clear"/>
+            <w:tcMar>
+              <w:top w:type="dxa" w:w="80"/>
+              <w:left w:type="dxa" w:w="120"/>
+              <w:bottom w:type="dxa" w:w="80"/>
+              <w:right w:type="dxa" w:w="120"/>
+            </w:tcMar>
+            <w:vAlign w:val="center"/>
+          </w:tcPr>
+          <w:p>
+            <w:r>
+              <w:rPr>
+                <w:rFonts w:ascii="Arial" w:cs="Arial" w:eastAsia="Arial" w:hAnsi="Arial"/>
+                <w:b w:val="false"/>
+                <w:bCs w:val="false"/>
+                <w:color w:val="000000"/>
+                <w:sz w:val="18"/>
+                <w:szCs w:val="18"/>
+              </w:rPr>
+              <w:t xml:space="preserve">2724.3</w:t>
+            </w:r>
+          </w:p>
+        </w:tc>
+        <w:tc>
+          <w:tcPr>
+            <w:tcW w:type="dxa" w:w="700"/>
+            <w:tcBorders>
+              <w:top w:val="single" w:color="CCCCCC" w:sz="1"/>
+              <w:left w:val="single" w:color="CCCCCC" w:sz="1"/>
+              <w:bottom w:val="single" w:color="CCCCCC" w:sz="1"/>
+              <w:right w:val="single" w:color="CCCCCC" w:sz="1"/>
+            </w:tcBorders>
+            <w:shd w:fill="FFFFFF" w:val="clear"/>
+            <w:tcMar>
+              <w:top w:type="dxa" w:w="80"/>
+              <w:left w:type="dxa" w:w="120"/>
+              <w:bottom w:type="dxa" w:w="80"/>
+              <w:right w:type="dxa" w:w="120"/>
+            </w:tcMar>
+            <w:vAlign w:val="center"/>
+          </w:tcPr>
+          <w:p>
+            <w:r>
+              <w:rPr>
+                <w:rFonts w:ascii="Arial" w:cs="Arial" w:eastAsia="Arial" w:hAnsi="Arial"/>
+                <w:b w:val="false"/>
+                <w:bCs w:val="false"/>
+                <w:color w:val="000000"/>
+                <w:sz w:val="18"/>
+                <w:szCs w:val="18"/>
+              </w:rPr>
+              <w:t xml:space="preserve">6.3</w:t>
+            </w:r>
+          </w:p>
+        </w:tc>
+        <w:tc>
+          <w:tcPr>
+            <w:tcW w:type="dxa" w:w="900"/>
+            <w:tcBorders>
+              <w:top w:val="single" w:color="CCCCCC" w:sz="1"/>
+              <w:left w:val="single" w:color="CCCCCC" w:sz="1"/>
+              <w:bottom w:val="single" w:color="CCCCCC" w:sz="1"/>
+              <w:right w:val="single" w:color="CCCCCC" w:sz="1"/>
+            </w:tcBorders>
+            <w:shd w:fill="FFFFFF" w:val="clear"/>
+            <w:tcMar>
+              <w:top w:type="dxa" w:w="80"/>
+              <w:left w:type="dxa" w:w="120"/>
+              <w:bottom w:type="dxa" w:w="80"/>
+              <w:right w:type="dxa" w:w="120"/>
+            </w:tcMar>
+            <w:vAlign w:val="center"/>
+          </w:tcPr>
+          <w:p>
+            <w:r>
+              <w:rPr>
+                <w:rFonts w:ascii="Arial" w:cs="Arial" w:eastAsia="Arial" w:hAnsi="Arial"/>
+                <w:b w:val="false"/>
+                <w:bCs w:val="false"/>
+                <w:color w:val="000000"/>
+                <w:sz w:val="18"/>
+                <w:szCs w:val="18"/>
+              </w:rPr>
+              <w:t xml:space="preserve">11269.1</w:t>
+            </w:r>
+          </w:p>
+        </w:tc>
+        <w:tc>
+          <w:tcPr>
+            <w:tcW w:type="dxa" w:w="600"/>
+            <w:tcBorders>
+              <w:top w:val="single" w:color="CCCCCC" w:sz="1"/>
+              <w:left w:val="single" w:color="CCCCCC" w:sz="1"/>
+              <w:bottom w:val="single" w:color="CCCCCC" w:sz="1"/>
+              <w:right w:val="single" w:color="CCCCCC" w:sz="1"/>
+            </w:tcBorders>
+            <w:shd w:fill="FFFFFF" w:val="clear"/>
+            <w:tcMar>
+              <w:top w:type="dxa" w:w="80"/>
+              <w:left w:type="dxa" w:w="120"/>
+              <w:bottom w:type="dxa" w:w="80"/>
+              <w:right w:type="dxa" w:w="120"/>
+            </w:tcMar>
+            <w:vAlign w:val="center"/>
+          </w:tcPr>
+          <w:p>
+            <w:r>
+              <w:rPr>
+                <w:rFonts w:ascii="Arial" w:cs="Arial" w:eastAsia="Arial" w:hAnsi="Arial"/>
+                <w:b w:val="false"/>
+                <w:bCs w:val="false"/>
+                <w:color w:val="000000"/>
+                <w:sz w:val="18"/>
+                <w:szCs w:val="18"/>
+              </w:rPr>
+              <w:t xml:space="preserve">118.46</w:t>
+            </w:r>
+          </w:p>
+        </w:tc>
+        <w:tc>
+          <w:tcPr>
+            <w:tcW w:type="dxa" w:w="600"/>
+            <w:tcBorders>
+              <w:top w:val="single" w:color="CCCCCC" w:sz="1"/>
+              <w:left w:val="single" w:color="CCCCCC" w:sz="1"/>
+              <w:bottom w:val="single" w:color="CCCCCC" w:sz="1"/>
+              <w:right w:val="single" w:color="CCCCCC" w:sz="1"/>
+            </w:tcBorders>
+            <w:shd w:fill="FFFFFF" w:val="clear"/>
+            <w:tcMar>
+              <w:top w:type="dxa" w:w="80"/>
+              <w:left w:type="dxa" w:w="120"/>
+              <w:bottom w:type="dxa" w:w="80"/>
+              <w:right w:type="dxa" w:w="120"/>
+            </w:tcMar>
+            <w:vAlign w:val="center"/>
+          </w:tcPr>
+          <w:p>
+            <w:r>
+              <w:rPr>
+                <w:rFonts w:ascii="Arial" w:cs="Arial" w:eastAsia="Arial" w:hAnsi="Arial"/>
+                <w:b w:val="false"/>
+                <w:bCs w:val="false"/>
+                <w:color w:val="000000"/>
+                <w:sz w:val="18"/>
+                <w:szCs w:val="18"/>
+              </w:rPr>
+              <w:t xml:space="preserve">64</w:t>
+            </w:r>
+          </w:p>
+        </w:tc>
+        <w:tc>
+          <w:tcPr>
+            <w:tcW w:type="dxa" w:w="1500"/>
+            <w:tcBorders>
+              <w:top w:val="single" w:color="CCCCCC" w:sz="1"/>
+              <w:left w:val="single" w:color="CCCCCC" w:sz="1"/>
+              <w:bottom w:val="single" w:color="CCCCCC" w:sz="1"/>
+              <w:right w:val="single" w:color="CCCCCC" w:sz="1"/>
+            </w:tcBorders>
+            <w:shd w:fill="FFFFFF" w:val="clear"/>
+            <w:tcMar>
+              <w:top w:type="dxa" w:w="80"/>
+              <w:left w:type="dxa" w:w="120"/>
+              <w:bottom w:type="dxa" w:w="80"/>
+              <w:right w:type="dxa" w:w="120"/>
+            </w:tcMar>
+            <w:vAlign w:val="center"/>
+          </w:tcPr>
+          <w:p>
+            <w:r>
+              <w:rPr>
+                <w:rFonts w:ascii="Arial" w:cs="Arial" w:eastAsia="Arial" w:hAnsi="Arial"/>
+                <w:b w:val="false"/>
+                <w:bCs w:val="false"/>
+                <w:color w:val="000000"/>
+                <w:sz w:val="18"/>
+                <w:szCs w:val="18"/>
+              </w:rPr>
+              <w:t xml:space="preserve">64 errors at 500 users — over capacity. Score penalty from errors makes this worse than r4-400u. Confirmed compiled-r4 at 400u is the optimal clean submission.</w:t>
             </w:r>
           </w:p>
         </w:tc>
@@ -4528,7 +4978,7 @@
           <w:sz w:val="22"/>
           <w:szCs w:val="22"/>
         </w:rPr>
-        <w:t xml:space="preserve">Final best run: optimized submission config</w:t>
+        <w:t xml:space="preserve">✓ Final best run: compiled-text-r4 at 400 users — 13,845 chunks/s, 0 errors, TTFT 1258ms</w:t>
       </w:r>
     </w:p>
     <w:p>
@@ -4537,7 +4987,709 @@
         <w:spacing w:before="240"/>
       </w:pPr>
       <w:r>
-        <w:t xml:space="preserve">5. Roofline Plot — Performance Space</w:t>
+        <w:t xml:space="preserve">5. Final Submission</w:t>
+      </w:r>
+    </w:p>
+    <w:p>
+      <w:pPr>
+        <w:spacing w:before="80"/>
+      </w:pPr>
+      <w:r>
+        <w:rPr>
+          <w:rFonts w:ascii="Arial" w:cs="Arial" w:eastAsia="Arial" w:hAnsi="Arial"/>
+          <w:b/>
+          <w:bCs/>
+          <w:sz w:val="22"/>
+          <w:szCs w:val="22"/>
+        </w:rPr>
+        <w:t xml:space="preserve">Best configuration: compiled-text-r4 (400 users, 4 replicas, compiled mode, prefix cache ON, chunked prefill ON, seq32/b4096)</w:t>
+      </w:r>
+    </w:p>
+    <w:tbl>
+      <w:tblPr>
+        <w:tblW w:type="dxa" w:w="6000"/>
+        <w:tblBorders>
+          <w:top w:val="single" w:color="auto" w:sz="4"/>
+          <w:left w:val="single" w:color="auto" w:sz="4"/>
+          <w:bottom w:val="single" w:color="auto" w:sz="4"/>
+          <w:right w:val="single" w:color="auto" w:sz="4"/>
+          <w:insideH w:val="single" w:color="auto" w:sz="4"/>
+          <w:insideV w:val="single" w:color="auto" w:sz="4"/>
+        </w:tblBorders>
+      </w:tblPr>
+      <w:tblGrid>
+        <w:gridCol w:w="2400"/>
+        <w:gridCol w:w="3600"/>
+      </w:tblGrid>
+      <w:tr>
+        <w:tc>
+          <w:tcPr>
+            <w:tcW w:type="dxa" w:w="2400"/>
+            <w:tcBorders>
+              <w:top w:val="single" w:color="2E75B6" w:sz="1"/>
+              <w:left w:val="single" w:color="2E75B6" w:sz="1"/>
+              <w:bottom w:val="single" w:color="2E75B6" w:sz="1"/>
+              <w:right w:val="single" w:color="2E75B6" w:sz="1"/>
+            </w:tcBorders>
+            <w:shd w:fill="2E75B6" w:val="clear"/>
+            <w:tcMar>
+              <w:top w:type="dxa" w:w="80"/>
+              <w:left w:type="dxa" w:w="120"/>
+              <w:bottom w:type="dxa" w:w="80"/>
+              <w:right w:type="dxa" w:w="120"/>
+            </w:tcMar>
+            <w:vAlign w:val="center"/>
+          </w:tcPr>
+          <w:p>
+            <w:r>
+              <w:rPr>
+                <w:rFonts w:ascii="Arial" w:cs="Arial" w:eastAsia="Arial" w:hAnsi="Arial"/>
+                <w:b/>
+                <w:bCs/>
+                <w:color w:val="FFFFFF"/>
+                <w:sz w:val="18"/>
+                <w:szCs w:val="18"/>
+              </w:rPr>
+              <w:t xml:space="preserve">Metric</w:t>
+            </w:r>
+          </w:p>
+        </w:tc>
+        <w:tc>
+          <w:tcPr>
+            <w:tcW w:type="dxa" w:w="3600"/>
+            <w:tcBorders>
+              <w:top w:val="single" w:color="2E75B6" w:sz="1"/>
+              <w:left w:val="single" w:color="2E75B6" w:sz="1"/>
+              <w:bottom w:val="single" w:color="2E75B6" w:sz="1"/>
+              <w:right w:val="single" w:color="2E75B6" w:sz="1"/>
+            </w:tcBorders>
+            <w:shd w:fill="2E75B6" w:val="clear"/>
+            <w:tcMar>
+              <w:top w:type="dxa" w:w="80"/>
+              <w:left w:type="dxa" w:w="120"/>
+              <w:bottom w:type="dxa" w:w="80"/>
+              <w:right w:type="dxa" w:w="120"/>
+            </w:tcMar>
+            <w:vAlign w:val="center"/>
+          </w:tcPr>
+          <w:p>
+            <w:r>
+              <w:rPr>
+                <w:rFonts w:ascii="Arial" w:cs="Arial" w:eastAsia="Arial" w:hAnsi="Arial"/>
+                <w:b/>
+                <w:bCs/>
+                <w:color w:val="FFFFFF"/>
+                <w:sz w:val="18"/>
+                <w:szCs w:val="18"/>
+              </w:rPr>
+              <w:t xml:space="preserve">Value</w:t>
+            </w:r>
+          </w:p>
+        </w:tc>
+      </w:tr>
+      <w:tr>
+        <w:tc>
+          <w:tcPr>
+            <w:tcW w:type="dxa" w:w="2400"/>
+            <w:tcBorders>
+              <w:top w:val="single" w:color="CCCCCC" w:sz="1"/>
+              <w:left w:val="single" w:color="CCCCCC" w:sz="1"/>
+              <w:bottom w:val="single" w:color="CCCCCC" w:sz="1"/>
+              <w:right w:val="single" w:color="CCCCCC" w:sz="1"/>
+            </w:tcBorders>
+            <w:shd w:fill="FFFFFF" w:val="clear"/>
+            <w:tcMar>
+              <w:top w:type="dxa" w:w="80"/>
+              <w:left w:type="dxa" w:w="120"/>
+              <w:bottom w:type="dxa" w:w="80"/>
+              <w:right w:type="dxa" w:w="120"/>
+            </w:tcMar>
+            <w:vAlign w:val="center"/>
+          </w:tcPr>
+          <w:p>
+            <w:r>
+              <w:rPr>
+                <w:rFonts w:ascii="Arial" w:cs="Arial" w:eastAsia="Arial" w:hAnsi="Arial"/>
+                <w:b w:val="false"/>
+                <w:bCs w:val="false"/>
+                <w:color w:val="000000"/>
+                <w:sz w:val="18"/>
+                <w:szCs w:val="18"/>
+              </w:rPr>
+              <w:t xml:space="preserve">Final Score Formula</w:t>
+            </w:r>
+          </w:p>
+        </w:tc>
+        <w:tc>
+          <w:tcPr>
+            <w:tcW w:type="dxa" w:w="3600"/>
+            <w:tcBorders>
+              <w:top w:val="single" w:color="CCCCCC" w:sz="1"/>
+              <w:left w:val="single" w:color="CCCCCC" w:sz="1"/>
+              <w:bottom w:val="single" w:color="CCCCCC" w:sz="1"/>
+              <w:right w:val="single" w:color="CCCCCC" w:sz="1"/>
+            </w:tcBorders>
+            <w:shd w:fill="FFFFFF" w:val="clear"/>
+            <w:tcMar>
+              <w:top w:type="dxa" w:w="80"/>
+              <w:left w:type="dxa" w:w="120"/>
+              <w:bottom w:type="dxa" w:w="80"/>
+              <w:right w:type="dxa" w:w="120"/>
+            </w:tcMar>
+            <w:vAlign w:val="center"/>
+          </w:tcPr>
+          <w:p>
+            <w:r>
+              <w:rPr>
+                <w:rFonts w:ascii="Arial" w:cs="Arial" w:eastAsia="Arial" w:hAnsi="Arial"/>
+                <w:b w:val="false"/>
+                <w:bCs w:val="false"/>
+                <w:color w:val="000000"/>
+                <w:sz w:val="18"/>
+                <w:szCs w:val="18"/>
+              </w:rPr>
+              <w:t xml:space="preserve">goodput × users × quality × (1−err) / (TTFT_s × ITL_s × GPUs)</w:t>
+            </w:r>
+          </w:p>
+        </w:tc>
+      </w:tr>
+      <w:tr>
+        <w:tc>
+          <w:tcPr>
+            <w:tcW w:type="dxa" w:w="2400"/>
+            <w:tcBorders>
+              <w:top w:val="single" w:color="CCCCCC" w:sz="1"/>
+              <w:left w:val="single" w:color="CCCCCC" w:sz="1"/>
+              <w:bottom w:val="single" w:color="CCCCCC" w:sz="1"/>
+              <w:right w:val="single" w:color="CCCCCC" w:sz="1"/>
+            </w:tcBorders>
+            <w:shd w:fill="FFFFFF" w:val="clear"/>
+            <w:tcMar>
+              <w:top w:type="dxa" w:w="80"/>
+              <w:left w:type="dxa" w:w="120"/>
+              <w:bottom w:type="dxa" w:w="80"/>
+              <w:right w:type="dxa" w:w="120"/>
+            </w:tcMar>
+            <w:vAlign w:val="center"/>
+          </w:tcPr>
+          <w:p>
+            <w:r>
+              <w:rPr>
+                <w:rFonts w:ascii="Arial" w:cs="Arial" w:eastAsia="Arial" w:hAnsi="Arial"/>
+                <w:b w:val="false"/>
+                <w:bCs w:val="false"/>
+                <w:color w:val="000000"/>
+                <w:sz w:val="18"/>
+                <w:szCs w:val="18"/>
+              </w:rPr>
+              <w:t xml:space="preserve">Throughput</w:t>
+            </w:r>
+          </w:p>
+        </w:tc>
+        <w:tc>
+          <w:tcPr>
+            <w:tcW w:type="dxa" w:w="3600"/>
+            <w:tcBorders>
+              <w:top w:val="single" w:color="CCCCCC" w:sz="1"/>
+              <w:left w:val="single" w:color="CCCCCC" w:sz="1"/>
+              <w:bottom w:val="single" w:color="CCCCCC" w:sz="1"/>
+              <w:right w:val="single" w:color="CCCCCC" w:sz="1"/>
+            </w:tcBorders>
+            <w:shd w:fill="E2EFDA" w:val="clear"/>
+            <w:tcMar>
+              <w:top w:type="dxa" w:w="80"/>
+              <w:left w:type="dxa" w:w="120"/>
+              <w:bottom w:type="dxa" w:w="80"/>
+              <w:right w:type="dxa" w:w="120"/>
+            </w:tcMar>
+            <w:vAlign w:val="center"/>
+          </w:tcPr>
+          <w:p>
+            <w:r>
+              <w:rPr>
+                <w:rFonts w:ascii="Arial" w:cs="Arial" w:eastAsia="Arial" w:hAnsi="Arial"/>
+                <w:b w:val="false"/>
+                <w:bCs w:val="false"/>
+                <w:color w:val="000000"/>
+                <w:sz w:val="18"/>
+                <w:szCs w:val="18"/>
+              </w:rPr>
+              <w:t xml:space="preserve">13,845 chunks/s  (+25% vs reference)</w:t>
+            </w:r>
+          </w:p>
+        </w:tc>
+      </w:tr>
+      <w:tr>
+        <w:tc>
+          <w:tcPr>
+            <w:tcW w:type="dxa" w:w="2400"/>
+            <w:tcBorders>
+              <w:top w:val="single" w:color="CCCCCC" w:sz="1"/>
+              <w:left w:val="single" w:color="CCCCCC" w:sz="1"/>
+              <w:bottom w:val="single" w:color="CCCCCC" w:sz="1"/>
+              <w:right w:val="single" w:color="CCCCCC" w:sz="1"/>
+            </w:tcBorders>
+            <w:shd w:fill="FFFFFF" w:val="clear"/>
+            <w:tcMar>
+              <w:top w:type="dxa" w:w="80"/>
+              <w:left w:type="dxa" w:w="120"/>
+              <w:bottom w:type="dxa" w:w="80"/>
+              <w:right w:type="dxa" w:w="120"/>
+            </w:tcMar>
+            <w:vAlign w:val="center"/>
+          </w:tcPr>
+          <w:p>
+            <w:r>
+              <w:rPr>
+                <w:rFonts w:ascii="Arial" w:cs="Arial" w:eastAsia="Arial" w:hAnsi="Arial"/>
+                <w:b w:val="false"/>
+                <w:bCs w:val="false"/>
+                <w:color w:val="000000"/>
+                <w:sz w:val="18"/>
+                <w:szCs w:val="18"/>
+              </w:rPr>
+              <w:t xml:space="preserve">TTFT p95</w:t>
+            </w:r>
+          </w:p>
+        </w:tc>
+        <w:tc>
+          <w:tcPr>
+            <w:tcW w:type="dxa" w:w="3600"/>
+            <w:tcBorders>
+              <w:top w:val="single" w:color="CCCCCC" w:sz="1"/>
+              <w:left w:val="single" w:color="CCCCCC" w:sz="1"/>
+              <w:bottom w:val="single" w:color="CCCCCC" w:sz="1"/>
+              <w:right w:val="single" w:color="CCCCCC" w:sz="1"/>
+            </w:tcBorders>
+            <w:shd w:fill="E2EFDA" w:val="clear"/>
+            <w:tcMar>
+              <w:top w:type="dxa" w:w="80"/>
+              <w:left w:type="dxa" w:w="120"/>
+              <w:bottom w:type="dxa" w:w="80"/>
+              <w:right w:type="dxa" w:w="120"/>
+            </w:tcMar>
+            <w:vAlign w:val="center"/>
+          </w:tcPr>
+          <w:p>
+            <w:r>
+              <w:rPr>
+                <w:rFonts w:ascii="Arial" w:cs="Arial" w:eastAsia="Arial" w:hAnsi="Arial"/>
+                <w:b w:val="false"/>
+                <w:bCs w:val="false"/>
+                <w:color w:val="000000"/>
+                <w:sz w:val="18"/>
+                <w:szCs w:val="18"/>
+              </w:rPr>
+              <w:t xml:space="preserve">1,258 ms  (ref: 1,942 ms — 35% better)</w:t>
+            </w:r>
+          </w:p>
+        </w:tc>
+      </w:tr>
+      <w:tr>
+        <w:tc>
+          <w:tcPr>
+            <w:tcW w:type="dxa" w:w="2400"/>
+            <w:tcBorders>
+              <w:top w:val="single" w:color="CCCCCC" w:sz="1"/>
+              <w:left w:val="single" w:color="CCCCCC" w:sz="1"/>
+              <w:bottom w:val="single" w:color="CCCCCC" w:sz="1"/>
+              <w:right w:val="single" w:color="CCCCCC" w:sz="1"/>
+            </w:tcBorders>
+            <w:shd w:fill="FFFFFF" w:val="clear"/>
+            <w:tcMar>
+              <w:top w:type="dxa" w:w="80"/>
+              <w:left w:type="dxa" w:w="120"/>
+              <w:bottom w:type="dxa" w:w="80"/>
+              <w:right w:type="dxa" w:w="120"/>
+            </w:tcMar>
+            <w:vAlign w:val="center"/>
+          </w:tcPr>
+          <w:p>
+            <w:r>
+              <w:rPr>
+                <w:rFonts w:ascii="Arial" w:cs="Arial" w:eastAsia="Arial" w:hAnsi="Arial"/>
+                <w:b w:val="false"/>
+                <w:bCs w:val="false"/>
+                <w:color w:val="000000"/>
+                <w:sz w:val="18"/>
+                <w:szCs w:val="18"/>
+              </w:rPr>
+              <w:t xml:space="preserve">ITL p95</w:t>
+            </w:r>
+          </w:p>
+        </w:tc>
+        <w:tc>
+          <w:tcPr>
+            <w:tcW w:type="dxa" w:w="3600"/>
+            <w:tcBorders>
+              <w:top w:val="single" w:color="CCCCCC" w:sz="1"/>
+              <w:left w:val="single" w:color="CCCCCC" w:sz="1"/>
+              <w:bottom w:val="single" w:color="CCCCCC" w:sz="1"/>
+              <w:right w:val="single" w:color="CCCCCC" w:sz="1"/>
+            </w:tcBorders>
+            <w:shd w:fill="E2EFDA" w:val="clear"/>
+            <w:tcMar>
+              <w:top w:type="dxa" w:w="80"/>
+              <w:left w:type="dxa" w:w="120"/>
+              <w:bottom w:type="dxa" w:w="80"/>
+              <w:right w:type="dxa" w:w="120"/>
+            </w:tcMar>
+            <w:vAlign w:val="center"/>
+          </w:tcPr>
+          <w:p>
+            <w:r>
+              <w:rPr>
+                <w:rFonts w:ascii="Arial" w:cs="Arial" w:eastAsia="Arial" w:hAnsi="Arial"/>
+                <w:b w:val="false"/>
+                <w:bCs w:val="false"/>
+                <w:color w:val="000000"/>
+                <w:sz w:val="18"/>
+                <w:szCs w:val="18"/>
+              </w:rPr>
+              <w:t xml:space="preserve">5.7 ms  (ref: 16.2 ms — 65% better)</w:t>
+            </w:r>
+          </w:p>
+        </w:tc>
+      </w:tr>
+      <w:tr>
+        <w:tc>
+          <w:tcPr>
+            <w:tcW w:type="dxa" w:w="2400"/>
+            <w:tcBorders>
+              <w:top w:val="single" w:color="CCCCCC" w:sz="1"/>
+              <w:left w:val="single" w:color="CCCCCC" w:sz="1"/>
+              <w:bottom w:val="single" w:color="CCCCCC" w:sz="1"/>
+              <w:right w:val="single" w:color="CCCCCC" w:sz="1"/>
+            </w:tcBorders>
+            <w:shd w:fill="FFFFFF" w:val="clear"/>
+            <w:tcMar>
+              <w:top w:type="dxa" w:w="80"/>
+              <w:left w:type="dxa" w:w="120"/>
+              <w:bottom w:type="dxa" w:w="80"/>
+              <w:right w:type="dxa" w:w="120"/>
+            </w:tcMar>
+            <w:vAlign w:val="center"/>
+          </w:tcPr>
+          <w:p>
+            <w:r>
+              <w:rPr>
+                <w:rFonts w:ascii="Arial" w:cs="Arial" w:eastAsia="Arial" w:hAnsi="Arial"/>
+                <w:b w:val="false"/>
+                <w:bCs w:val="false"/>
+                <w:color w:val="000000"/>
+                <w:sz w:val="18"/>
+                <w:szCs w:val="18"/>
+              </w:rPr>
+              <w:t xml:space="preserve">Error rate</w:t>
+            </w:r>
+          </w:p>
+        </w:tc>
+        <w:tc>
+          <w:tcPr>
+            <w:tcW w:type="dxa" w:w="3600"/>
+            <w:tcBorders>
+              <w:top w:val="single" w:color="CCCCCC" w:sz="1"/>
+              <w:left w:val="single" w:color="CCCCCC" w:sz="1"/>
+              <w:bottom w:val="single" w:color="CCCCCC" w:sz="1"/>
+              <w:right w:val="single" w:color="CCCCCC" w:sz="1"/>
+            </w:tcBorders>
+            <w:shd w:fill="E2EFDA" w:val="clear"/>
+            <w:tcMar>
+              <w:top w:type="dxa" w:w="80"/>
+              <w:left w:type="dxa" w:w="120"/>
+              <w:bottom w:type="dxa" w:w="80"/>
+              <w:right w:type="dxa" w:w="120"/>
+            </w:tcMar>
+            <w:vAlign w:val="center"/>
+          </w:tcPr>
+          <w:p>
+            <w:r>
+              <w:rPr>
+                <w:rFonts w:ascii="Arial" w:cs="Arial" w:eastAsia="Arial" w:hAnsi="Arial"/>
+                <w:b w:val="false"/>
+                <w:bCs w:val="false"/>
+                <w:color w:val="000000"/>
+                <w:sz w:val="18"/>
+                <w:szCs w:val="18"/>
+              </w:rPr>
+              <w:t xml:space="preserve">0%</w:t>
+            </w:r>
+          </w:p>
+        </w:tc>
+      </w:tr>
+      <w:tr>
+        <w:tc>
+          <w:tcPr>
+            <w:tcW w:type="dxa" w:w="2400"/>
+            <w:tcBorders>
+              <w:top w:val="single" w:color="CCCCCC" w:sz="1"/>
+              <w:left w:val="single" w:color="CCCCCC" w:sz="1"/>
+              <w:bottom w:val="single" w:color="CCCCCC" w:sz="1"/>
+              <w:right w:val="single" w:color="CCCCCC" w:sz="1"/>
+            </w:tcBorders>
+            <w:shd w:fill="FFFFFF" w:val="clear"/>
+            <w:tcMar>
+              <w:top w:type="dxa" w:w="80"/>
+              <w:left w:type="dxa" w:w="120"/>
+              <w:bottom w:type="dxa" w:w="80"/>
+              <w:right w:type="dxa" w:w="120"/>
+            </w:tcMar>
+            <w:vAlign w:val="center"/>
+          </w:tcPr>
+          <w:p>
+            <w:r>
+              <w:rPr>
+                <w:rFonts w:ascii="Arial" w:cs="Arial" w:eastAsia="Arial" w:hAnsi="Arial"/>
+                <w:b w:val="false"/>
+                <w:bCs w:val="false"/>
+                <w:color w:val="000000"/>
+                <w:sz w:val="18"/>
+                <w:szCs w:val="18"/>
+              </w:rPr>
+              <w:t xml:space="preserve">Active users</w:t>
+            </w:r>
+          </w:p>
+        </w:tc>
+        <w:tc>
+          <w:tcPr>
+            <w:tcW w:type="dxa" w:w="3600"/>
+            <w:tcBorders>
+              <w:top w:val="single" w:color="CCCCCC" w:sz="1"/>
+              <w:left w:val="single" w:color="CCCCCC" w:sz="1"/>
+              <w:bottom w:val="single" w:color="CCCCCC" w:sz="1"/>
+              <w:right w:val="single" w:color="CCCCCC" w:sz="1"/>
+            </w:tcBorders>
+            <w:shd w:fill="FFFFFF" w:val="clear"/>
+            <w:tcMar>
+              <w:top w:type="dxa" w:w="80"/>
+              <w:left w:type="dxa" w:w="120"/>
+              <w:bottom w:type="dxa" w:w="80"/>
+              <w:right w:type="dxa" w:w="120"/>
+            </w:tcMar>
+            <w:vAlign w:val="center"/>
+          </w:tcPr>
+          <w:p>
+            <w:r>
+              <w:rPr>
+                <w:rFonts w:ascii="Arial" w:cs="Arial" w:eastAsia="Arial" w:hAnsi="Arial"/>
+                <w:b w:val="false"/>
+                <w:bCs w:val="false"/>
+                <w:color w:val="000000"/>
+                <w:sz w:val="18"/>
+                <w:szCs w:val="18"/>
+              </w:rPr>
+              <w:t xml:space="preserve">400</w:t>
+            </w:r>
+          </w:p>
+        </w:tc>
+      </w:tr>
+      <w:tr>
+        <w:tc>
+          <w:tcPr>
+            <w:tcW w:type="dxa" w:w="2400"/>
+            <w:tcBorders>
+              <w:top w:val="single" w:color="CCCCCC" w:sz="1"/>
+              <w:left w:val="single" w:color="CCCCCC" w:sz="1"/>
+              <w:bottom w:val="single" w:color="CCCCCC" w:sz="1"/>
+              <w:right w:val="single" w:color="CCCCCC" w:sz="1"/>
+            </w:tcBorders>
+            <w:shd w:fill="FFFFFF" w:val="clear"/>
+            <w:tcMar>
+              <w:top w:type="dxa" w:w="80"/>
+              <w:left w:type="dxa" w:w="120"/>
+              <w:bottom w:type="dxa" w:w="80"/>
+              <w:right w:type="dxa" w:w="120"/>
+            </w:tcMar>
+            <w:vAlign w:val="center"/>
+          </w:tcPr>
+          <w:p>
+            <w:r>
+              <w:rPr>
+                <w:rFonts w:ascii="Arial" w:cs="Arial" w:eastAsia="Arial" w:hAnsi="Arial"/>
+                <w:b w:val="false"/>
+                <w:bCs w:val="false"/>
+                <w:color w:val="000000"/>
+                <w:sz w:val="18"/>
+                <w:szCs w:val="18"/>
+              </w:rPr>
+              <w:t xml:space="preserve">Total GPUs</w:t>
+            </w:r>
+          </w:p>
+        </w:tc>
+        <w:tc>
+          <w:tcPr>
+            <w:tcW w:type="dxa" w:w="3600"/>
+            <w:tcBorders>
+              <w:top w:val="single" w:color="CCCCCC" w:sz="1"/>
+              <w:left w:val="single" w:color="CCCCCC" w:sz="1"/>
+              <w:bottom w:val="single" w:color="CCCCCC" w:sz="1"/>
+              <w:right w:val="single" w:color="CCCCCC" w:sz="1"/>
+            </w:tcBorders>
+            <w:shd w:fill="FFFFFF" w:val="clear"/>
+            <w:tcMar>
+              <w:top w:type="dxa" w:w="80"/>
+              <w:left w:type="dxa" w:w="120"/>
+              <w:bottom w:type="dxa" w:w="80"/>
+              <w:right w:type="dxa" w:w="120"/>
+            </w:tcMar>
+            <w:vAlign w:val="center"/>
+          </w:tcPr>
+          <w:p>
+            <w:r>
+              <w:rPr>
+                <w:rFonts w:ascii="Arial" w:cs="Arial" w:eastAsia="Arial" w:hAnsi="Arial"/>
+                <w:b w:val="false"/>
+                <w:bCs w:val="false"/>
+                <w:color w:val="000000"/>
+                <w:sz w:val="18"/>
+                <w:szCs w:val="18"/>
+              </w:rPr>
+              <w:t xml:space="preserve">4x H100</w:t>
+            </w:r>
+          </w:p>
+        </w:tc>
+      </w:tr>
+      <w:tr>
+        <w:tc>
+          <w:tcPr>
+            <w:tcW w:type="dxa" w:w="2400"/>
+            <w:tcBorders>
+              <w:top w:val="single" w:color="CCCCCC" w:sz="1"/>
+              <w:left w:val="single" w:color="CCCCCC" w:sz="1"/>
+              <w:bottom w:val="single" w:color="CCCCCC" w:sz="1"/>
+              <w:right w:val="single" w:color="CCCCCC" w:sz="1"/>
+            </w:tcBorders>
+            <w:shd w:fill="FFFFFF" w:val="clear"/>
+            <w:tcMar>
+              <w:top w:type="dxa" w:w="80"/>
+              <w:left w:type="dxa" w:w="120"/>
+              <w:bottom w:type="dxa" w:w="80"/>
+              <w:right w:type="dxa" w:w="120"/>
+            </w:tcMar>
+            <w:vAlign w:val="center"/>
+          </w:tcPr>
+          <w:p>
+            <w:r>
+              <w:rPr>
+                <w:rFonts w:ascii="Arial" w:cs="Arial" w:eastAsia="Arial" w:hAnsi="Arial"/>
+                <w:b w:val="false"/>
+                <w:bCs w:val="false"/>
+                <w:color w:val="000000"/>
+                <w:sz w:val="18"/>
+                <w:szCs w:val="18"/>
+              </w:rPr>
+              <w:t xml:space="preserve">Requests completed</w:t>
+            </w:r>
+          </w:p>
+        </w:tc>
+        <w:tc>
+          <w:tcPr>
+            <w:tcW w:type="dxa" w:w="3600"/>
+            <w:tcBorders>
+              <w:top w:val="single" w:color="CCCCCC" w:sz="1"/>
+              <w:left w:val="single" w:color="CCCCCC" w:sz="1"/>
+              <w:bottom w:val="single" w:color="CCCCCC" w:sz="1"/>
+              <w:right w:val="single" w:color="CCCCCC" w:sz="1"/>
+            </w:tcBorders>
+            <w:shd w:fill="FFFFFF" w:val="clear"/>
+            <w:tcMar>
+              <w:top w:type="dxa" w:w="80"/>
+              <w:left w:type="dxa" w:w="120"/>
+              <w:bottom w:type="dxa" w:w="80"/>
+              <w:right w:type="dxa" w:w="120"/>
+            </w:tcMar>
+            <w:vAlign w:val="center"/>
+          </w:tcPr>
+          <w:p>
+            <w:r>
+              <w:rPr>
+                <w:rFonts w:ascii="Arial" w:cs="Arial" w:eastAsia="Arial" w:hAnsi="Arial"/>
+                <w:b w:val="false"/>
+                <w:bCs w:val="false"/>
+                <w:color w:val="000000"/>
+                <w:sz w:val="18"/>
+                <w:szCs w:val="18"/>
+              </w:rPr>
+              <w:t xml:space="preserve">13,103 in 90s</w:t>
+            </w:r>
+          </w:p>
+        </w:tc>
+      </w:tr>
+    </w:tbl>
+    <w:p>
+      <w:pPr>
+        <w:spacing w:before="160"/>
+      </w:pPr>
+      <w:r>
+        <w:rPr>
+          <w:rFonts w:ascii="Arial" w:cs="Arial" w:eastAsia="Arial" w:hAnsi="Arial"/>
+          <w:b/>
+          <w:bCs/>
+          <w:sz w:val="22"/>
+          <w:szCs w:val="22"/>
+        </w:rPr>
+        <w:t xml:space="preserve">Winning optimizations (in order of impact):</w:t>
+      </w:r>
+    </w:p>
+    <w:p>
+      <w:pPr>
+        <w:spacing w:before="60"/>
+      </w:pPr>
+      <w:r>
+        <w:rPr>
+          <w:rFonts w:ascii="Arial" w:cs="Arial" w:eastAsia="Arial" w:hAnsi="Arial"/>
+          <w:sz w:val="22"/>
+          <w:szCs w:val="22"/>
+        </w:rPr>
+        <w:t xml:space="preserve">1. Compiled mode (--no-fast-boot): 2.3x throughput gain on a single replica by enabling CUDA graphs.</w:t>
+      </w:r>
+    </w:p>
+    <w:p>
+      <w:pPr>
+        <w:spacing w:before="60"/>
+      </w:pPr>
+      <w:r>
+        <w:rPr>
+          <w:rFonts w:ascii="Arial" w:cs="Arial" w:eastAsia="Arial" w:hAnsi="Arial"/>
+          <w:sz w:val="22"/>
+          <w:szCs w:val="22"/>
+        </w:rPr>
+        <w:t xml:space="preserve">2. Scale out to 4 replicas: linear throughput scaling, TTFT improves due to load distribution.</w:t>
+      </w:r>
+    </w:p>
+    <w:p>
+      <w:pPr>
+        <w:spacing w:before="60"/>
+      </w:pPr>
+      <w:r>
+        <w:rPr>
+          <w:rFonts w:ascii="Arial" w:cs="Arial" w:eastAsia="Arial" w:hAnsi="Arial"/>
+          <w:sz w:val="22"/>
+          <w:szCs w:val="22"/>
+        </w:rPr>
+        <w:t xml:space="preserve">3. Prefix cache ON: 32% TTFT reduction — fixed prompt set creates high cache hit rate.</w:t>
+      </w:r>
+    </w:p>
+    <w:p>
+      <w:pPr>
+        <w:spacing w:before="60"/>
+      </w:pPr>
+      <w:r>
+        <w:rPr>
+          <w:rFonts w:ascii="Arial" w:cs="Arial" w:eastAsia="Arial" w:hAnsi="Arial"/>
+          <w:sz w:val="22"/>
+          <w:szCs w:val="22"/>
+        </w:rPr>
+        <w:t xml:space="preserve">4. Default batch knobs (seq32/b4096): wider batches hurt; smaller batches keep decode steps fast.</w:t>
+      </w:r>
+    </w:p>
+    <w:p>
+      <w:pPr>
+        <w:pStyle w:val="Heading2"/>
+        <w:spacing w:before="240"/>
+      </w:pPr>
+      <w:r>
+        <w:t xml:space="preserve">6. Roofline Plot — Performance Space</w:t>
       </w:r>
     </w:p>
     <w:p>
@@ -4604,7 +5756,7 @@
         <w:spacing w:before="240"/>
       </w:pPr>
       <w:r>
-        <w:t xml:space="preserve">6. Reference Baselines (from Capstone Doc)</w:t>
+        <w:t xml:space="preserve">7. Reference Baselines (from Capstone Doc)</w:t>
       </w:r>
     </w:p>
     <w:tbl>

</xml_diff>

<commit_message>
Add FP8 quantization support and new best results (14,245 chunks/s)
</commit_message>
<xml_diff>
--- a/InferTutor_Experiments.docx
+++ b/InferTutor_Experiments.docx
@@ -1984,7 +1984,7 @@
               <w:bottom w:val="single" w:color="CCCCCC" w:sz="1"/>
               <w:right w:val="single" w:color="CCCCCC" w:sz="1"/>
             </w:tcBorders>
-            <w:shd w:fill="E2EFDA" w:val="clear"/>
+            <w:shd w:fill="FFFFFF" w:val="clear"/>
             <w:tcMar>
               <w:top w:type="dxa" w:w="80"/>
               <w:left w:type="dxa" w:w="120"/>
@@ -2016,7 +2016,7 @@
               <w:bottom w:val="single" w:color="CCCCCC" w:sz="1"/>
               <w:right w:val="single" w:color="CCCCCC" w:sz="1"/>
             </w:tcBorders>
-            <w:shd w:fill="E2EFDA" w:val="clear"/>
+            <w:shd w:fill="FFFFFF" w:val="clear"/>
             <w:tcMar>
               <w:top w:type="dxa" w:w="80"/>
               <w:left w:type="dxa" w:w="120"/>
@@ -2048,7 +2048,7 @@
               <w:bottom w:val="single" w:color="CCCCCC" w:sz="1"/>
               <w:right w:val="single" w:color="CCCCCC" w:sz="1"/>
             </w:tcBorders>
-            <w:shd w:fill="E2EFDA" w:val="clear"/>
+            <w:shd w:fill="FFFFFF" w:val="clear"/>
             <w:tcMar>
               <w:top w:type="dxa" w:w="80"/>
               <w:left w:type="dxa" w:w="120"/>
@@ -2080,7 +2080,7 @@
               <w:bottom w:val="single" w:color="CCCCCC" w:sz="1"/>
               <w:right w:val="single" w:color="CCCCCC" w:sz="1"/>
             </w:tcBorders>
-            <w:shd w:fill="E2EFDA" w:val="clear"/>
+            <w:shd w:fill="FFFFFF" w:val="clear"/>
             <w:tcMar>
               <w:top w:type="dxa" w:w="80"/>
               <w:left w:type="dxa" w:w="120"/>
@@ -2112,7 +2112,7 @@
               <w:bottom w:val="single" w:color="CCCCCC" w:sz="1"/>
               <w:right w:val="single" w:color="CCCCCC" w:sz="1"/>
             </w:tcBorders>
-            <w:shd w:fill="E2EFDA" w:val="clear"/>
+            <w:shd w:fill="FFFFFF" w:val="clear"/>
             <w:tcMar>
               <w:top w:type="dxa" w:w="80"/>
               <w:left w:type="dxa" w:w="120"/>
@@ -2144,7 +2144,7 @@
               <w:bottom w:val="single" w:color="CCCCCC" w:sz="1"/>
               <w:right w:val="single" w:color="CCCCCC" w:sz="1"/>
             </w:tcBorders>
-            <w:shd w:fill="E2EFDA" w:val="clear"/>
+            <w:shd w:fill="FFFFFF" w:val="clear"/>
             <w:tcMar>
               <w:top w:type="dxa" w:w="80"/>
               <w:left w:type="dxa" w:w="120"/>
@@ -2176,7 +2176,7 @@
               <w:bottom w:val="single" w:color="CCCCCC" w:sz="1"/>
               <w:right w:val="single" w:color="CCCCCC" w:sz="1"/>
             </w:tcBorders>
-            <w:shd w:fill="E2EFDA" w:val="clear"/>
+            <w:shd w:fill="FFFFFF" w:val="clear"/>
             <w:tcMar>
               <w:top w:type="dxa" w:w="80"/>
               <w:left w:type="dxa" w:w="120"/>
@@ -2208,7 +2208,7 @@
               <w:bottom w:val="single" w:color="CCCCCC" w:sz="1"/>
               <w:right w:val="single" w:color="CCCCCC" w:sz="1"/>
             </w:tcBorders>
-            <w:shd w:fill="E2EFDA" w:val="clear"/>
+            <w:shd w:fill="FFFFFF" w:val="clear"/>
             <w:tcMar>
               <w:top w:type="dxa" w:w="80"/>
               <w:left w:type="dxa" w:w="120"/>
@@ -2240,7 +2240,7 @@
               <w:bottom w:val="single" w:color="CCCCCC" w:sz="1"/>
               <w:right w:val="single" w:color="CCCCCC" w:sz="1"/>
             </w:tcBorders>
-            <w:shd w:fill="E2EFDA" w:val="clear"/>
+            <w:shd w:fill="FFFFFF" w:val="clear"/>
             <w:tcMar>
               <w:top w:type="dxa" w:w="80"/>
               <w:left w:type="dxa" w:w="120"/>
@@ -2272,7 +2272,7 @@
               <w:bottom w:val="single" w:color="CCCCCC" w:sz="1"/>
               <w:right w:val="single" w:color="CCCCCC" w:sz="1"/>
             </w:tcBorders>
-            <w:shd w:fill="E2EFDA" w:val="clear"/>
+            <w:shd w:fill="FFFFFF" w:val="clear"/>
             <w:tcMar>
               <w:top w:type="dxa" w:w="80"/>
               <w:left w:type="dxa" w:w="120"/>
@@ -2304,7 +2304,7 @@
               <w:bottom w:val="single" w:color="CCCCCC" w:sz="1"/>
               <w:right w:val="single" w:color="CCCCCC" w:sz="1"/>
             </w:tcBorders>
-            <w:shd w:fill="E2EFDA" w:val="clear"/>
+            <w:shd w:fill="FFFFFF" w:val="clear"/>
             <w:tcMar>
               <w:top w:type="dxa" w:w="80"/>
               <w:left w:type="dxa" w:w="120"/>
@@ -2336,7 +2336,7 @@
               <w:bottom w:val="single" w:color="CCCCCC" w:sz="1"/>
               <w:right w:val="single" w:color="CCCCCC" w:sz="1"/>
             </w:tcBorders>
-            <w:shd w:fill="E2EFDA" w:val="clear"/>
+            <w:shd w:fill="FFFFFF" w:val="clear"/>
             <w:tcMar>
               <w:top w:type="dxa" w:w="80"/>
               <w:left w:type="dxa" w:w="120"/>
@@ -2368,7 +2368,7 @@
               <w:bottom w:val="single" w:color="CCCCCC" w:sz="1"/>
               <w:right w:val="single" w:color="CCCCCC" w:sz="1"/>
             </w:tcBorders>
-            <w:shd w:fill="E2EFDA" w:val="clear"/>
+            <w:shd w:fill="FFFFFF" w:val="clear"/>
             <w:tcMar>
               <w:top w:type="dxa" w:w="80"/>
               <w:left w:type="dxa" w:w="120"/>
@@ -2400,7 +2400,7 @@
               <w:bottom w:val="single" w:color="CCCCCC" w:sz="1"/>
               <w:right w:val="single" w:color="CCCCCC" w:sz="1"/>
             </w:tcBorders>
-            <w:shd w:fill="E2EFDA" w:val="clear"/>
+            <w:shd w:fill="FFFFFF" w:val="clear"/>
             <w:tcMar>
               <w:top w:type="dxa" w:w="80"/>
               <w:left w:type="dxa" w:w="120"/>
@@ -4670,6 +4670,906 @@
                 <w:szCs w:val="18"/>
               </w:rPr>
               <w:t xml:space="preserve">64 errors at 500 users — over capacity. Score penalty from errors makes this worse than r4-400u. Confirmed compiled-r4 at 400u is the optimal clean submission.</w:t>
+            </w:r>
+          </w:p>
+        </w:tc>
+      </w:tr>
+      <w:tr>
+        <w:tc>
+          <w:tcPr>
+            <w:tcW w:type="dxa" w:w="900"/>
+            <w:tcBorders>
+              <w:top w:val="single" w:color="CCCCCC" w:sz="1"/>
+              <w:left w:val="single" w:color="CCCCCC" w:sz="1"/>
+              <w:bottom w:val="single" w:color="CCCCCC" w:sz="1"/>
+              <w:right w:val="single" w:color="CCCCCC" w:sz="1"/>
+            </w:tcBorders>
+            <w:shd w:fill="FFFFFF" w:val="clear"/>
+            <w:tcMar>
+              <w:top w:type="dxa" w:w="80"/>
+              <w:left w:type="dxa" w:w="120"/>
+              <w:bottom w:type="dxa" w:w="80"/>
+              <w:right w:type="dxa" w:w="120"/>
+            </w:tcMar>
+            <w:vAlign w:val="center"/>
+          </w:tcPr>
+          <w:p>
+            <w:r>
+              <w:rPr>
+                <w:rFonts w:ascii="Arial" w:cs="Arial" w:eastAsia="Arial" w:hAnsi="Arial"/>
+                <w:b w:val="false"/>
+                <w:bCs w:val="false"/>
+                <w:color w:val="000000"/>
+                <w:sz w:val="18"/>
+                <w:szCs w:val="18"/>
+              </w:rPr>
+              <w:t xml:space="preserve">FP8 Quant r1</w:t>
+            </w:r>
+          </w:p>
+        </w:tc>
+        <w:tc>
+          <w:tcPr>
+            <w:tcW w:type="dxa" w:w="1400"/>
+            <w:tcBorders>
+              <w:top w:val="single" w:color="CCCCCC" w:sz="1"/>
+              <w:left w:val="single" w:color="CCCCCC" w:sz="1"/>
+              <w:bottom w:val="single" w:color="CCCCCC" w:sz="1"/>
+              <w:right w:val="single" w:color="CCCCCC" w:sz="1"/>
+            </w:tcBorders>
+            <w:shd w:fill="FFFFFF" w:val="clear"/>
+            <w:tcMar>
+              <w:top w:type="dxa" w:w="80"/>
+              <w:left w:type="dxa" w:w="120"/>
+              <w:bottom w:type="dxa" w:w="80"/>
+              <w:right w:type="dxa" w:w="120"/>
+            </w:tcMar>
+            <w:vAlign w:val="center"/>
+          </w:tcPr>
+          <w:p>
+            <w:r>
+              <w:rPr>
+                <w:rFonts w:ascii="Arial" w:cs="Arial" w:eastAsia="Arial" w:hAnsi="Arial"/>
+                <w:b w:val="false"/>
+                <w:bCs w:val="false"/>
+                <w:color w:val="000000"/>
+                <w:sz w:val="18"/>
+                <w:szCs w:val="18"/>
+              </w:rPr>
+              <w:t xml:space="preserve">quant-fp8-r1</w:t>
+            </w:r>
+          </w:p>
+        </w:tc>
+        <w:tc>
+          <w:tcPr>
+            <w:tcW w:type="dxa" w:w="500"/>
+            <w:tcBorders>
+              <w:top w:val="single" w:color="CCCCCC" w:sz="1"/>
+              <w:left w:val="single" w:color="CCCCCC" w:sz="1"/>
+              <w:bottom w:val="single" w:color="CCCCCC" w:sz="1"/>
+              <w:right w:val="single" w:color="CCCCCC" w:sz="1"/>
+            </w:tcBorders>
+            <w:shd w:fill="FFFFFF" w:val="clear"/>
+            <w:tcMar>
+              <w:top w:type="dxa" w:w="80"/>
+              <w:left w:type="dxa" w:w="120"/>
+              <w:bottom w:type="dxa" w:w="80"/>
+              <w:right w:type="dxa" w:w="120"/>
+            </w:tcMar>
+            <w:vAlign w:val="center"/>
+          </w:tcPr>
+          <w:p>
+            <w:r>
+              <w:rPr>
+                <w:rFonts w:ascii="Arial" w:cs="Arial" w:eastAsia="Arial" w:hAnsi="Arial"/>
+                <w:b w:val="false"/>
+                <w:bCs w:val="false"/>
+                <w:color w:val="000000"/>
+                <w:sz w:val="18"/>
+                <w:szCs w:val="18"/>
+              </w:rPr>
+              <w:t xml:space="preserve">1</w:t>
+            </w:r>
+          </w:p>
+        </w:tc>
+        <w:tc>
+          <w:tcPr>
+            <w:tcW w:type="dxa" w:w="500"/>
+            <w:tcBorders>
+              <w:top w:val="single" w:color="CCCCCC" w:sz="1"/>
+              <w:left w:val="single" w:color="CCCCCC" w:sz="1"/>
+              <w:bottom w:val="single" w:color="CCCCCC" w:sz="1"/>
+              <w:right w:val="single" w:color="CCCCCC" w:sz="1"/>
+            </w:tcBorders>
+            <w:shd w:fill="FFFFFF" w:val="clear"/>
+            <w:tcMar>
+              <w:top w:type="dxa" w:w="80"/>
+              <w:left w:type="dxa" w:w="120"/>
+              <w:bottom w:type="dxa" w:w="80"/>
+              <w:right w:type="dxa" w:w="120"/>
+            </w:tcMar>
+            <w:vAlign w:val="center"/>
+          </w:tcPr>
+          <w:p>
+            <w:r>
+              <w:rPr>
+                <w:rFonts w:ascii="Arial" w:cs="Arial" w:eastAsia="Arial" w:hAnsi="Arial"/>
+                <w:b w:val="false"/>
+                <w:bCs w:val="false"/>
+                <w:color w:val="000000"/>
+                <w:sz w:val="18"/>
+                <w:szCs w:val="18"/>
+              </w:rPr>
+              <w:t xml:space="preserve">text</w:t>
+            </w:r>
+          </w:p>
+        </w:tc>
+        <w:tc>
+          <w:tcPr>
+            <w:tcW w:type="dxa" w:w="500"/>
+            <w:tcBorders>
+              <w:top w:val="single" w:color="CCCCCC" w:sz="1"/>
+              <w:left w:val="single" w:color="CCCCCC" w:sz="1"/>
+              <w:bottom w:val="single" w:color="CCCCCC" w:sz="1"/>
+              <w:right w:val="single" w:color="CCCCCC" w:sz="1"/>
+            </w:tcBorders>
+            <w:shd w:fill="FFFFFF" w:val="clear"/>
+            <w:tcMar>
+              <w:top w:type="dxa" w:w="80"/>
+              <w:left w:type="dxa" w:w="120"/>
+              <w:bottom w:type="dxa" w:w="80"/>
+              <w:right w:type="dxa" w:w="120"/>
+            </w:tcMar>
+            <w:vAlign w:val="center"/>
+          </w:tcPr>
+          <w:p>
+            <w:r>
+              <w:rPr>
+                <w:rFonts w:ascii="Arial" w:cs="Arial" w:eastAsia="Arial" w:hAnsi="Arial"/>
+                <w:b w:val="false"/>
+                <w:bCs w:val="false"/>
+                <w:color w:val="000000"/>
+                <w:sz w:val="18"/>
+                <w:szCs w:val="18"/>
+              </w:rPr>
+              <w:t xml:space="preserve">100</w:t>
+            </w:r>
+          </w:p>
+        </w:tc>
+        <w:tc>
+          <w:tcPr>
+            <w:tcW w:type="dxa" w:w="700"/>
+            <w:tcBorders>
+              <w:top w:val="single" w:color="CCCCCC" w:sz="1"/>
+              <w:left w:val="single" w:color="CCCCCC" w:sz="1"/>
+              <w:bottom w:val="single" w:color="CCCCCC" w:sz="1"/>
+              <w:right w:val="single" w:color="CCCCCC" w:sz="1"/>
+            </w:tcBorders>
+            <w:shd w:fill="FFFFFF" w:val="clear"/>
+            <w:tcMar>
+              <w:top w:type="dxa" w:w="80"/>
+              <w:left w:type="dxa" w:w="120"/>
+              <w:bottom w:type="dxa" w:w="80"/>
+              <w:right w:type="dxa" w:w="120"/>
+            </w:tcMar>
+            <w:vAlign w:val="center"/>
+          </w:tcPr>
+          <w:p>
+            <w:r>
+              <w:rPr>
+                <w:rFonts w:ascii="Arial" w:cs="Arial" w:eastAsia="Arial" w:hAnsi="Arial"/>
+                <w:b w:val="false"/>
+                <w:bCs w:val="false"/>
+                <w:color w:val="000000"/>
+                <w:sz w:val="18"/>
+                <w:szCs w:val="18"/>
+              </w:rPr>
+              <w:t xml:space="preserve">false</w:t>
+            </w:r>
+          </w:p>
+        </w:tc>
+        <w:tc>
+          <w:tcPr>
+            <w:tcW w:type="dxa" w:w="600"/>
+            <w:tcBorders>
+              <w:top w:val="single" w:color="CCCCCC" w:sz="1"/>
+              <w:left w:val="single" w:color="CCCCCC" w:sz="1"/>
+              <w:bottom w:val="single" w:color="CCCCCC" w:sz="1"/>
+              <w:right w:val="single" w:color="CCCCCC" w:sz="1"/>
+            </w:tcBorders>
+            <w:shd w:fill="FFFFFF" w:val="clear"/>
+            <w:tcMar>
+              <w:top w:type="dxa" w:w="80"/>
+              <w:left w:type="dxa" w:w="120"/>
+              <w:bottom w:type="dxa" w:w="80"/>
+              <w:right w:type="dxa" w:w="120"/>
+            </w:tcMar>
+            <w:vAlign w:val="center"/>
+          </w:tcPr>
+          <w:p>
+            <w:r>
+              <w:rPr>
+                <w:rFonts w:ascii="Arial" w:cs="Arial" w:eastAsia="Arial" w:hAnsi="Arial"/>
+                <w:b w:val="false"/>
+                <w:bCs w:val="false"/>
+                <w:color w:val="000000"/>
+                <w:sz w:val="18"/>
+                <w:szCs w:val="18"/>
+              </w:rPr>
+              <w:t xml:space="preserve">32</w:t>
+            </w:r>
+          </w:p>
+        </w:tc>
+        <w:tc>
+          <w:tcPr>
+            <w:tcW w:type="dxa" w:w="800"/>
+            <w:tcBorders>
+              <w:top w:val="single" w:color="CCCCCC" w:sz="1"/>
+              <w:left w:val="single" w:color="CCCCCC" w:sz="1"/>
+              <w:bottom w:val="single" w:color="CCCCCC" w:sz="1"/>
+              <w:right w:val="single" w:color="CCCCCC" w:sz="1"/>
+            </w:tcBorders>
+            <w:shd w:fill="FFFFFF" w:val="clear"/>
+            <w:tcMar>
+              <w:top w:type="dxa" w:w="80"/>
+              <w:left w:type="dxa" w:w="120"/>
+              <w:bottom w:type="dxa" w:w="80"/>
+              <w:right w:type="dxa" w:w="120"/>
+            </w:tcMar>
+            <w:vAlign w:val="center"/>
+          </w:tcPr>
+          <w:p>
+            <w:r>
+              <w:rPr>
+                <w:rFonts w:ascii="Arial" w:cs="Arial" w:eastAsia="Arial" w:hAnsi="Arial"/>
+                <w:b w:val="false"/>
+                <w:bCs w:val="false"/>
+                <w:color w:val="000000"/>
+                <w:sz w:val="18"/>
+                <w:szCs w:val="18"/>
+              </w:rPr>
+              <w:t xml:space="preserve">4096</w:t>
+            </w:r>
+          </w:p>
+        </w:tc>
+        <w:tc>
+          <w:tcPr>
+            <w:tcW w:type="dxa" w:w="800"/>
+            <w:tcBorders>
+              <w:top w:val="single" w:color="CCCCCC" w:sz="1"/>
+              <w:left w:val="single" w:color="CCCCCC" w:sz="1"/>
+              <w:bottom w:val="single" w:color="CCCCCC" w:sz="1"/>
+              <w:right w:val="single" w:color="CCCCCC" w:sz="1"/>
+            </w:tcBorders>
+            <w:shd w:fill="FFFFFF" w:val="clear"/>
+            <w:tcMar>
+              <w:top w:type="dxa" w:w="80"/>
+              <w:left w:type="dxa" w:w="120"/>
+              <w:bottom w:type="dxa" w:w="80"/>
+              <w:right w:type="dxa" w:w="120"/>
+            </w:tcMar>
+            <w:vAlign w:val="center"/>
+          </w:tcPr>
+          <w:p>
+            <w:r>
+              <w:rPr>
+                <w:rFonts w:ascii="Arial" w:cs="Arial" w:eastAsia="Arial" w:hAnsi="Arial"/>
+                <w:b w:val="false"/>
+                <w:bCs w:val="false"/>
+                <w:color w:val="000000"/>
+                <w:sz w:val="18"/>
+                <w:szCs w:val="18"/>
+              </w:rPr>
+              <w:t xml:space="preserve">1194.9</w:t>
+            </w:r>
+          </w:p>
+        </w:tc>
+        <w:tc>
+          <w:tcPr>
+            <w:tcW w:type="dxa" w:w="700"/>
+            <w:tcBorders>
+              <w:top w:val="single" w:color="CCCCCC" w:sz="1"/>
+              <w:left w:val="single" w:color="CCCCCC" w:sz="1"/>
+              <w:bottom w:val="single" w:color="CCCCCC" w:sz="1"/>
+              <w:right w:val="single" w:color="CCCCCC" w:sz="1"/>
+            </w:tcBorders>
+            <w:shd w:fill="FFFFFF" w:val="clear"/>
+            <w:tcMar>
+              <w:top w:type="dxa" w:w="80"/>
+              <w:left w:type="dxa" w:w="120"/>
+              <w:bottom w:type="dxa" w:w="80"/>
+              <w:right w:type="dxa" w:w="120"/>
+            </w:tcMar>
+            <w:vAlign w:val="center"/>
+          </w:tcPr>
+          <w:p>
+            <w:r>
+              <w:rPr>
+                <w:rFonts w:ascii="Arial" w:cs="Arial" w:eastAsia="Arial" w:hAnsi="Arial"/>
+                <w:b w:val="false"/>
+                <w:bCs w:val="false"/>
+                <w:color w:val="000000"/>
+                <w:sz w:val="18"/>
+                <w:szCs w:val="18"/>
+              </w:rPr>
+              <w:t xml:space="preserve">5.4</w:t>
+            </w:r>
+          </w:p>
+        </w:tc>
+        <w:tc>
+          <w:tcPr>
+            <w:tcW w:type="dxa" w:w="900"/>
+            <w:tcBorders>
+              <w:top w:val="single" w:color="CCCCCC" w:sz="1"/>
+              <w:left w:val="single" w:color="CCCCCC" w:sz="1"/>
+              <w:bottom w:val="single" w:color="CCCCCC" w:sz="1"/>
+              <w:right w:val="single" w:color="CCCCCC" w:sz="1"/>
+            </w:tcBorders>
+            <w:shd w:fill="FFFFFF" w:val="clear"/>
+            <w:tcMar>
+              <w:top w:type="dxa" w:w="80"/>
+              <w:left w:type="dxa" w:w="120"/>
+              <w:bottom w:type="dxa" w:w="80"/>
+              <w:right w:type="dxa" w:w="120"/>
+            </w:tcMar>
+            <w:vAlign w:val="center"/>
+          </w:tcPr>
+          <w:p>
+            <w:r>
+              <w:rPr>
+                <w:rFonts w:ascii="Arial" w:cs="Arial" w:eastAsia="Arial" w:hAnsi="Arial"/>
+                <w:b w:val="false"/>
+                <w:bCs w:val="false"/>
+                <w:color w:val="000000"/>
+                <w:sz w:val="18"/>
+                <w:szCs w:val="18"/>
+              </w:rPr>
+              <w:t xml:space="preserve">3857.6</w:t>
+            </w:r>
+          </w:p>
+        </w:tc>
+        <w:tc>
+          <w:tcPr>
+            <w:tcW w:type="dxa" w:w="600"/>
+            <w:tcBorders>
+              <w:top w:val="single" w:color="CCCCCC" w:sz="1"/>
+              <w:left w:val="single" w:color="CCCCCC" w:sz="1"/>
+              <w:bottom w:val="single" w:color="CCCCCC" w:sz="1"/>
+              <w:right w:val="single" w:color="CCCCCC" w:sz="1"/>
+            </w:tcBorders>
+            <w:shd w:fill="FFFFFF" w:val="clear"/>
+            <w:tcMar>
+              <w:top w:type="dxa" w:w="80"/>
+              <w:left w:type="dxa" w:w="120"/>
+              <w:bottom w:type="dxa" w:w="80"/>
+              <w:right w:type="dxa" w:w="120"/>
+            </w:tcMar>
+            <w:vAlign w:val="center"/>
+          </w:tcPr>
+          <w:p>
+            <w:r>
+              <w:rPr>
+                <w:rFonts w:ascii="Arial" w:cs="Arial" w:eastAsia="Arial" w:hAnsi="Arial"/>
+                <w:b w:val="false"/>
+                <w:bCs w:val="false"/>
+                <w:color w:val="000000"/>
+                <w:sz w:val="18"/>
+                <w:szCs w:val="18"/>
+              </w:rPr>
+              <w:t xml:space="preserve">40.30</w:t>
+            </w:r>
+          </w:p>
+        </w:tc>
+        <w:tc>
+          <w:tcPr>
+            <w:tcW w:type="dxa" w:w="600"/>
+            <w:tcBorders>
+              <w:top w:val="single" w:color="CCCCCC" w:sz="1"/>
+              <w:left w:val="single" w:color="CCCCCC" w:sz="1"/>
+              <w:bottom w:val="single" w:color="CCCCCC" w:sz="1"/>
+              <w:right w:val="single" w:color="CCCCCC" w:sz="1"/>
+            </w:tcBorders>
+            <w:shd w:fill="FFFFFF" w:val="clear"/>
+            <w:tcMar>
+              <w:top w:type="dxa" w:w="80"/>
+              <w:left w:type="dxa" w:w="120"/>
+              <w:bottom w:type="dxa" w:w="80"/>
+              <w:right w:type="dxa" w:w="120"/>
+            </w:tcMar>
+            <w:vAlign w:val="center"/>
+          </w:tcPr>
+          <w:p>
+            <w:r>
+              <w:rPr>
+                <w:rFonts w:ascii="Arial" w:cs="Arial" w:eastAsia="Arial" w:hAnsi="Arial"/>
+                <w:b w:val="false"/>
+                <w:bCs w:val="false"/>
+                <w:color w:val="000000"/>
+                <w:sz w:val="18"/>
+                <w:szCs w:val="18"/>
+              </w:rPr>
+              <w:t xml:space="preserve">0</w:t>
+            </w:r>
+          </w:p>
+        </w:tc>
+        <w:tc>
+          <w:tcPr>
+            <w:tcW w:type="dxa" w:w="1500"/>
+            <w:tcBorders>
+              <w:top w:val="single" w:color="CCCCCC" w:sz="1"/>
+              <w:left w:val="single" w:color="CCCCCC" w:sz="1"/>
+              <w:bottom w:val="single" w:color="CCCCCC" w:sz="1"/>
+              <w:right w:val="single" w:color="CCCCCC" w:sz="1"/>
+            </w:tcBorders>
+            <w:shd w:fill="FFFFFF" w:val="clear"/>
+            <w:tcMar>
+              <w:top w:type="dxa" w:w="80"/>
+              <w:left w:type="dxa" w:w="120"/>
+              <w:bottom w:type="dxa" w:w="80"/>
+              <w:right w:type="dxa" w:w="120"/>
+            </w:tcMar>
+            <w:vAlign w:val="center"/>
+          </w:tcPr>
+          <w:p>
+            <w:r>
+              <w:rPr>
+                <w:rFonts w:ascii="Arial" w:cs="Arial" w:eastAsia="Arial" w:hAnsi="Arial"/>
+                <w:b w:val="false"/>
+                <w:bCs w:val="false"/>
+                <w:color w:val="000000"/>
+                <w:sz w:val="18"/>
+                <w:szCs w:val="18"/>
+              </w:rPr>
+              <w:t xml:space="preserve">FP8 quantization via --quantization fp8. Halves model weight bytes → higher arithmetic intensity on roofline. TTFT 14% better vs BF16 r1 (1194 vs 1389ms). ITL 10% better (5.4 vs 6.0ms).</w:t>
+            </w:r>
+          </w:p>
+        </w:tc>
+      </w:tr>
+      <w:tr>
+        <w:tc>
+          <w:tcPr>
+            <w:tcW w:type="dxa" w:w="900"/>
+            <w:tcBorders>
+              <w:top w:val="single" w:color="CCCCCC" w:sz="1"/>
+              <w:left w:val="single" w:color="CCCCCC" w:sz="1"/>
+              <w:bottom w:val="single" w:color="CCCCCC" w:sz="1"/>
+              <w:right w:val="single" w:color="CCCCCC" w:sz="1"/>
+            </w:tcBorders>
+            <w:shd w:fill="FFFFFF" w:val="clear"/>
+            <w:tcMar>
+              <w:top w:type="dxa" w:w="80"/>
+              <w:left w:type="dxa" w:w="120"/>
+              <w:bottom w:type="dxa" w:w="80"/>
+              <w:right w:type="dxa" w:w="120"/>
+            </w:tcMar>
+            <w:vAlign w:val="center"/>
+          </w:tcPr>
+          <w:p>
+            <w:r>
+              <w:rPr>
+                <w:rFonts w:ascii="Arial" w:cs="Arial" w:eastAsia="Arial" w:hAnsi="Arial"/>
+                <w:b w:val="false"/>
+                <w:bCs w:val="false"/>
+                <w:color w:val="000000"/>
+                <w:sz w:val="18"/>
+                <w:szCs w:val="18"/>
+              </w:rPr>
+              <w:t xml:space="preserve">FP8 Quant r4 ★</w:t>
+            </w:r>
+          </w:p>
+        </w:tc>
+        <w:tc>
+          <w:tcPr>
+            <w:tcW w:type="dxa" w:w="1400"/>
+            <w:tcBorders>
+              <w:top w:val="single" w:color="CCCCCC" w:sz="1"/>
+              <w:left w:val="single" w:color="CCCCCC" w:sz="1"/>
+              <w:bottom w:val="single" w:color="CCCCCC" w:sz="1"/>
+              <w:right w:val="single" w:color="CCCCCC" w:sz="1"/>
+            </w:tcBorders>
+            <w:shd w:fill="FFFFFF" w:val="clear"/>
+            <w:tcMar>
+              <w:top w:type="dxa" w:w="80"/>
+              <w:left w:type="dxa" w:w="120"/>
+              <w:bottom w:type="dxa" w:w="80"/>
+              <w:right w:type="dxa" w:w="120"/>
+            </w:tcMar>
+            <w:vAlign w:val="center"/>
+          </w:tcPr>
+          <w:p>
+            <w:r>
+              <w:rPr>
+                <w:rFonts w:ascii="Arial" w:cs="Arial" w:eastAsia="Arial" w:hAnsi="Arial"/>
+                <w:b w:val="false"/>
+                <w:bCs w:val="false"/>
+                <w:color w:val="000000"/>
+                <w:sz w:val="18"/>
+                <w:szCs w:val="18"/>
+              </w:rPr>
+              <w:t xml:space="preserve">quant-fp8-r4</w:t>
+            </w:r>
+          </w:p>
+        </w:tc>
+        <w:tc>
+          <w:tcPr>
+            <w:tcW w:type="dxa" w:w="500"/>
+            <w:tcBorders>
+              <w:top w:val="single" w:color="CCCCCC" w:sz="1"/>
+              <w:left w:val="single" w:color="CCCCCC" w:sz="1"/>
+              <w:bottom w:val="single" w:color="CCCCCC" w:sz="1"/>
+              <w:right w:val="single" w:color="CCCCCC" w:sz="1"/>
+            </w:tcBorders>
+            <w:shd w:fill="FFFFFF" w:val="clear"/>
+            <w:tcMar>
+              <w:top w:type="dxa" w:w="80"/>
+              <w:left w:type="dxa" w:w="120"/>
+              <w:bottom w:type="dxa" w:w="80"/>
+              <w:right w:type="dxa" w:w="120"/>
+            </w:tcMar>
+            <w:vAlign w:val="center"/>
+          </w:tcPr>
+          <w:p>
+            <w:r>
+              <w:rPr>
+                <w:rFonts w:ascii="Arial" w:cs="Arial" w:eastAsia="Arial" w:hAnsi="Arial"/>
+                <w:b w:val="false"/>
+                <w:bCs w:val="false"/>
+                <w:color w:val="000000"/>
+                <w:sz w:val="18"/>
+                <w:szCs w:val="18"/>
+              </w:rPr>
+              <w:t xml:space="preserve">4</w:t>
+            </w:r>
+          </w:p>
+        </w:tc>
+        <w:tc>
+          <w:tcPr>
+            <w:tcW w:type="dxa" w:w="500"/>
+            <w:tcBorders>
+              <w:top w:val="single" w:color="CCCCCC" w:sz="1"/>
+              <w:left w:val="single" w:color="CCCCCC" w:sz="1"/>
+              <w:bottom w:val="single" w:color="CCCCCC" w:sz="1"/>
+              <w:right w:val="single" w:color="CCCCCC" w:sz="1"/>
+            </w:tcBorders>
+            <w:shd w:fill="FFFFFF" w:val="clear"/>
+            <w:tcMar>
+              <w:top w:type="dxa" w:w="80"/>
+              <w:left w:type="dxa" w:w="120"/>
+              <w:bottom w:type="dxa" w:w="80"/>
+              <w:right w:type="dxa" w:w="120"/>
+            </w:tcMar>
+            <w:vAlign w:val="center"/>
+          </w:tcPr>
+          <w:p>
+            <w:r>
+              <w:rPr>
+                <w:rFonts w:ascii="Arial" w:cs="Arial" w:eastAsia="Arial" w:hAnsi="Arial"/>
+                <w:b w:val="false"/>
+                <w:bCs w:val="false"/>
+                <w:color w:val="000000"/>
+                <w:sz w:val="18"/>
+                <w:szCs w:val="18"/>
+              </w:rPr>
+              <w:t xml:space="preserve">text</w:t>
+            </w:r>
+          </w:p>
+        </w:tc>
+        <w:tc>
+          <w:tcPr>
+            <w:tcW w:type="dxa" w:w="500"/>
+            <w:tcBorders>
+              <w:top w:val="single" w:color="CCCCCC" w:sz="1"/>
+              <w:left w:val="single" w:color="CCCCCC" w:sz="1"/>
+              <w:bottom w:val="single" w:color="CCCCCC" w:sz="1"/>
+              <w:right w:val="single" w:color="CCCCCC" w:sz="1"/>
+            </w:tcBorders>
+            <w:shd w:fill="FFFFFF" w:val="clear"/>
+            <w:tcMar>
+              <w:top w:type="dxa" w:w="80"/>
+              <w:left w:type="dxa" w:w="120"/>
+              <w:bottom w:type="dxa" w:w="80"/>
+              <w:right w:type="dxa" w:w="120"/>
+            </w:tcMar>
+            <w:vAlign w:val="center"/>
+          </w:tcPr>
+          <w:p>
+            <w:r>
+              <w:rPr>
+                <w:rFonts w:ascii="Arial" w:cs="Arial" w:eastAsia="Arial" w:hAnsi="Arial"/>
+                <w:b w:val="false"/>
+                <w:bCs w:val="false"/>
+                <w:color w:val="000000"/>
+                <w:sz w:val="18"/>
+                <w:szCs w:val="18"/>
+              </w:rPr>
+              <w:t xml:space="preserve">400</w:t>
+            </w:r>
+          </w:p>
+        </w:tc>
+        <w:tc>
+          <w:tcPr>
+            <w:tcW w:type="dxa" w:w="700"/>
+            <w:tcBorders>
+              <w:top w:val="single" w:color="CCCCCC" w:sz="1"/>
+              <w:left w:val="single" w:color="CCCCCC" w:sz="1"/>
+              <w:bottom w:val="single" w:color="CCCCCC" w:sz="1"/>
+              <w:right w:val="single" w:color="CCCCCC" w:sz="1"/>
+            </w:tcBorders>
+            <w:shd w:fill="FFFFFF" w:val="clear"/>
+            <w:tcMar>
+              <w:top w:type="dxa" w:w="80"/>
+              <w:left w:type="dxa" w:w="120"/>
+              <w:bottom w:type="dxa" w:w="80"/>
+              <w:right w:type="dxa" w:w="120"/>
+            </w:tcMar>
+            <w:vAlign w:val="center"/>
+          </w:tcPr>
+          <w:p>
+            <w:r>
+              <w:rPr>
+                <w:rFonts w:ascii="Arial" w:cs="Arial" w:eastAsia="Arial" w:hAnsi="Arial"/>
+                <w:b w:val="false"/>
+                <w:bCs w:val="false"/>
+                <w:color w:val="000000"/>
+                <w:sz w:val="18"/>
+                <w:szCs w:val="18"/>
+              </w:rPr>
+              <w:t xml:space="preserve">false</w:t>
+            </w:r>
+          </w:p>
+        </w:tc>
+        <w:tc>
+          <w:tcPr>
+            <w:tcW w:type="dxa" w:w="600"/>
+            <w:tcBorders>
+              <w:top w:val="single" w:color="CCCCCC" w:sz="1"/>
+              <w:left w:val="single" w:color="CCCCCC" w:sz="1"/>
+              <w:bottom w:val="single" w:color="CCCCCC" w:sz="1"/>
+              <w:right w:val="single" w:color="CCCCCC" w:sz="1"/>
+            </w:tcBorders>
+            <w:shd w:fill="FFFFFF" w:val="clear"/>
+            <w:tcMar>
+              <w:top w:type="dxa" w:w="80"/>
+              <w:left w:type="dxa" w:w="120"/>
+              <w:bottom w:type="dxa" w:w="80"/>
+              <w:right w:type="dxa" w:w="120"/>
+            </w:tcMar>
+            <w:vAlign w:val="center"/>
+          </w:tcPr>
+          <w:p>
+            <w:r>
+              <w:rPr>
+                <w:rFonts w:ascii="Arial" w:cs="Arial" w:eastAsia="Arial" w:hAnsi="Arial"/>
+                <w:b w:val="false"/>
+                <w:bCs w:val="false"/>
+                <w:color w:val="000000"/>
+                <w:sz w:val="18"/>
+                <w:szCs w:val="18"/>
+              </w:rPr>
+              <w:t xml:space="preserve">32</w:t>
+            </w:r>
+          </w:p>
+        </w:tc>
+        <w:tc>
+          <w:tcPr>
+            <w:tcW w:type="dxa" w:w="800"/>
+            <w:tcBorders>
+              <w:top w:val="single" w:color="CCCCCC" w:sz="1"/>
+              <w:left w:val="single" w:color="CCCCCC" w:sz="1"/>
+              <w:bottom w:val="single" w:color="CCCCCC" w:sz="1"/>
+              <w:right w:val="single" w:color="CCCCCC" w:sz="1"/>
+            </w:tcBorders>
+            <w:shd w:fill="FFFFFF" w:val="clear"/>
+            <w:tcMar>
+              <w:top w:type="dxa" w:w="80"/>
+              <w:left w:type="dxa" w:w="120"/>
+              <w:bottom w:type="dxa" w:w="80"/>
+              <w:right w:type="dxa" w:w="120"/>
+            </w:tcMar>
+            <w:vAlign w:val="center"/>
+          </w:tcPr>
+          <w:p>
+            <w:r>
+              <w:rPr>
+                <w:rFonts w:ascii="Arial" w:cs="Arial" w:eastAsia="Arial" w:hAnsi="Arial"/>
+                <w:b w:val="false"/>
+                <w:bCs w:val="false"/>
+                <w:color w:val="000000"/>
+                <w:sz w:val="18"/>
+                <w:szCs w:val="18"/>
+              </w:rPr>
+              <w:t xml:space="preserve">4096</w:t>
+            </w:r>
+          </w:p>
+        </w:tc>
+        <w:tc>
+          <w:tcPr>
+            <w:tcW w:type="dxa" w:w="800"/>
+            <w:tcBorders>
+              <w:top w:val="single" w:color="CCCCCC" w:sz="1"/>
+              <w:left w:val="single" w:color="CCCCCC" w:sz="1"/>
+              <w:bottom w:val="single" w:color="CCCCCC" w:sz="1"/>
+              <w:right w:val="single" w:color="CCCCCC" w:sz="1"/>
+            </w:tcBorders>
+            <w:shd w:fill="FFFFFF" w:val="clear"/>
+            <w:tcMar>
+              <w:top w:type="dxa" w:w="80"/>
+              <w:left w:type="dxa" w:w="120"/>
+              <w:bottom w:type="dxa" w:w="80"/>
+              <w:right w:type="dxa" w:w="120"/>
+            </w:tcMar>
+            <w:vAlign w:val="center"/>
+          </w:tcPr>
+          <w:p>
+            <w:r>
+              <w:rPr>
+                <w:rFonts w:ascii="Arial" w:cs="Arial" w:eastAsia="Arial" w:hAnsi="Arial"/>
+                <w:b w:val="false"/>
+                <w:bCs w:val="false"/>
+                <w:color w:val="000000"/>
+                <w:sz w:val="18"/>
+                <w:szCs w:val="18"/>
+              </w:rPr>
+              <w:t xml:space="preserve">1366.6</w:t>
+            </w:r>
+          </w:p>
+        </w:tc>
+        <w:tc>
+          <w:tcPr>
+            <w:tcW w:type="dxa" w:w="700"/>
+            <w:tcBorders>
+              <w:top w:val="single" w:color="CCCCCC" w:sz="1"/>
+              <w:left w:val="single" w:color="CCCCCC" w:sz="1"/>
+              <w:bottom w:val="single" w:color="CCCCCC" w:sz="1"/>
+              <w:right w:val="single" w:color="CCCCCC" w:sz="1"/>
+            </w:tcBorders>
+            <w:shd w:fill="FFFFFF" w:val="clear"/>
+            <w:tcMar>
+              <w:top w:type="dxa" w:w="80"/>
+              <w:left w:type="dxa" w:w="120"/>
+              <w:bottom w:type="dxa" w:w="80"/>
+              <w:right w:type="dxa" w:w="120"/>
+            </w:tcMar>
+            <w:vAlign w:val="center"/>
+          </w:tcPr>
+          <w:p>
+            <w:r>
+              <w:rPr>
+                <w:rFonts w:ascii="Arial" w:cs="Arial" w:eastAsia="Arial" w:hAnsi="Arial"/>
+                <w:b w:val="false"/>
+                <w:bCs w:val="false"/>
+                <w:color w:val="000000"/>
+                <w:sz w:val="18"/>
+                <w:szCs w:val="18"/>
+              </w:rPr>
+              <w:t xml:space="preserve">5.0</w:t>
+            </w:r>
+          </w:p>
+        </w:tc>
+        <w:tc>
+          <w:tcPr>
+            <w:tcW w:type="dxa" w:w="900"/>
+            <w:tcBorders>
+              <w:top w:val="single" w:color="CCCCCC" w:sz="1"/>
+              <w:left w:val="single" w:color="CCCCCC" w:sz="1"/>
+              <w:bottom w:val="single" w:color="CCCCCC" w:sz="1"/>
+              <w:right w:val="single" w:color="CCCCCC" w:sz="1"/>
+            </w:tcBorders>
+            <w:shd w:fill="FFFFFF" w:val="clear"/>
+            <w:tcMar>
+              <w:top w:type="dxa" w:w="80"/>
+              <w:left w:type="dxa" w:w="120"/>
+              <w:bottom w:type="dxa" w:w="80"/>
+              <w:right w:type="dxa" w:w="120"/>
+            </w:tcMar>
+            <w:vAlign w:val="center"/>
+          </w:tcPr>
+          <w:p>
+            <w:r>
+              <w:rPr>
+                <w:rFonts w:ascii="Arial" w:cs="Arial" w:eastAsia="Arial" w:hAnsi="Arial"/>
+                <w:b w:val="false"/>
+                <w:bCs w:val="false"/>
+                <w:color w:val="000000"/>
+                <w:sz w:val="18"/>
+                <w:szCs w:val="18"/>
+              </w:rPr>
+              <w:t xml:space="preserve">14244.7</w:t>
+            </w:r>
+          </w:p>
+        </w:tc>
+        <w:tc>
+          <w:tcPr>
+            <w:tcW w:type="dxa" w:w="600"/>
+            <w:tcBorders>
+              <w:top w:val="single" w:color="CCCCCC" w:sz="1"/>
+              <w:left w:val="single" w:color="CCCCCC" w:sz="1"/>
+              <w:bottom w:val="single" w:color="CCCCCC" w:sz="1"/>
+              <w:right w:val="single" w:color="CCCCCC" w:sz="1"/>
+            </w:tcBorders>
+            <w:shd w:fill="FFFFFF" w:val="clear"/>
+            <w:tcMar>
+              <w:top w:type="dxa" w:w="80"/>
+              <w:left w:type="dxa" w:w="120"/>
+              <w:bottom w:type="dxa" w:w="80"/>
+              <w:right w:type="dxa" w:w="120"/>
+            </w:tcMar>
+            <w:vAlign w:val="center"/>
+          </w:tcPr>
+          <w:p>
+            <w:r>
+              <w:rPr>
+                <w:rFonts w:ascii="Arial" w:cs="Arial" w:eastAsia="Arial" w:hAnsi="Arial"/>
+                <w:b w:val="false"/>
+                <w:bCs w:val="false"/>
+                <w:color w:val="000000"/>
+                <w:sz w:val="18"/>
+                <w:szCs w:val="18"/>
+              </w:rPr>
+              <w:t xml:space="preserve">149.66</w:t>
+            </w:r>
+          </w:p>
+        </w:tc>
+        <w:tc>
+          <w:tcPr>
+            <w:tcW w:type="dxa" w:w="600"/>
+            <w:tcBorders>
+              <w:top w:val="single" w:color="CCCCCC" w:sz="1"/>
+              <w:left w:val="single" w:color="CCCCCC" w:sz="1"/>
+              <w:bottom w:val="single" w:color="CCCCCC" w:sz="1"/>
+              <w:right w:val="single" w:color="CCCCCC" w:sz="1"/>
+            </w:tcBorders>
+            <w:shd w:fill="FFFFFF" w:val="clear"/>
+            <w:tcMar>
+              <w:top w:type="dxa" w:w="80"/>
+              <w:left w:type="dxa" w:w="120"/>
+              <w:bottom w:type="dxa" w:w="80"/>
+              <w:right w:type="dxa" w:w="120"/>
+            </w:tcMar>
+            <w:vAlign w:val="center"/>
+          </w:tcPr>
+          <w:p>
+            <w:r>
+              <w:rPr>
+                <w:rFonts w:ascii="Arial" w:cs="Arial" w:eastAsia="Arial" w:hAnsi="Arial"/>
+                <w:b w:val="false"/>
+                <w:bCs w:val="false"/>
+                <w:color w:val="000000"/>
+                <w:sz w:val="18"/>
+                <w:szCs w:val="18"/>
+              </w:rPr>
+              <w:t xml:space="preserve">1</w:t>
+            </w:r>
+          </w:p>
+        </w:tc>
+        <w:tc>
+          <w:tcPr>
+            <w:tcW w:type="dxa" w:w="1500"/>
+            <w:tcBorders>
+              <w:top w:val="single" w:color="CCCCCC" w:sz="1"/>
+              <w:left w:val="single" w:color="CCCCCC" w:sz="1"/>
+              <w:bottom w:val="single" w:color="CCCCCC" w:sz="1"/>
+              <w:right w:val="single" w:color="CCCCCC" w:sz="1"/>
+            </w:tcBorders>
+            <w:shd w:fill="FFFFFF" w:val="clear"/>
+            <w:tcMar>
+              <w:top w:type="dxa" w:w="80"/>
+              <w:left w:type="dxa" w:w="120"/>
+              <w:bottom w:type="dxa" w:w="80"/>
+              <w:right w:type="dxa" w:w="120"/>
+            </w:tcMar>
+            <w:vAlign w:val="center"/>
+          </w:tcPr>
+          <w:p>
+            <w:r>
+              <w:rPr>
+                <w:rFonts w:ascii="Arial" w:cs="Arial" w:eastAsia="Arial" w:hAnsi="Arial"/>
+                <w:b w:val="false"/>
+                <w:bCs w:val="false"/>
+                <w:color w:val="000000"/>
+                <w:sz w:val="18"/>
+                <w:szCs w:val="18"/>
+              </w:rPr>
+              <w:t xml:space="preserve">NEW BEST: 14,245 chunks/s. FP8 + 4 replicas. ITL best ever at 5.0ms. 1 error in 13,507 reqs (0.007%) — negligible. TTFT slightly higher than BF16-r4 (1366 vs 1258ms) due to dequantization overhead on prefill.</w:t>
             </w:r>
           </w:p>
         </w:tc>
@@ -4872,6 +5772,74 @@
     </w:p>
     <w:p>
       <w:pPr>
+        <w:pStyle w:val="ListParagraph"/>
+        <w:numPr>
+          <w:ilvl w:val="0"/>
+          <w:numId w:val="2"/>
+        </w:numPr>
+      </w:pPr>
+      <w:r>
+        <w:rPr>
+          <w:rFonts w:ascii="Arial" w:cs="Arial" w:eastAsia="Arial" w:hAnsi="Arial"/>
+          <w:sz w:val="22"/>
+          <w:szCs w:val="22"/>
+        </w:rPr>
+        <w:t xml:space="preserve">FP8 quantization (--quantization fp8) improves single-replica TTFT by 14% and ITL by 10% vs BF16.</w:t>
+      </w:r>
+    </w:p>
+    <w:p>
+      <w:pPr>
+        <w:pStyle w:val="ListParagraph"/>
+        <w:numPr>
+          <w:ilvl w:val="0"/>
+          <w:numId w:val="2"/>
+        </w:numPr>
+      </w:pPr>
+      <w:r>
+        <w:rPr>
+          <w:rFonts w:ascii="Arial" w:cs="Arial" w:eastAsia="Arial" w:hAnsi="Arial"/>
+          <w:sz w:val="22"/>
+          <w:szCs w:val="22"/>
+        </w:rPr>
+        <w:t xml:space="preserve">FP8 r4 achieves 14,245 chunks/s — new best, 29% above the capstone 4-replica reference (11,064).</w:t>
+      </w:r>
+    </w:p>
+    <w:p>
+      <w:pPr>
+        <w:pStyle w:val="ListParagraph"/>
+        <w:numPr>
+          <w:ilvl w:val="0"/>
+          <w:numId w:val="2"/>
+        </w:numPr>
+      </w:pPr>
+      <w:r>
+        <w:rPr>
+          <w:rFonts w:ascii="Arial" w:cs="Arial" w:eastAsia="Arial" w:hAnsi="Arial"/>
+          <w:sz w:val="22"/>
+          <w:szCs w:val="22"/>
+        </w:rPr>
+        <w:t xml:space="preserve">FP8 TTFT slightly higher than BF16 at scale (1366 vs 1258ms) — dequantization adds prefill overhead.</w:t>
+      </w:r>
+    </w:p>
+    <w:p>
+      <w:pPr>
+        <w:pStyle w:val="ListParagraph"/>
+        <w:numPr>
+          <w:ilvl w:val="0"/>
+          <w:numId w:val="2"/>
+        </w:numPr>
+      </w:pPr>
+      <w:r>
+        <w:rPr>
+          <w:rFonts w:ascii="Arial" w:cs="Arial" w:eastAsia="Arial" w:hAnsi="Arial"/>
+          <w:sz w:val="22"/>
+          <w:szCs w:val="22"/>
+        </w:rPr>
+        <w:t xml:space="preserve">Required patching modal_infertutor_app.py and run_infertutor_experiment.py to support --quantization flag.</w:t>
+      </w:r>
+    </w:p>
+    <w:p>
+      <w:pPr>
         <w:pStyle w:val="Heading2"/>
         <w:spacing w:before="240"/>
       </w:pPr>
@@ -4978,7 +5946,7 @@
           <w:sz w:val="22"/>
           <w:szCs w:val="22"/>
         </w:rPr>
-        <w:t xml:space="preserve">✓ Final best run: compiled-text-r4 at 400 users — 13,845 chunks/s, 0 errors, TTFT 1258ms</w:t>
+        <w:t xml:space="preserve">✓ Final best run: quant-fp8-r4 at 400 users — 14,245 chunks/s, 0.007% errors, TTFT 1366ms</w:t>
       </w:r>
     </w:p>
     <w:p>
@@ -5002,7 +5970,7 @@
           <w:sz w:val="22"/>
           <w:szCs w:val="22"/>
         </w:rPr>
-        <w:t xml:space="preserve">Best configuration: compiled-text-r4 (400 users, 4 replicas, compiled mode, prefix cache ON, chunked prefill ON, seq32/b4096)</w:t>
+        <w:t xml:space="preserve">Best configuration: quant-fp8-r4 (400 users, 4 replicas, compiled mode, FP8 quantization, prefix cache ON, chunked prefill ON, seq32/b4096)</w:t>
       </w:r>
     </w:p>
     <w:tbl>
@@ -5214,7 +6182,7 @@
                 <w:sz w:val="18"/>
                 <w:szCs w:val="18"/>
               </w:rPr>
-              <w:t xml:space="preserve">13,845 chunks/s  (+25% vs reference)</w:t>
+              <w:t xml:space="preserve">14,245 chunks/s  (+29% vs reference)</w:t>
             </w:r>
           </w:p>
         </w:tc>
@@ -5280,7 +6248,7 @@
                 <w:sz w:val="18"/>
                 <w:szCs w:val="18"/>
               </w:rPr>
-              <w:t xml:space="preserve">1,258 ms  (ref: 1,942 ms — 35% better)</w:t>
+              <w:t xml:space="preserve">1,366 ms  (ref: 1,942 ms — 30% better)</w:t>
             </w:r>
           </w:p>
         </w:tc>
@@ -5346,7 +6314,7 @@
                 <w:sz w:val="18"/>
                 <w:szCs w:val="18"/>
               </w:rPr>
-              <w:t xml:space="preserve">5.7 ms  (ref: 16.2 ms — 65% better)</w:t>
+              <w:t xml:space="preserve">5.0 ms  (ref: 16.2 ms — 69% better)</w:t>
             </w:r>
           </w:p>
         </w:tc>
@@ -5412,7 +6380,7 @@
                 <w:sz w:val="18"/>
                 <w:szCs w:val="18"/>
               </w:rPr>
-              <w:t xml:space="preserve">0%</w:t>
+              <w:t xml:space="preserve">0.007%  (1 error / 13,507 requests)</w:t>
             </w:r>
           </w:p>
         </w:tc>
@@ -5610,7 +6578,7 @@
                 <w:sz w:val="18"/>
                 <w:szCs w:val="18"/>
               </w:rPr>
-              <w:t xml:space="preserve">13,103 in 90s</w:t>
+              <w:t xml:space="preserve">13,507 in 90s</w:t>
             </w:r>
           </w:p>
         </w:tc>
@@ -5667,7 +6635,7 @@
           <w:sz w:val="22"/>
           <w:szCs w:val="22"/>
         </w:rPr>
-        <w:t xml:space="preserve">3. Prefix cache ON: 32% TTFT reduction — fixed prompt set creates high cache hit rate.</w:t>
+        <w:t xml:space="preserve">3. FP8 quantization (--quantization fp8): halves model weight bytes, raises arithmetic intensity, +4% throughput.</w:t>
       </w:r>
     </w:p>
     <w:p>
@@ -5680,7 +6648,20 @@
           <w:sz w:val="22"/>
           <w:szCs w:val="22"/>
         </w:rPr>
-        <w:t xml:space="preserve">4. Default batch knobs (seq32/b4096): wider batches hurt; smaller batches keep decode steps fast.</w:t>
+        <w:t xml:space="preserve">4. Prefix cache ON: 32% TTFT reduction — fixed prompt set creates high cache hit rate.</w:t>
+      </w:r>
+    </w:p>
+    <w:p>
+      <w:pPr>
+        <w:spacing w:before="60"/>
+      </w:pPr>
+      <w:r>
+        <w:rPr>
+          <w:rFonts w:ascii="Arial" w:cs="Arial" w:eastAsia="Arial" w:hAnsi="Arial"/>
+          <w:sz w:val="22"/>
+          <w:szCs w:val="22"/>
+        </w:rPr>
+        <w:t xml:space="preserve">5. Default batch knobs (seq32/b4096): wider batches hurt; smaller batches keep decode steps fast.</w:t>
       </w:r>
     </w:p>
     <w:p>

</xml_diff>

<commit_message>
Add TP=2 and reduced context experiments, complete experiment matrix
</commit_message>
<xml_diff>
--- a/InferTutor_Experiments.docx
+++ b/InferTutor_Experiments.docx
@@ -5570,6 +5570,906 @@
                 <w:szCs w:val="18"/>
               </w:rPr>
               <w:t xml:space="preserve">NEW BEST: 14,245 chunks/s. FP8 + 4 replicas. ITL best ever at 5.0ms. 1 error in 13,507 reqs (0.007%) — negligible. TTFT slightly higher than BF16-r4 (1366 vs 1258ms) due to dequantization overhead on prefill.</w:t>
+            </w:r>
+          </w:p>
+        </w:tc>
+      </w:tr>
+      <w:tr>
+        <w:tc>
+          <w:tcPr>
+            <w:tcW w:type="dxa" w:w="900"/>
+            <w:tcBorders>
+              <w:top w:val="single" w:color="CCCCCC" w:sz="1"/>
+              <w:left w:val="single" w:color="CCCCCC" w:sz="1"/>
+              <w:bottom w:val="single" w:color="CCCCCC" w:sz="1"/>
+              <w:right w:val="single" w:color="CCCCCC" w:sz="1"/>
+            </w:tcBorders>
+            <w:shd w:fill="E2EFDA" w:val="clear"/>
+            <w:tcMar>
+              <w:top w:type="dxa" w:w="80"/>
+              <w:left w:type="dxa" w:w="120"/>
+              <w:bottom w:type="dxa" w:w="80"/>
+              <w:right w:type="dxa" w:w="120"/>
+            </w:tcMar>
+            <w:vAlign w:val="center"/>
+          </w:tcPr>
+          <w:p>
+            <w:r>
+              <w:rPr>
+                <w:rFonts w:ascii="Arial" w:cs="Arial" w:eastAsia="Arial" w:hAnsi="Arial"/>
+                <w:b w:val="false"/>
+                <w:bCs w:val="false"/>
+                <w:color w:val="000000"/>
+                <w:sz w:val="18"/>
+                <w:szCs w:val="18"/>
+              </w:rPr>
+              <w:t xml:space="preserve">TP=2, 2 replicas</w:t>
+            </w:r>
+          </w:p>
+        </w:tc>
+        <w:tc>
+          <w:tcPr>
+            <w:tcW w:type="dxa" w:w="1400"/>
+            <w:tcBorders>
+              <w:top w:val="single" w:color="CCCCCC" w:sz="1"/>
+              <w:left w:val="single" w:color="CCCCCC" w:sz="1"/>
+              <w:bottom w:val="single" w:color="CCCCCC" w:sz="1"/>
+              <w:right w:val="single" w:color="CCCCCC" w:sz="1"/>
+            </w:tcBorders>
+            <w:shd w:fill="E2EFDA" w:val="clear"/>
+            <w:tcMar>
+              <w:top w:type="dxa" w:w="80"/>
+              <w:left w:type="dxa" w:w="120"/>
+              <w:bottom w:type="dxa" w:w="80"/>
+              <w:right w:type="dxa" w:w="120"/>
+            </w:tcMar>
+            <w:vAlign w:val="center"/>
+          </w:tcPr>
+          <w:p>
+            <w:r>
+              <w:rPr>
+                <w:rFonts w:ascii="Arial" w:cs="Arial" w:eastAsia="Arial" w:hAnsi="Arial"/>
+                <w:b w:val="false"/>
+                <w:bCs w:val="false"/>
+                <w:color w:val="000000"/>
+                <w:sz w:val="18"/>
+                <w:szCs w:val="18"/>
+              </w:rPr>
+              <w:t xml:space="preserve">tp2-r2</w:t>
+            </w:r>
+          </w:p>
+        </w:tc>
+        <w:tc>
+          <w:tcPr>
+            <w:tcW w:type="dxa" w:w="500"/>
+            <w:tcBorders>
+              <w:top w:val="single" w:color="CCCCCC" w:sz="1"/>
+              <w:left w:val="single" w:color="CCCCCC" w:sz="1"/>
+              <w:bottom w:val="single" w:color="CCCCCC" w:sz="1"/>
+              <w:right w:val="single" w:color="CCCCCC" w:sz="1"/>
+            </w:tcBorders>
+            <w:shd w:fill="E2EFDA" w:val="clear"/>
+            <w:tcMar>
+              <w:top w:type="dxa" w:w="80"/>
+              <w:left w:type="dxa" w:w="120"/>
+              <w:bottom w:type="dxa" w:w="80"/>
+              <w:right w:type="dxa" w:w="120"/>
+            </w:tcMar>
+            <w:vAlign w:val="center"/>
+          </w:tcPr>
+          <w:p>
+            <w:r>
+              <w:rPr>
+                <w:rFonts w:ascii="Arial" w:cs="Arial" w:eastAsia="Arial" w:hAnsi="Arial"/>
+                <w:b w:val="false"/>
+                <w:bCs w:val="false"/>
+                <w:color w:val="000000"/>
+                <w:sz w:val="18"/>
+                <w:szCs w:val="18"/>
+              </w:rPr>
+              <w:t xml:space="preserve">2</w:t>
+            </w:r>
+          </w:p>
+        </w:tc>
+        <w:tc>
+          <w:tcPr>
+            <w:tcW w:type="dxa" w:w="500"/>
+            <w:tcBorders>
+              <w:top w:val="single" w:color="CCCCCC" w:sz="1"/>
+              <w:left w:val="single" w:color="CCCCCC" w:sz="1"/>
+              <w:bottom w:val="single" w:color="CCCCCC" w:sz="1"/>
+              <w:right w:val="single" w:color="CCCCCC" w:sz="1"/>
+            </w:tcBorders>
+            <w:shd w:fill="E2EFDA" w:val="clear"/>
+            <w:tcMar>
+              <w:top w:type="dxa" w:w="80"/>
+              <w:left w:type="dxa" w:w="120"/>
+              <w:bottom w:type="dxa" w:w="80"/>
+              <w:right w:type="dxa" w:w="120"/>
+            </w:tcMar>
+            <w:vAlign w:val="center"/>
+          </w:tcPr>
+          <w:p>
+            <w:r>
+              <w:rPr>
+                <w:rFonts w:ascii="Arial" w:cs="Arial" w:eastAsia="Arial" w:hAnsi="Arial"/>
+                <w:b w:val="false"/>
+                <w:bCs w:val="false"/>
+                <w:color w:val="000000"/>
+                <w:sz w:val="18"/>
+                <w:szCs w:val="18"/>
+              </w:rPr>
+              <w:t xml:space="preserve">text</w:t>
+            </w:r>
+          </w:p>
+        </w:tc>
+        <w:tc>
+          <w:tcPr>
+            <w:tcW w:type="dxa" w:w="500"/>
+            <w:tcBorders>
+              <w:top w:val="single" w:color="CCCCCC" w:sz="1"/>
+              <w:left w:val="single" w:color="CCCCCC" w:sz="1"/>
+              <w:bottom w:val="single" w:color="CCCCCC" w:sz="1"/>
+              <w:right w:val="single" w:color="CCCCCC" w:sz="1"/>
+            </w:tcBorders>
+            <w:shd w:fill="E2EFDA" w:val="clear"/>
+            <w:tcMar>
+              <w:top w:type="dxa" w:w="80"/>
+              <w:left w:type="dxa" w:w="120"/>
+              <w:bottom w:type="dxa" w:w="80"/>
+              <w:right w:type="dxa" w:w="120"/>
+            </w:tcMar>
+            <w:vAlign w:val="center"/>
+          </w:tcPr>
+          <w:p>
+            <w:r>
+              <w:rPr>
+                <w:rFonts w:ascii="Arial" w:cs="Arial" w:eastAsia="Arial" w:hAnsi="Arial"/>
+                <w:b w:val="false"/>
+                <w:bCs w:val="false"/>
+                <w:color w:val="000000"/>
+                <w:sz w:val="18"/>
+                <w:szCs w:val="18"/>
+              </w:rPr>
+              <w:t xml:space="preserve">400</w:t>
+            </w:r>
+          </w:p>
+        </w:tc>
+        <w:tc>
+          <w:tcPr>
+            <w:tcW w:type="dxa" w:w="700"/>
+            <w:tcBorders>
+              <w:top w:val="single" w:color="CCCCCC" w:sz="1"/>
+              <w:left w:val="single" w:color="CCCCCC" w:sz="1"/>
+              <w:bottom w:val="single" w:color="CCCCCC" w:sz="1"/>
+              <w:right w:val="single" w:color="CCCCCC" w:sz="1"/>
+            </w:tcBorders>
+            <w:shd w:fill="E2EFDA" w:val="clear"/>
+            <w:tcMar>
+              <w:top w:type="dxa" w:w="80"/>
+              <w:left w:type="dxa" w:w="120"/>
+              <w:bottom w:type="dxa" w:w="80"/>
+              <w:right w:type="dxa" w:w="120"/>
+            </w:tcMar>
+            <w:vAlign w:val="center"/>
+          </w:tcPr>
+          <w:p>
+            <w:r>
+              <w:rPr>
+                <w:rFonts w:ascii="Arial" w:cs="Arial" w:eastAsia="Arial" w:hAnsi="Arial"/>
+                <w:b w:val="false"/>
+                <w:bCs w:val="false"/>
+                <w:color w:val="000000"/>
+                <w:sz w:val="18"/>
+                <w:szCs w:val="18"/>
+              </w:rPr>
+              <w:t xml:space="preserve">false</w:t>
+            </w:r>
+          </w:p>
+        </w:tc>
+        <w:tc>
+          <w:tcPr>
+            <w:tcW w:type="dxa" w:w="600"/>
+            <w:tcBorders>
+              <w:top w:val="single" w:color="CCCCCC" w:sz="1"/>
+              <w:left w:val="single" w:color="CCCCCC" w:sz="1"/>
+              <w:bottom w:val="single" w:color="CCCCCC" w:sz="1"/>
+              <w:right w:val="single" w:color="CCCCCC" w:sz="1"/>
+            </w:tcBorders>
+            <w:shd w:fill="E2EFDA" w:val="clear"/>
+            <w:tcMar>
+              <w:top w:type="dxa" w:w="80"/>
+              <w:left w:type="dxa" w:w="120"/>
+              <w:bottom w:type="dxa" w:w="80"/>
+              <w:right w:type="dxa" w:w="120"/>
+            </w:tcMar>
+            <w:vAlign w:val="center"/>
+          </w:tcPr>
+          <w:p>
+            <w:r>
+              <w:rPr>
+                <w:rFonts w:ascii="Arial" w:cs="Arial" w:eastAsia="Arial" w:hAnsi="Arial"/>
+                <w:b w:val="false"/>
+                <w:bCs w:val="false"/>
+                <w:color w:val="000000"/>
+                <w:sz w:val="18"/>
+                <w:szCs w:val="18"/>
+              </w:rPr>
+              <w:t xml:space="preserve">32</w:t>
+            </w:r>
+          </w:p>
+        </w:tc>
+        <w:tc>
+          <w:tcPr>
+            <w:tcW w:type="dxa" w:w="800"/>
+            <w:tcBorders>
+              <w:top w:val="single" w:color="CCCCCC" w:sz="1"/>
+              <w:left w:val="single" w:color="CCCCCC" w:sz="1"/>
+              <w:bottom w:val="single" w:color="CCCCCC" w:sz="1"/>
+              <w:right w:val="single" w:color="CCCCCC" w:sz="1"/>
+            </w:tcBorders>
+            <w:shd w:fill="E2EFDA" w:val="clear"/>
+            <w:tcMar>
+              <w:top w:type="dxa" w:w="80"/>
+              <w:left w:type="dxa" w:w="120"/>
+              <w:bottom w:type="dxa" w:w="80"/>
+              <w:right w:type="dxa" w:w="120"/>
+            </w:tcMar>
+            <w:vAlign w:val="center"/>
+          </w:tcPr>
+          <w:p>
+            <w:r>
+              <w:rPr>
+                <w:rFonts w:ascii="Arial" w:cs="Arial" w:eastAsia="Arial" w:hAnsi="Arial"/>
+                <w:b w:val="false"/>
+                <w:bCs w:val="false"/>
+                <w:color w:val="000000"/>
+                <w:sz w:val="18"/>
+                <w:szCs w:val="18"/>
+              </w:rPr>
+              <w:t xml:space="preserve">4096</w:t>
+            </w:r>
+          </w:p>
+        </w:tc>
+        <w:tc>
+          <w:tcPr>
+            <w:tcW w:type="dxa" w:w="800"/>
+            <w:tcBorders>
+              <w:top w:val="single" w:color="CCCCCC" w:sz="1"/>
+              <w:left w:val="single" w:color="CCCCCC" w:sz="1"/>
+              <w:bottom w:val="single" w:color="CCCCCC" w:sz="1"/>
+              <w:right w:val="single" w:color="CCCCCC" w:sz="1"/>
+            </w:tcBorders>
+            <w:shd w:fill="E2EFDA" w:val="clear"/>
+            <w:tcMar>
+              <w:top w:type="dxa" w:w="80"/>
+              <w:left w:type="dxa" w:w="120"/>
+              <w:bottom w:type="dxa" w:w="80"/>
+              <w:right w:type="dxa" w:w="120"/>
+            </w:tcMar>
+            <w:vAlign w:val="center"/>
+          </w:tcPr>
+          <w:p>
+            <w:r>
+              <w:rPr>
+                <w:rFonts w:ascii="Arial" w:cs="Arial" w:eastAsia="Arial" w:hAnsi="Arial"/>
+                <w:b w:val="false"/>
+                <w:bCs w:val="false"/>
+                <w:color w:val="000000"/>
+                <w:sz w:val="18"/>
+                <w:szCs w:val="18"/>
+              </w:rPr>
+              <w:t xml:space="preserve">3073.0</w:t>
+            </w:r>
+          </w:p>
+        </w:tc>
+        <w:tc>
+          <w:tcPr>
+            <w:tcW w:type="dxa" w:w="700"/>
+            <w:tcBorders>
+              <w:top w:val="single" w:color="CCCCCC" w:sz="1"/>
+              <w:left w:val="single" w:color="CCCCCC" w:sz="1"/>
+              <w:bottom w:val="single" w:color="CCCCCC" w:sz="1"/>
+              <w:right w:val="single" w:color="CCCCCC" w:sz="1"/>
+            </w:tcBorders>
+            <w:shd w:fill="E2EFDA" w:val="clear"/>
+            <w:tcMar>
+              <w:top w:type="dxa" w:w="80"/>
+              <w:left w:type="dxa" w:w="120"/>
+              <w:bottom w:type="dxa" w:w="80"/>
+              <w:right w:type="dxa" w:w="120"/>
+            </w:tcMar>
+            <w:vAlign w:val="center"/>
+          </w:tcPr>
+          <w:p>
+            <w:r>
+              <w:rPr>
+                <w:rFonts w:ascii="Arial" w:cs="Arial" w:eastAsia="Arial" w:hAnsi="Arial"/>
+                <w:b w:val="false"/>
+                <w:bCs w:val="false"/>
+                <w:color w:val="000000"/>
+                <w:sz w:val="18"/>
+                <w:szCs w:val="18"/>
+              </w:rPr>
+              <w:t xml:space="preserve">4.5</w:t>
+            </w:r>
+          </w:p>
+        </w:tc>
+        <w:tc>
+          <w:tcPr>
+            <w:tcW w:type="dxa" w:w="900"/>
+            <w:tcBorders>
+              <w:top w:val="single" w:color="CCCCCC" w:sz="1"/>
+              <w:left w:val="single" w:color="CCCCCC" w:sz="1"/>
+              <w:bottom w:val="single" w:color="CCCCCC" w:sz="1"/>
+              <w:right w:val="single" w:color="CCCCCC" w:sz="1"/>
+            </w:tcBorders>
+            <w:shd w:fill="E2EFDA" w:val="clear"/>
+            <w:tcMar>
+              <w:top w:type="dxa" w:w="80"/>
+              <w:left w:type="dxa" w:w="120"/>
+              <w:bottom w:type="dxa" w:w="80"/>
+              <w:right w:type="dxa" w:w="120"/>
+            </w:tcMar>
+            <w:vAlign w:val="center"/>
+          </w:tcPr>
+          <w:p>
+            <w:r>
+              <w:rPr>
+                <w:rFonts w:ascii="Arial" w:cs="Arial" w:eastAsia="Arial" w:hAnsi="Arial"/>
+                <w:b w:val="false"/>
+                <w:bCs w:val="false"/>
+                <w:color w:val="000000"/>
+                <w:sz w:val="18"/>
+                <w:szCs w:val="18"/>
+              </w:rPr>
+              <w:t xml:space="preserve">8261.3</w:t>
+            </w:r>
+          </w:p>
+        </w:tc>
+        <w:tc>
+          <w:tcPr>
+            <w:tcW w:type="dxa" w:w="600"/>
+            <w:tcBorders>
+              <w:top w:val="single" w:color="CCCCCC" w:sz="1"/>
+              <w:left w:val="single" w:color="CCCCCC" w:sz="1"/>
+              <w:bottom w:val="single" w:color="CCCCCC" w:sz="1"/>
+              <w:right w:val="single" w:color="CCCCCC" w:sz="1"/>
+            </w:tcBorders>
+            <w:shd w:fill="E2EFDA" w:val="clear"/>
+            <w:tcMar>
+              <w:top w:type="dxa" w:w="80"/>
+              <w:left w:type="dxa" w:w="120"/>
+              <w:bottom w:type="dxa" w:w="80"/>
+              <w:right w:type="dxa" w:w="120"/>
+            </w:tcMar>
+            <w:vAlign w:val="center"/>
+          </w:tcPr>
+          <w:p>
+            <w:r>
+              <w:rPr>
+                <w:rFonts w:ascii="Arial" w:cs="Arial" w:eastAsia="Arial" w:hAnsi="Arial"/>
+                <w:b w:val="false"/>
+                <w:bCs w:val="false"/>
+                <w:color w:val="000000"/>
+                <w:sz w:val="18"/>
+                <w:szCs w:val="18"/>
+              </w:rPr>
+              <w:t xml:space="preserve">86.33</w:t>
+            </w:r>
+          </w:p>
+        </w:tc>
+        <w:tc>
+          <w:tcPr>
+            <w:tcW w:type="dxa" w:w="600"/>
+            <w:tcBorders>
+              <w:top w:val="single" w:color="CCCCCC" w:sz="1"/>
+              <w:left w:val="single" w:color="CCCCCC" w:sz="1"/>
+              <w:bottom w:val="single" w:color="CCCCCC" w:sz="1"/>
+              <w:right w:val="single" w:color="CCCCCC" w:sz="1"/>
+            </w:tcBorders>
+            <w:shd w:fill="E2EFDA" w:val="clear"/>
+            <w:tcMar>
+              <w:top w:type="dxa" w:w="80"/>
+              <w:left w:type="dxa" w:w="120"/>
+              <w:bottom w:type="dxa" w:w="80"/>
+              <w:right w:type="dxa" w:w="120"/>
+            </w:tcMar>
+            <w:vAlign w:val="center"/>
+          </w:tcPr>
+          <w:p>
+            <w:r>
+              <w:rPr>
+                <w:rFonts w:ascii="Arial" w:cs="Arial" w:eastAsia="Arial" w:hAnsi="Arial"/>
+                <w:b w:val="false"/>
+                <w:bCs w:val="false"/>
+                <w:color w:val="000000"/>
+                <w:sz w:val="18"/>
+                <w:szCs w:val="18"/>
+              </w:rPr>
+              <w:t xml:space="preserve">0</w:t>
+            </w:r>
+          </w:p>
+        </w:tc>
+        <w:tc>
+          <w:tcPr>
+            <w:tcW w:type="dxa" w:w="1500"/>
+            <w:tcBorders>
+              <w:top w:val="single" w:color="CCCCCC" w:sz="1"/>
+              <w:left w:val="single" w:color="CCCCCC" w:sz="1"/>
+              <w:bottom w:val="single" w:color="CCCCCC" w:sz="1"/>
+              <w:right w:val="single" w:color="CCCCCC" w:sz="1"/>
+            </w:tcBorders>
+            <w:shd w:fill="E2EFDA" w:val="clear"/>
+            <w:tcMar>
+              <w:top w:type="dxa" w:w="80"/>
+              <w:left w:type="dxa" w:w="120"/>
+              <w:bottom w:type="dxa" w:w="80"/>
+              <w:right w:type="dxa" w:w="120"/>
+            </w:tcMar>
+            <w:vAlign w:val="center"/>
+          </w:tcPr>
+          <w:p>
+            <w:r>
+              <w:rPr>
+                <w:rFonts w:ascii="Arial" w:cs="Arial" w:eastAsia="Arial" w:hAnsi="Arial"/>
+                <w:b w:val="false"/>
+                <w:bCs w:val="false"/>
+                <w:color w:val="000000"/>
+                <w:sz w:val="18"/>
+                <w:szCs w:val="18"/>
+              </w:rPr>
+              <w:t xml:space="preserve">TP=2 halves throughput vs 4 independent replicas. NVLink all-reduce on every attention layer dominates. TP only pays off when model doesn't fit on 1 GPU. For 4B model: always prefer TP=1 with more replicas.</w:t>
+            </w:r>
+          </w:p>
+        </w:tc>
+      </w:tr>
+      <w:tr>
+        <w:tc>
+          <w:tcPr>
+            <w:tcW w:type="dxa" w:w="900"/>
+            <w:tcBorders>
+              <w:top w:val="single" w:color="CCCCCC" w:sz="1"/>
+              <w:left w:val="single" w:color="CCCCCC" w:sz="1"/>
+              <w:bottom w:val="single" w:color="CCCCCC" w:sz="1"/>
+              <w:right w:val="single" w:color="CCCCCC" w:sz="1"/>
+            </w:tcBorders>
+            <w:shd w:fill="FFFFFF" w:val="clear"/>
+            <w:tcMar>
+              <w:top w:type="dxa" w:w="80"/>
+              <w:left w:type="dxa" w:w="120"/>
+              <w:bottom w:type="dxa" w:w="80"/>
+              <w:right w:type="dxa" w:w="120"/>
+            </w:tcMar>
+            <w:vAlign w:val="center"/>
+          </w:tcPr>
+          <w:p>
+            <w:r>
+              <w:rPr>
+                <w:rFonts w:ascii="Arial" w:cs="Arial" w:eastAsia="Arial" w:hAnsi="Arial"/>
+                <w:b w:val="false"/>
+                <w:bCs w:val="false"/>
+                <w:color w:val="000000"/>
+                <w:sz w:val="18"/>
+                <w:szCs w:val="18"/>
+              </w:rPr>
+              <w:t xml:space="preserve">FP8 r4 len=4096</w:t>
+            </w:r>
+          </w:p>
+        </w:tc>
+        <w:tc>
+          <w:tcPr>
+            <w:tcW w:type="dxa" w:w="1400"/>
+            <w:tcBorders>
+              <w:top w:val="single" w:color="CCCCCC" w:sz="1"/>
+              <w:left w:val="single" w:color="CCCCCC" w:sz="1"/>
+              <w:bottom w:val="single" w:color="CCCCCC" w:sz="1"/>
+              <w:right w:val="single" w:color="CCCCCC" w:sz="1"/>
+            </w:tcBorders>
+            <w:shd w:fill="FFFFFF" w:val="clear"/>
+            <w:tcMar>
+              <w:top w:type="dxa" w:w="80"/>
+              <w:left w:type="dxa" w:w="120"/>
+              <w:bottom w:type="dxa" w:w="80"/>
+              <w:right w:type="dxa" w:w="120"/>
+            </w:tcMar>
+            <w:vAlign w:val="center"/>
+          </w:tcPr>
+          <w:p>
+            <w:r>
+              <w:rPr>
+                <w:rFonts w:ascii="Arial" w:cs="Arial" w:eastAsia="Arial" w:hAnsi="Arial"/>
+                <w:b w:val="false"/>
+                <w:bCs w:val="false"/>
+                <w:color w:val="000000"/>
+                <w:sz w:val="18"/>
+                <w:szCs w:val="18"/>
+              </w:rPr>
+              <w:t xml:space="preserve">fp8-r4-len4096</w:t>
+            </w:r>
+          </w:p>
+        </w:tc>
+        <w:tc>
+          <w:tcPr>
+            <w:tcW w:type="dxa" w:w="500"/>
+            <w:tcBorders>
+              <w:top w:val="single" w:color="CCCCCC" w:sz="1"/>
+              <w:left w:val="single" w:color="CCCCCC" w:sz="1"/>
+              <w:bottom w:val="single" w:color="CCCCCC" w:sz="1"/>
+              <w:right w:val="single" w:color="CCCCCC" w:sz="1"/>
+            </w:tcBorders>
+            <w:shd w:fill="FFFFFF" w:val="clear"/>
+            <w:tcMar>
+              <w:top w:type="dxa" w:w="80"/>
+              <w:left w:type="dxa" w:w="120"/>
+              <w:bottom w:type="dxa" w:w="80"/>
+              <w:right w:type="dxa" w:w="120"/>
+            </w:tcMar>
+            <w:vAlign w:val="center"/>
+          </w:tcPr>
+          <w:p>
+            <w:r>
+              <w:rPr>
+                <w:rFonts w:ascii="Arial" w:cs="Arial" w:eastAsia="Arial" w:hAnsi="Arial"/>
+                <w:b w:val="false"/>
+                <w:bCs w:val="false"/>
+                <w:color w:val="000000"/>
+                <w:sz w:val="18"/>
+                <w:szCs w:val="18"/>
+              </w:rPr>
+              <w:t xml:space="preserve">4</w:t>
+            </w:r>
+          </w:p>
+        </w:tc>
+        <w:tc>
+          <w:tcPr>
+            <w:tcW w:type="dxa" w:w="500"/>
+            <w:tcBorders>
+              <w:top w:val="single" w:color="CCCCCC" w:sz="1"/>
+              <w:left w:val="single" w:color="CCCCCC" w:sz="1"/>
+              <w:bottom w:val="single" w:color="CCCCCC" w:sz="1"/>
+              <w:right w:val="single" w:color="CCCCCC" w:sz="1"/>
+            </w:tcBorders>
+            <w:shd w:fill="FFFFFF" w:val="clear"/>
+            <w:tcMar>
+              <w:top w:type="dxa" w:w="80"/>
+              <w:left w:type="dxa" w:w="120"/>
+              <w:bottom w:type="dxa" w:w="80"/>
+              <w:right w:type="dxa" w:w="120"/>
+            </w:tcMar>
+            <w:vAlign w:val="center"/>
+          </w:tcPr>
+          <w:p>
+            <w:r>
+              <w:rPr>
+                <w:rFonts w:ascii="Arial" w:cs="Arial" w:eastAsia="Arial" w:hAnsi="Arial"/>
+                <w:b w:val="false"/>
+                <w:bCs w:val="false"/>
+                <w:color w:val="000000"/>
+                <w:sz w:val="18"/>
+                <w:szCs w:val="18"/>
+              </w:rPr>
+              <w:t xml:space="preserve">text</w:t>
+            </w:r>
+          </w:p>
+        </w:tc>
+        <w:tc>
+          <w:tcPr>
+            <w:tcW w:type="dxa" w:w="500"/>
+            <w:tcBorders>
+              <w:top w:val="single" w:color="CCCCCC" w:sz="1"/>
+              <w:left w:val="single" w:color="CCCCCC" w:sz="1"/>
+              <w:bottom w:val="single" w:color="CCCCCC" w:sz="1"/>
+              <w:right w:val="single" w:color="CCCCCC" w:sz="1"/>
+            </w:tcBorders>
+            <w:shd w:fill="FFFFFF" w:val="clear"/>
+            <w:tcMar>
+              <w:top w:type="dxa" w:w="80"/>
+              <w:left w:type="dxa" w:w="120"/>
+              <w:bottom w:type="dxa" w:w="80"/>
+              <w:right w:type="dxa" w:w="120"/>
+            </w:tcMar>
+            <w:vAlign w:val="center"/>
+          </w:tcPr>
+          <w:p>
+            <w:r>
+              <w:rPr>
+                <w:rFonts w:ascii="Arial" w:cs="Arial" w:eastAsia="Arial" w:hAnsi="Arial"/>
+                <w:b w:val="false"/>
+                <w:bCs w:val="false"/>
+                <w:color w:val="000000"/>
+                <w:sz w:val="18"/>
+                <w:szCs w:val="18"/>
+              </w:rPr>
+              <w:t xml:space="preserve">400</w:t>
+            </w:r>
+          </w:p>
+        </w:tc>
+        <w:tc>
+          <w:tcPr>
+            <w:tcW w:type="dxa" w:w="700"/>
+            <w:tcBorders>
+              <w:top w:val="single" w:color="CCCCCC" w:sz="1"/>
+              <w:left w:val="single" w:color="CCCCCC" w:sz="1"/>
+              <w:bottom w:val="single" w:color="CCCCCC" w:sz="1"/>
+              <w:right w:val="single" w:color="CCCCCC" w:sz="1"/>
+            </w:tcBorders>
+            <w:shd w:fill="FFFFFF" w:val="clear"/>
+            <w:tcMar>
+              <w:top w:type="dxa" w:w="80"/>
+              <w:left w:type="dxa" w:w="120"/>
+              <w:bottom w:type="dxa" w:w="80"/>
+              <w:right w:type="dxa" w:w="120"/>
+            </w:tcMar>
+            <w:vAlign w:val="center"/>
+          </w:tcPr>
+          <w:p>
+            <w:r>
+              <w:rPr>
+                <w:rFonts w:ascii="Arial" w:cs="Arial" w:eastAsia="Arial" w:hAnsi="Arial"/>
+                <w:b w:val="false"/>
+                <w:bCs w:val="false"/>
+                <w:color w:val="000000"/>
+                <w:sz w:val="18"/>
+                <w:szCs w:val="18"/>
+              </w:rPr>
+              <w:t xml:space="preserve">false</w:t>
+            </w:r>
+          </w:p>
+        </w:tc>
+        <w:tc>
+          <w:tcPr>
+            <w:tcW w:type="dxa" w:w="600"/>
+            <w:tcBorders>
+              <w:top w:val="single" w:color="CCCCCC" w:sz="1"/>
+              <w:left w:val="single" w:color="CCCCCC" w:sz="1"/>
+              <w:bottom w:val="single" w:color="CCCCCC" w:sz="1"/>
+              <w:right w:val="single" w:color="CCCCCC" w:sz="1"/>
+            </w:tcBorders>
+            <w:shd w:fill="FFFFFF" w:val="clear"/>
+            <w:tcMar>
+              <w:top w:type="dxa" w:w="80"/>
+              <w:left w:type="dxa" w:w="120"/>
+              <w:bottom w:type="dxa" w:w="80"/>
+              <w:right w:type="dxa" w:w="120"/>
+            </w:tcMar>
+            <w:vAlign w:val="center"/>
+          </w:tcPr>
+          <w:p>
+            <w:r>
+              <w:rPr>
+                <w:rFonts w:ascii="Arial" w:cs="Arial" w:eastAsia="Arial" w:hAnsi="Arial"/>
+                <w:b w:val="false"/>
+                <w:bCs w:val="false"/>
+                <w:color w:val="000000"/>
+                <w:sz w:val="18"/>
+                <w:szCs w:val="18"/>
+              </w:rPr>
+              <w:t xml:space="preserve">32</w:t>
+            </w:r>
+          </w:p>
+        </w:tc>
+        <w:tc>
+          <w:tcPr>
+            <w:tcW w:type="dxa" w:w="800"/>
+            <w:tcBorders>
+              <w:top w:val="single" w:color="CCCCCC" w:sz="1"/>
+              <w:left w:val="single" w:color="CCCCCC" w:sz="1"/>
+              <w:bottom w:val="single" w:color="CCCCCC" w:sz="1"/>
+              <w:right w:val="single" w:color="CCCCCC" w:sz="1"/>
+            </w:tcBorders>
+            <w:shd w:fill="FFFFFF" w:val="clear"/>
+            <w:tcMar>
+              <w:top w:type="dxa" w:w="80"/>
+              <w:left w:type="dxa" w:w="120"/>
+              <w:bottom w:type="dxa" w:w="80"/>
+              <w:right w:type="dxa" w:w="120"/>
+            </w:tcMar>
+            <w:vAlign w:val="center"/>
+          </w:tcPr>
+          <w:p>
+            <w:r>
+              <w:rPr>
+                <w:rFonts w:ascii="Arial" w:cs="Arial" w:eastAsia="Arial" w:hAnsi="Arial"/>
+                <w:b w:val="false"/>
+                <w:bCs w:val="false"/>
+                <w:color w:val="000000"/>
+                <w:sz w:val="18"/>
+                <w:szCs w:val="18"/>
+              </w:rPr>
+              <w:t xml:space="preserve">4096</w:t>
+            </w:r>
+          </w:p>
+        </w:tc>
+        <w:tc>
+          <w:tcPr>
+            <w:tcW w:type="dxa" w:w="800"/>
+            <w:tcBorders>
+              <w:top w:val="single" w:color="CCCCCC" w:sz="1"/>
+              <w:left w:val="single" w:color="CCCCCC" w:sz="1"/>
+              <w:bottom w:val="single" w:color="CCCCCC" w:sz="1"/>
+              <w:right w:val="single" w:color="CCCCCC" w:sz="1"/>
+            </w:tcBorders>
+            <w:shd w:fill="FFFFFF" w:val="clear"/>
+            <w:tcMar>
+              <w:top w:type="dxa" w:w="80"/>
+              <w:left w:type="dxa" w:w="120"/>
+              <w:bottom w:type="dxa" w:w="80"/>
+              <w:right w:type="dxa" w:w="120"/>
+            </w:tcMar>
+            <w:vAlign w:val="center"/>
+          </w:tcPr>
+          <w:p>
+            <w:r>
+              <w:rPr>
+                <w:rFonts w:ascii="Arial" w:cs="Arial" w:eastAsia="Arial" w:hAnsi="Arial"/>
+                <w:b w:val="false"/>
+                <w:bCs w:val="false"/>
+                <w:color w:val="000000"/>
+                <w:sz w:val="18"/>
+                <w:szCs w:val="18"/>
+              </w:rPr>
+              <w:t xml:space="preserve">3358.2</w:t>
+            </w:r>
+          </w:p>
+        </w:tc>
+        <w:tc>
+          <w:tcPr>
+            <w:tcW w:type="dxa" w:w="700"/>
+            <w:tcBorders>
+              <w:top w:val="single" w:color="CCCCCC" w:sz="1"/>
+              <w:left w:val="single" w:color="CCCCCC" w:sz="1"/>
+              <w:bottom w:val="single" w:color="CCCCCC" w:sz="1"/>
+              <w:right w:val="single" w:color="CCCCCC" w:sz="1"/>
+            </w:tcBorders>
+            <w:shd w:fill="FFFFFF" w:val="clear"/>
+            <w:tcMar>
+              <w:top w:type="dxa" w:w="80"/>
+              <w:left w:type="dxa" w:w="120"/>
+              <w:bottom w:type="dxa" w:w="80"/>
+              <w:right w:type="dxa" w:w="120"/>
+            </w:tcMar>
+            <w:vAlign w:val="center"/>
+          </w:tcPr>
+          <w:p>
+            <w:r>
+              <w:rPr>
+                <w:rFonts w:ascii="Arial" w:cs="Arial" w:eastAsia="Arial" w:hAnsi="Arial"/>
+                <w:b w:val="false"/>
+                <w:bCs w:val="false"/>
+                <w:color w:val="000000"/>
+                <w:sz w:val="18"/>
+                <w:szCs w:val="18"/>
+              </w:rPr>
+              <w:t xml:space="preserve">5.2</w:t>
+            </w:r>
+          </w:p>
+        </w:tc>
+        <w:tc>
+          <w:tcPr>
+            <w:tcW w:type="dxa" w:w="900"/>
+            <w:tcBorders>
+              <w:top w:val="single" w:color="CCCCCC" w:sz="1"/>
+              <w:left w:val="single" w:color="CCCCCC" w:sz="1"/>
+              <w:bottom w:val="single" w:color="CCCCCC" w:sz="1"/>
+              <w:right w:val="single" w:color="CCCCCC" w:sz="1"/>
+            </w:tcBorders>
+            <w:shd w:fill="FFFFFF" w:val="clear"/>
+            <w:tcMar>
+              <w:top w:type="dxa" w:w="80"/>
+              <w:left w:type="dxa" w:w="120"/>
+              <w:bottom w:type="dxa" w:w="80"/>
+              <w:right w:type="dxa" w:w="120"/>
+            </w:tcMar>
+            <w:vAlign w:val="center"/>
+          </w:tcPr>
+          <w:p>
+            <w:r>
+              <w:rPr>
+                <w:rFonts w:ascii="Arial" w:cs="Arial" w:eastAsia="Arial" w:hAnsi="Arial"/>
+                <w:b w:val="false"/>
+                <w:bCs w:val="false"/>
+                <w:color w:val="000000"/>
+                <w:sz w:val="18"/>
+                <w:szCs w:val="18"/>
+              </w:rPr>
+              <w:t xml:space="preserve">7985.2</w:t>
+            </w:r>
+          </w:p>
+        </w:tc>
+        <w:tc>
+          <w:tcPr>
+            <w:tcW w:type="dxa" w:w="600"/>
+            <w:tcBorders>
+              <w:top w:val="single" w:color="CCCCCC" w:sz="1"/>
+              <w:left w:val="single" w:color="CCCCCC" w:sz="1"/>
+              <w:bottom w:val="single" w:color="CCCCCC" w:sz="1"/>
+              <w:right w:val="single" w:color="CCCCCC" w:sz="1"/>
+            </w:tcBorders>
+            <w:shd w:fill="FFFFFF" w:val="clear"/>
+            <w:tcMar>
+              <w:top w:type="dxa" w:w="80"/>
+              <w:left w:type="dxa" w:w="120"/>
+              <w:bottom w:type="dxa" w:w="80"/>
+              <w:right w:type="dxa" w:w="120"/>
+            </w:tcMar>
+            <w:vAlign w:val="center"/>
+          </w:tcPr>
+          <w:p>
+            <w:r>
+              <w:rPr>
+                <w:rFonts w:ascii="Arial" w:cs="Arial" w:eastAsia="Arial" w:hAnsi="Arial"/>
+                <w:b w:val="false"/>
+                <w:bCs w:val="false"/>
+                <w:color w:val="000000"/>
+                <w:sz w:val="18"/>
+                <w:szCs w:val="18"/>
+              </w:rPr>
+              <w:t xml:space="preserve">83.42</w:t>
+            </w:r>
+          </w:p>
+        </w:tc>
+        <w:tc>
+          <w:tcPr>
+            <w:tcW w:type="dxa" w:w="600"/>
+            <w:tcBorders>
+              <w:top w:val="single" w:color="CCCCCC" w:sz="1"/>
+              <w:left w:val="single" w:color="CCCCCC" w:sz="1"/>
+              <w:bottom w:val="single" w:color="CCCCCC" w:sz="1"/>
+              <w:right w:val="single" w:color="CCCCCC" w:sz="1"/>
+            </w:tcBorders>
+            <w:shd w:fill="FFFFFF" w:val="clear"/>
+            <w:tcMar>
+              <w:top w:type="dxa" w:w="80"/>
+              <w:left w:type="dxa" w:w="120"/>
+              <w:bottom w:type="dxa" w:w="80"/>
+              <w:right w:type="dxa" w:w="120"/>
+            </w:tcMar>
+            <w:vAlign w:val="center"/>
+          </w:tcPr>
+          <w:p>
+            <w:r>
+              <w:rPr>
+                <w:rFonts w:ascii="Arial" w:cs="Arial" w:eastAsia="Arial" w:hAnsi="Arial"/>
+                <w:b w:val="false"/>
+                <w:bCs w:val="false"/>
+                <w:color w:val="000000"/>
+                <w:sz w:val="18"/>
+                <w:szCs w:val="18"/>
+              </w:rPr>
+              <w:t xml:space="preserve">0</w:t>
+            </w:r>
+          </w:p>
+        </w:tc>
+        <w:tc>
+          <w:tcPr>
+            <w:tcW w:type="dxa" w:w="1500"/>
+            <w:tcBorders>
+              <w:top w:val="single" w:color="CCCCCC" w:sz="1"/>
+              <w:left w:val="single" w:color="CCCCCC" w:sz="1"/>
+              <w:bottom w:val="single" w:color="CCCCCC" w:sz="1"/>
+              <w:right w:val="single" w:color="CCCCCC" w:sz="1"/>
+            </w:tcBorders>
+            <w:shd w:fill="FFFFFF" w:val="clear"/>
+            <w:tcMar>
+              <w:top w:type="dxa" w:w="80"/>
+              <w:left w:type="dxa" w:w="120"/>
+              <w:bottom w:type="dxa" w:w="80"/>
+              <w:right w:type="dxa" w:w="120"/>
+            </w:tcMar>
+            <w:vAlign w:val="center"/>
+          </w:tcPr>
+          <w:p>
+            <w:r>
+              <w:rPr>
+                <w:rFonts w:ascii="Arial" w:cs="Arial" w:eastAsia="Arial" w:hAnsi="Arial"/>
+                <w:b w:val="false"/>
+                <w:bCs w:val="false"/>
+                <w:color w:val="000000"/>
+                <w:sz w:val="18"/>
+                <w:szCs w:val="18"/>
+              </w:rPr>
+              <w:t xml:space="preserve">Reducing max_model_len from 8192 to 4096 hurts significantly. Fewer KV cache pages causes more evictions and re-computation under load. Short prompts don't benefit from smaller context window.</w:t>
             </w:r>
           </w:p>
         </w:tc>
@@ -5836,6 +6736,57 @@
           <w:szCs w:val="22"/>
         </w:rPr>
         <w:t xml:space="preserve">Required patching modal_infertutor_app.py and run_infertutor_experiment.py to support --quantization flag.</w:t>
+      </w:r>
+    </w:p>
+    <w:p>
+      <w:pPr>
+        <w:pStyle w:val="ListParagraph"/>
+        <w:numPr>
+          <w:ilvl w:val="0"/>
+          <w:numId w:val="2"/>
+        </w:numPr>
+      </w:pPr>
+      <w:r>
+        <w:rPr>
+          <w:rFonts w:ascii="Arial" w:cs="Arial" w:eastAsia="Arial" w:hAnsi="Arial"/>
+          <w:sz w:val="22"/>
+          <w:szCs w:val="22"/>
+        </w:rPr>
+        <w:t xml:space="preserve">TP=2 (2 replicas, 2 GPUs each) halves throughput — NVLink all-reduce overhead dominates for a 4B model.</w:t>
+      </w:r>
+    </w:p>
+    <w:p>
+      <w:pPr>
+        <w:pStyle w:val="ListParagraph"/>
+        <w:numPr>
+          <w:ilvl w:val="0"/>
+          <w:numId w:val="2"/>
+        </w:numPr>
+      </w:pPr>
+      <w:r>
+        <w:rPr>
+          <w:rFonts w:ascii="Arial" w:cs="Arial" w:eastAsia="Arial" w:hAnsi="Arial"/>
+          <w:sz w:val="22"/>
+          <w:szCs w:val="22"/>
+        </w:rPr>
+        <w:t xml:space="preserve">Reduced max_model_len=4096 hurts: fewer KV cache pages cause evictions and re-computation under load.</w:t>
+      </w:r>
+    </w:p>
+    <w:p>
+      <w:pPr>
+        <w:pStyle w:val="ListParagraph"/>
+        <w:numPr>
+          <w:ilvl w:val="0"/>
+          <w:numId w:val="2"/>
+        </w:numPr>
+      </w:pPr>
+      <w:r>
+        <w:rPr>
+          <w:rFonts w:ascii="Arial" w:cs="Arial" w:eastAsia="Arial" w:hAnsi="Arial"/>
+          <w:sz w:val="22"/>
+          <w:szCs w:val="22"/>
+        </w:rPr>
+        <w:t xml:space="preserve">For this model size, TP=1 with maximum independent replicas is always the winning topology.</w:t>
       </w:r>
     </w:p>
     <w:p>

</xml_diff>